<commit_message>
Handoff: mark investor/compliance agent-block verification DONE (accreditation carve-out consistent everywhere)
Co-Authored-By: Claude Opus 4.8 <noreply@anthropic.com>
</commit_message>
<xml_diff>
--- a/Enyrgy_Session_Handoff.docx
+++ b/Enyrgy_Session_Handoff.docx
@@ -1578,7 +1578,39 @@
         <w:t xml:space="preserve"> </w:t>
       </w:r>
       <w:r>
-        <w:t xml:space="preserve">raise.</w:t>
+        <w:t xml:space="preserve">raise. Follow-through: the same stale sub-agreement/term-sheet-behind-accreditation error was then found and fixed in the</w:t>
+      </w:r>
+      <w:r>
+        <w:t xml:space="preserve"> </w:t>
+      </w:r>
+      <w:r>
+        <w:rPr>
+          <w:b/>
+          <w:bCs/>
+        </w:rPr>
+        <w:t xml:space="preserve">Implementation Guide</w:t>
+      </w:r>
+      <w:r>
+        <w:t xml:space="preserve"> </w:t>
+      </w:r>
+      <w:r>
+        <w:t xml:space="preserve">(corrected to v3.9.4, three locations) and the</w:t>
+      </w:r>
+      <w:r>
+        <w:t xml:space="preserve"> </w:t>
+      </w:r>
+      <w:r>
+        <w:rPr>
+          <w:b/>
+          <w:bCs/>
+        </w:rPr>
+        <w:t xml:space="preserve">live Audit and Compliance and CFO agent blocks</w:t>
+      </w:r>
+      <w:r>
+        <w:t xml:space="preserve"> </w:t>
+      </w:r>
+      <w:r>
+        <w:t xml:space="preserve">(plus a build-pack Never-line fix). The accreditation carve-out is now consistent everywhere.</w:t>
       </w:r>
     </w:p>
     <w:p>
@@ -5686,7 +5718,7 @@
         <w:t xml:space="preserve"> </w:t>
       </w:r>
       <w:r>
-        <w:t xml:space="preserve">Session 14 note: the live Investor Drip still carried a stale</w:t>
+        <w:t xml:space="preserve">Session 14 note: the pre-Session-13 error (gating the subscription agreement and term sheet behind accreditation) had persisted in three places the KB correction never reached. All now fixed: (1) the live Investor Drip</w:t>
       </w:r>
       <w:r>
         <w:t xml:space="preserve"> </w:t>
@@ -5698,19 +5730,7 @@
         <w:t xml:space="preserve"> </w:t>
       </w:r>
       <w:r>
-        <w:t xml:space="preserve">branch that gated the PPM on</w:t>
-      </w:r>
-      <w:r>
-        <w:t xml:space="preserve"> </w:t>
-      </w:r>
-      <w:r>
-        <w:rPr>
-          <w:rStyle w:val="VerbatimChar"/>
-        </w:rPr>
-        <w:t xml:space="preserve">accredited_verified = Yes</w:t>
-      </w:r>
-      <w:r>
-        <w:t xml:space="preserve">, contradicting this rule. Scott removed the branches; the gate email and final touch were redrafted (credibility-only for un-met investors). Still OPEN: verify the LIVE Paperclip agent blocks that enforce this rule (Audit and Compliance, CFO, and the Compliance Gate config) match the corrected accreditation logic, since the workflow proved a stale version can persist. In Paperclip, the rule is enforced by the CFO-scoped ask-first gate plus the KB rule the agents read.</w:t>
+        <w:t xml:space="preserve">branch was removed by Scott (gate email + final touch redrafted, credibility-only for un-met investors); (2) the Implementation Guide was corrected to v3.9.4 in three locations (Stage 5, Compliance Gate rules, pipeline summary); (3) the live Audit and Compliance and CFO agent instructions were updated to the corrected carve-out (build-pack Never-line also fixed). The carve-out is now consistent across the KB, the Implementation Guide, the GHL workflow, and every agent block. In Paperclip, the rule is enforced by the CFO-scoped ask-first gate plus the KB rule the agents read.</w:t>
       </w:r>
     </w:p>
     <w:p>
@@ -5808,18 +5828,18 @@
               <w:pStyle w:val="Compact"/>
             </w:pPr>
             <w:r>
-              <w:t xml:space="preserve">Scott / next session</w:t>
-            </w:r>
-          </w:p>
-        </w:tc>
-        <w:tc>
-          <w:tcPr/>
-          <w:p>
-            <w:pPr>
-              <w:pStyle w:val="Compact"/>
-            </w:pPr>
-            <w:r>
-              <w:t xml:space="preserve">Session 14: the live GHL workflow had a stale accreditation gate. Confirm the LIVE Audit and Compliance, CFO, and Compliance Gate agent instructions match the corrected rule (PPM not gated, subscription/term sheet not gated, accreditation only before funds move, Scott sends the PPM). Swap only the top block, keep the Execution Contract.</w:t>
+              <w:t xml:space="preserve">DONE (Session 14)</w:t>
+            </w:r>
+          </w:p>
+        </w:tc>
+        <w:tc>
+          <w:tcPr/>
+          <w:p>
+            <w:pPr>
+              <w:pStyle w:val="Compact"/>
+            </w:pPr>
+            <w:r>
+              <w:t xml:space="preserve">The live Audit and Compliance and CFO agent instructions were updated to the corrected accreditation carve-out (subscription agreement + term sheet pre-acceptance; accreditation only before wire/acceptance). The build-pack Audit and Compliance Never-line was also fixed. Carve-out is now consistent across KB S12/13, Implementation Guide v3.9.4, the GHL workflow, and all agent blocks.</w:t>
             </w:r>
           </w:p>
         </w:tc>
@@ -8660,7 +8680,7 @@
               <w:pStyle w:val="Compact"/>
             </w:pPr>
             <w:r>
-              <w:t xml:space="preserve">v3.9.2</w:t>
+              <w:t xml:space="preserve">v3.9.4</w:t>
             </w:r>
           </w:p>
         </w:tc>
@@ -8682,7 +8702,7 @@
               <w:pStyle w:val="Compact"/>
             </w:pPr>
             <w:r>
-              <w:t xml:space="preserve">Ground truth. Session 11 additive: WF-27, all-five-drips bypass gate closed, Investor Touch 7 change, Shopify connected. Upload to project.</w:t>
+              <w:t xml:space="preserve">Ground truth. Session 14: applied the Session 13 accreditation carve-out (subscription agreement + term sheet pre-acceptance) in three locations, bumped to v3.9.4, and generated the .docx (was md-only in repo). Upload to project.</w:t>
             </w:r>
           </w:p>
         </w:tc>
@@ -10540,6 +10560,253 @@
       <w:szCs w:val="20"/>
     </w:rPr>
   </w:style>
+  <w:style w:customStyle="1" w:styleId="SourceCode" w:type="paragraph">
+    <w:name w:val="Source Code"/>
+    <w:basedOn w:val="Normal"/>
+    <w:link w:val="VerbatimChar"/>
+    <w:pPr>
+      <w:wordWrap w:val="off"/>
+    </w:pPr>
+  </w:style>
+  <w:style w:customStyle="1" w:styleId="KeywordTok" w:type="character">
+    <w:name w:val="KeywordTok"/>
+    <w:basedOn w:val="VerbatimChar"/>
+    <w:rPr>
+      <w:b/>
+      <w:color w:val="007020"/>
+    </w:rPr>
+  </w:style>
+  <w:style w:customStyle="1" w:styleId="DataTypeTok" w:type="character">
+    <w:name w:val="DataTypeTok"/>
+    <w:basedOn w:val="VerbatimChar"/>
+    <w:rPr>
+      <w:color w:val="902000"/>
+    </w:rPr>
+  </w:style>
+  <w:style w:customStyle="1" w:styleId="DecValTok" w:type="character">
+    <w:name w:val="DecValTok"/>
+    <w:basedOn w:val="VerbatimChar"/>
+    <w:rPr>
+      <w:color w:val="40a070"/>
+    </w:rPr>
+  </w:style>
+  <w:style w:customStyle="1" w:styleId="BaseNTok" w:type="character">
+    <w:name w:val="BaseNTok"/>
+    <w:basedOn w:val="VerbatimChar"/>
+    <w:rPr>
+      <w:color w:val="40a070"/>
+    </w:rPr>
+  </w:style>
+  <w:style w:customStyle="1" w:styleId="FloatTok" w:type="character">
+    <w:name w:val="FloatTok"/>
+    <w:basedOn w:val="VerbatimChar"/>
+    <w:rPr>
+      <w:color w:val="40a070"/>
+    </w:rPr>
+  </w:style>
+  <w:style w:customStyle="1" w:styleId="ConstantTok" w:type="character">
+    <w:name w:val="ConstantTok"/>
+    <w:basedOn w:val="VerbatimChar"/>
+    <w:rPr>
+      <w:color w:val="880000"/>
+    </w:rPr>
+  </w:style>
+  <w:style w:customStyle="1" w:styleId="CharTok" w:type="character">
+    <w:name w:val="CharTok"/>
+    <w:basedOn w:val="VerbatimChar"/>
+    <w:rPr>
+      <w:color w:val="4070a0"/>
+    </w:rPr>
+  </w:style>
+  <w:style w:customStyle="1" w:styleId="SpecialCharTok" w:type="character">
+    <w:name w:val="SpecialCharTok"/>
+    <w:basedOn w:val="VerbatimChar"/>
+    <w:rPr>
+      <w:color w:val="4070a0"/>
+    </w:rPr>
+  </w:style>
+  <w:style w:customStyle="1" w:styleId="StringTok" w:type="character">
+    <w:name w:val="StringTok"/>
+    <w:basedOn w:val="VerbatimChar"/>
+    <w:rPr>
+      <w:color w:val="4070a0"/>
+    </w:rPr>
+  </w:style>
+  <w:style w:customStyle="1" w:styleId="VerbatimStringTok" w:type="character">
+    <w:name w:val="VerbatimStringTok"/>
+    <w:basedOn w:val="VerbatimChar"/>
+    <w:rPr>
+      <w:color w:val="4070a0"/>
+    </w:rPr>
+  </w:style>
+  <w:style w:customStyle="1" w:styleId="SpecialStringTok" w:type="character">
+    <w:name w:val="SpecialStringTok"/>
+    <w:basedOn w:val="VerbatimChar"/>
+    <w:rPr>
+      <w:color w:val="bb6688"/>
+    </w:rPr>
+  </w:style>
+  <w:style w:customStyle="1" w:styleId="ImportTok" w:type="character">
+    <w:name w:val="ImportTok"/>
+    <w:basedOn w:val="VerbatimChar"/>
+    <w:rPr>
+      <w:b/>
+      <w:color w:val="008000"/>
+    </w:rPr>
+  </w:style>
+  <w:style w:customStyle="1" w:styleId="CommentTok" w:type="character">
+    <w:name w:val="CommentTok"/>
+    <w:basedOn w:val="VerbatimChar"/>
+    <w:rPr>
+      <w:i/>
+      <w:color w:val="60a0b0"/>
+    </w:rPr>
+  </w:style>
+  <w:style w:customStyle="1" w:styleId="DocumentationTok" w:type="character">
+    <w:name w:val="DocumentationTok"/>
+    <w:basedOn w:val="VerbatimChar"/>
+    <w:rPr>
+      <w:i/>
+      <w:color w:val="ba2121"/>
+    </w:rPr>
+  </w:style>
+  <w:style w:customStyle="1" w:styleId="AnnotationTok" w:type="character">
+    <w:name w:val="AnnotationTok"/>
+    <w:basedOn w:val="VerbatimChar"/>
+    <w:rPr>
+      <w:b/>
+      <w:i/>
+      <w:color w:val="60a0b0"/>
+    </w:rPr>
+  </w:style>
+  <w:style w:customStyle="1" w:styleId="CommentVarTok" w:type="character">
+    <w:name w:val="CommentVarTok"/>
+    <w:basedOn w:val="VerbatimChar"/>
+    <w:rPr>
+      <w:b/>
+      <w:i/>
+      <w:color w:val="60a0b0"/>
+    </w:rPr>
+  </w:style>
+  <w:style w:customStyle="1" w:styleId="OtherTok" w:type="character">
+    <w:name w:val="OtherTok"/>
+    <w:basedOn w:val="VerbatimChar"/>
+    <w:rPr>
+      <w:color w:val="007020"/>
+    </w:rPr>
+  </w:style>
+  <w:style w:customStyle="1" w:styleId="FunctionTok" w:type="character">
+    <w:name w:val="FunctionTok"/>
+    <w:basedOn w:val="VerbatimChar"/>
+    <w:rPr>
+      <w:color w:val="06287e"/>
+    </w:rPr>
+  </w:style>
+  <w:style w:customStyle="1" w:styleId="VariableTok" w:type="character">
+    <w:name w:val="VariableTok"/>
+    <w:basedOn w:val="VerbatimChar"/>
+    <w:rPr>
+      <w:color w:val="19177c"/>
+    </w:rPr>
+  </w:style>
+  <w:style w:customStyle="1" w:styleId="ControlFlowTok" w:type="character">
+    <w:name w:val="ControlFlowTok"/>
+    <w:basedOn w:val="VerbatimChar"/>
+    <w:rPr>
+      <w:b/>
+      <w:color w:val="007020"/>
+    </w:rPr>
+  </w:style>
+  <w:style w:customStyle="1" w:styleId="OperatorTok" w:type="character">
+    <w:name w:val="OperatorTok"/>
+    <w:basedOn w:val="VerbatimChar"/>
+    <w:rPr>
+      <w:color w:val="666666"/>
+    </w:rPr>
+  </w:style>
+  <w:style w:customStyle="1" w:styleId="BuiltInTok" w:type="character">
+    <w:name w:val="BuiltInTok"/>
+    <w:basedOn w:val="VerbatimChar"/>
+    <w:rPr>
+      <w:color w:val="008000"/>
+    </w:rPr>
+  </w:style>
+  <w:style w:customStyle="1" w:styleId="ExtensionTok" w:type="character">
+    <w:name w:val="ExtensionTok"/>
+    <w:basedOn w:val="VerbatimChar"/>
+    <w:rPr/>
+  </w:style>
+  <w:style w:customStyle="1" w:styleId="PreprocessorTok" w:type="character">
+    <w:name w:val="PreprocessorTok"/>
+    <w:basedOn w:val="VerbatimChar"/>
+    <w:rPr>
+      <w:color w:val="bc7a00"/>
+    </w:rPr>
+  </w:style>
+  <w:style w:customStyle="1" w:styleId="AttributeTok" w:type="character">
+    <w:name w:val="AttributeTok"/>
+    <w:basedOn w:val="VerbatimChar"/>
+    <w:rPr>
+      <w:color w:val="7d9029"/>
+    </w:rPr>
+  </w:style>
+  <w:style w:customStyle="1" w:styleId="RegionMarkerTok" w:type="character">
+    <w:name w:val="RegionMarkerTok"/>
+    <w:basedOn w:val="VerbatimChar"/>
+    <w:rPr/>
+  </w:style>
+  <w:style w:customStyle="1" w:styleId="InformationTok" w:type="character">
+    <w:name w:val="InformationTok"/>
+    <w:basedOn w:val="VerbatimChar"/>
+    <w:rPr>
+      <w:b/>
+      <w:i/>
+      <w:color w:val="60a0b0"/>
+    </w:rPr>
+  </w:style>
+  <w:style w:customStyle="1" w:styleId="WarningTok" w:type="character">
+    <w:name w:val="WarningTok"/>
+    <w:basedOn w:val="VerbatimChar"/>
+    <w:rPr>
+      <w:b/>
+      <w:i/>
+      <w:color w:val="60a0b0"/>
+    </w:rPr>
+  </w:style>
+  <w:style w:customStyle="1" w:styleId="AlertTok" w:type="character">
+    <w:name w:val="AlertTok"/>
+    <w:basedOn w:val="VerbatimChar"/>
+    <w:rPr>
+      <w:b/>
+      <w:color w:val="ff0000"/>
+    </w:rPr>
+  </w:style>
+  <w:style w:customStyle="1" w:styleId="ErrorTok" w:type="character">
+    <w:name w:val="ErrorTok"/>
+    <w:basedOn w:val="VerbatimChar"/>
+    <w:rPr>
+      <w:b/>
+      <w:color w:val="ff0000"/>
+    </w:rPr>
+  </w:style>
+  <w:style w:customStyle="1" w:styleId="NormalTok" w:type="character">
+    <w:name w:val="NormalTok"/>
+    <w:basedOn w:val="VerbatimChar"/>
+    <w:rPr/>
+  </w:style>
+  <w:style w:styleId="Table" w:type="table">
+    <w:name w:val="Table"/>
+    <w:tblPr>
+      <w:tblBorders>
+        <w:top w:color="000000" w:space="0" w:sz="4" w:val="single"/>
+        <w:left w:color="000000" w:space="0" w:sz="4" w:val="single"/>
+        <w:bottom w:color="000000" w:space="0" w:sz="4" w:val="single"/>
+        <w:right w:color="000000" w:space="0" w:sz="4" w:val="single"/>
+        <w:insideH w:color="000000" w:space="0" w:sz="4" w:val="single"/>
+        <w:insideV w:color="000000" w:space="0" w:sz="4" w:val="single"/>
+      </w:tblBorders>
+    </w:tblPr>
+  </w:style>
   <w:style w:type="paragraph" w:customStyle="1" w:styleId="SourceCode">
     <w:name w:val="Source Code"/>
     <w:basedOn w:val="Normal"/>
@@ -10773,19 +11040,6 @@
     <w:name w:val="NormalTok"/>
     <w:basedOn w:val="VerbatimChar"/>
     <w:rPr/>
-  </w:style>
-  <w:style w:type="table" w:styleId="Table">
-    <w:name w:val="Table"/>
-    <w:tblPr>
-      <w:tblBorders>
-        <w:top w:val="single" w:sz="4" w:space="0" w:color="000000"/>
-        <w:left w:val="single" w:sz="4" w:space="0" w:color="000000"/>
-        <w:bottom w:val="single" w:sz="4" w:space="0" w:color="000000"/>
-        <w:right w:val="single" w:sz="4" w:space="0" w:color="000000"/>
-        <w:insideH w:val="single" w:sz="4" w:space="0" w:color="000000"/>
-        <w:insideV w:val="single" w:sz="4" w:space="0" w:color="000000"/>
-      </w:tblBorders>
-    </w:tblPr>
   </w:style>
 </w:styles>
 </file>

</xml_diff>

<commit_message>
Handoff: mark calendar conflict-detection RESOLVED (conflict-checking was off; root cause + gotchas noted)
Co-Authored-By: Claude Opus 4.8 <noreply@anthropic.com>
</commit_message>
<xml_diff>
--- a/Enyrgy_Session_Handoff.docx
+++ b/Enyrgy_Session_Handoff.docx
@@ -6549,29 +6549,65 @@
               <w:pStyle w:val="Compact"/>
             </w:pPr>
             <w:r>
-              <w:t xml:space="preserve">Investor Presentation Calendar conflict detection</w:t>
-            </w:r>
-          </w:p>
-        </w:tc>
-        <w:tc>
-          <w:tcPr/>
-          <w:p>
-            <w:pPr>
-              <w:pStyle w:val="Compact"/>
-            </w:pPr>
-            <w:r>
-              <w:t xml:space="preserve">Scott/David/Brian</w:t>
-            </w:r>
-          </w:p>
-        </w:tc>
-        <w:tc>
-          <w:tcPr/>
-          <w:p>
-            <w:pPr>
-              <w:pStyle w:val="Compact"/>
-            </w:pPr>
-            <w:r>
-              <w:t xml:space="preserve">Still showing all times available despite 3 calendars connected - parked</w:t>
+              <w:t xml:space="preserve">Calendar conflict detection</w:t>
+            </w:r>
+          </w:p>
+        </w:tc>
+        <w:tc>
+          <w:tcPr/>
+          <w:p>
+            <w:pPr>
+              <w:pStyle w:val="Compact"/>
+            </w:pPr>
+            <w:r>
+              <w:t xml:space="preserve">RESOLVED (Session 14)</w:t>
+            </w:r>
+          </w:p>
+        </w:tc>
+        <w:tc>
+          <w:tcPr/>
+          <w:p>
+            <w:pPr>
+              <w:pStyle w:val="Compact"/>
+            </w:pPr>
+            <w:r>
+              <w:t xml:space="preserve">Root cause: the calendar was connected but</w:t>
+            </w:r>
+            <w:r>
+              <w:t xml:space="preserve"> </w:t>
+            </w:r>
+            <w:r>
+              <w:t xml:space="preserve">“check for conflicts”</w:t>
+            </w:r>
+            <w:r>
+              <w:t xml:space="preserve"> </w:t>
+            </w:r>
+            <w:r>
+              <w:t xml:space="preserve">was OFF, so GHL never read the real schedule (connected does NOT equal conflict-checking). Turned conflict-checking ON at the user level, which fixed availability across all of Scott’s host calendars. Gotcha for the collective Investor Presentation calendar: enable conflict-checking for each host. Second gotcha: an all-day event marked</w:t>
+            </w:r>
+            <w:r>
+              <w:t xml:space="preserve"> </w:t>
+            </w:r>
+            <w:r>
+              <w:t xml:space="preserve">“Busy”</w:t>
+            </w:r>
+            <w:r>
+              <w:t xml:space="preserve"> </w:t>
+            </w:r>
+            <w:r>
+              <w:t xml:space="preserve">blocks the entire day (zero slots) - set such events to</w:t>
+            </w:r>
+            <w:r>
+              <w:t xml:space="preserve"> </w:t>
+            </w:r>
+            <w:r>
+              <w:t xml:space="preserve">“Free”</w:t>
+            </w:r>
+            <w:r>
+              <w:t xml:space="preserve"> </w:t>
+            </w:r>
+            <w:r>
+              <w:t xml:space="preserve">if they should not block bookings.</w:t>
             </w:r>
           </w:p>
         </w:tc>
@@ -10803,6 +10839,240 @@
         <w:insideV w:color="000000" w:space="0" w:sz="4" w:val="single"/>
       </w:tblBorders>
     </w:tblPr>
+  </w:style>
+  <w:style w:customStyle="1" w:styleId="SourceCode" w:type="paragraph">
+    <w:name w:val="Source Code"/>
+    <w:basedOn w:val="Normal"/>
+    <w:link w:val="VerbatimChar"/>
+    <w:pPr>
+      <w:wordWrap w:val="off"/>
+    </w:pPr>
+  </w:style>
+  <w:style w:customStyle="1" w:styleId="KeywordTok" w:type="character">
+    <w:name w:val="KeywordTok"/>
+    <w:basedOn w:val="VerbatimChar"/>
+    <w:rPr>
+      <w:b/>
+      <w:color w:val="007020"/>
+    </w:rPr>
+  </w:style>
+  <w:style w:customStyle="1" w:styleId="DataTypeTok" w:type="character">
+    <w:name w:val="DataTypeTok"/>
+    <w:basedOn w:val="VerbatimChar"/>
+    <w:rPr>
+      <w:color w:val="902000"/>
+    </w:rPr>
+  </w:style>
+  <w:style w:customStyle="1" w:styleId="DecValTok" w:type="character">
+    <w:name w:val="DecValTok"/>
+    <w:basedOn w:val="VerbatimChar"/>
+    <w:rPr>
+      <w:color w:val="40a070"/>
+    </w:rPr>
+  </w:style>
+  <w:style w:customStyle="1" w:styleId="BaseNTok" w:type="character">
+    <w:name w:val="BaseNTok"/>
+    <w:basedOn w:val="VerbatimChar"/>
+    <w:rPr>
+      <w:color w:val="40a070"/>
+    </w:rPr>
+  </w:style>
+  <w:style w:customStyle="1" w:styleId="FloatTok" w:type="character">
+    <w:name w:val="FloatTok"/>
+    <w:basedOn w:val="VerbatimChar"/>
+    <w:rPr>
+      <w:color w:val="40a070"/>
+    </w:rPr>
+  </w:style>
+  <w:style w:customStyle="1" w:styleId="ConstantTok" w:type="character">
+    <w:name w:val="ConstantTok"/>
+    <w:basedOn w:val="VerbatimChar"/>
+    <w:rPr>
+      <w:color w:val="880000"/>
+    </w:rPr>
+  </w:style>
+  <w:style w:customStyle="1" w:styleId="CharTok" w:type="character">
+    <w:name w:val="CharTok"/>
+    <w:basedOn w:val="VerbatimChar"/>
+    <w:rPr>
+      <w:color w:val="4070a0"/>
+    </w:rPr>
+  </w:style>
+  <w:style w:customStyle="1" w:styleId="SpecialCharTok" w:type="character">
+    <w:name w:val="SpecialCharTok"/>
+    <w:basedOn w:val="VerbatimChar"/>
+    <w:rPr>
+      <w:color w:val="4070a0"/>
+    </w:rPr>
+  </w:style>
+  <w:style w:customStyle="1" w:styleId="StringTok" w:type="character">
+    <w:name w:val="StringTok"/>
+    <w:basedOn w:val="VerbatimChar"/>
+    <w:rPr>
+      <w:color w:val="4070a0"/>
+    </w:rPr>
+  </w:style>
+  <w:style w:customStyle="1" w:styleId="VerbatimStringTok" w:type="character">
+    <w:name w:val="VerbatimStringTok"/>
+    <w:basedOn w:val="VerbatimChar"/>
+    <w:rPr>
+      <w:color w:val="4070a0"/>
+    </w:rPr>
+  </w:style>
+  <w:style w:customStyle="1" w:styleId="SpecialStringTok" w:type="character">
+    <w:name w:val="SpecialStringTok"/>
+    <w:basedOn w:val="VerbatimChar"/>
+    <w:rPr>
+      <w:color w:val="bb6688"/>
+    </w:rPr>
+  </w:style>
+  <w:style w:customStyle="1" w:styleId="ImportTok" w:type="character">
+    <w:name w:val="ImportTok"/>
+    <w:basedOn w:val="VerbatimChar"/>
+    <w:rPr>
+      <w:b/>
+      <w:color w:val="008000"/>
+    </w:rPr>
+  </w:style>
+  <w:style w:customStyle="1" w:styleId="CommentTok" w:type="character">
+    <w:name w:val="CommentTok"/>
+    <w:basedOn w:val="VerbatimChar"/>
+    <w:rPr>
+      <w:i/>
+      <w:color w:val="60a0b0"/>
+    </w:rPr>
+  </w:style>
+  <w:style w:customStyle="1" w:styleId="DocumentationTok" w:type="character">
+    <w:name w:val="DocumentationTok"/>
+    <w:basedOn w:val="VerbatimChar"/>
+    <w:rPr>
+      <w:i/>
+      <w:color w:val="ba2121"/>
+    </w:rPr>
+  </w:style>
+  <w:style w:customStyle="1" w:styleId="AnnotationTok" w:type="character">
+    <w:name w:val="AnnotationTok"/>
+    <w:basedOn w:val="VerbatimChar"/>
+    <w:rPr>
+      <w:b/>
+      <w:i/>
+      <w:color w:val="60a0b0"/>
+    </w:rPr>
+  </w:style>
+  <w:style w:customStyle="1" w:styleId="CommentVarTok" w:type="character">
+    <w:name w:val="CommentVarTok"/>
+    <w:basedOn w:val="VerbatimChar"/>
+    <w:rPr>
+      <w:b/>
+      <w:i/>
+      <w:color w:val="60a0b0"/>
+    </w:rPr>
+  </w:style>
+  <w:style w:customStyle="1" w:styleId="OtherTok" w:type="character">
+    <w:name w:val="OtherTok"/>
+    <w:basedOn w:val="VerbatimChar"/>
+    <w:rPr>
+      <w:color w:val="007020"/>
+    </w:rPr>
+  </w:style>
+  <w:style w:customStyle="1" w:styleId="FunctionTok" w:type="character">
+    <w:name w:val="FunctionTok"/>
+    <w:basedOn w:val="VerbatimChar"/>
+    <w:rPr>
+      <w:color w:val="06287e"/>
+    </w:rPr>
+  </w:style>
+  <w:style w:customStyle="1" w:styleId="VariableTok" w:type="character">
+    <w:name w:val="VariableTok"/>
+    <w:basedOn w:val="VerbatimChar"/>
+    <w:rPr>
+      <w:color w:val="19177c"/>
+    </w:rPr>
+  </w:style>
+  <w:style w:customStyle="1" w:styleId="ControlFlowTok" w:type="character">
+    <w:name w:val="ControlFlowTok"/>
+    <w:basedOn w:val="VerbatimChar"/>
+    <w:rPr>
+      <w:b/>
+      <w:color w:val="007020"/>
+    </w:rPr>
+  </w:style>
+  <w:style w:customStyle="1" w:styleId="OperatorTok" w:type="character">
+    <w:name w:val="OperatorTok"/>
+    <w:basedOn w:val="VerbatimChar"/>
+    <w:rPr>
+      <w:color w:val="666666"/>
+    </w:rPr>
+  </w:style>
+  <w:style w:customStyle="1" w:styleId="BuiltInTok" w:type="character">
+    <w:name w:val="BuiltInTok"/>
+    <w:basedOn w:val="VerbatimChar"/>
+    <w:rPr>
+      <w:color w:val="008000"/>
+    </w:rPr>
+  </w:style>
+  <w:style w:customStyle="1" w:styleId="ExtensionTok" w:type="character">
+    <w:name w:val="ExtensionTok"/>
+    <w:basedOn w:val="VerbatimChar"/>
+    <w:rPr/>
+  </w:style>
+  <w:style w:customStyle="1" w:styleId="PreprocessorTok" w:type="character">
+    <w:name w:val="PreprocessorTok"/>
+    <w:basedOn w:val="VerbatimChar"/>
+    <w:rPr>
+      <w:color w:val="bc7a00"/>
+    </w:rPr>
+  </w:style>
+  <w:style w:customStyle="1" w:styleId="AttributeTok" w:type="character">
+    <w:name w:val="AttributeTok"/>
+    <w:basedOn w:val="VerbatimChar"/>
+    <w:rPr>
+      <w:color w:val="7d9029"/>
+    </w:rPr>
+  </w:style>
+  <w:style w:customStyle="1" w:styleId="RegionMarkerTok" w:type="character">
+    <w:name w:val="RegionMarkerTok"/>
+    <w:basedOn w:val="VerbatimChar"/>
+    <w:rPr/>
+  </w:style>
+  <w:style w:customStyle="1" w:styleId="InformationTok" w:type="character">
+    <w:name w:val="InformationTok"/>
+    <w:basedOn w:val="VerbatimChar"/>
+    <w:rPr>
+      <w:b/>
+      <w:i/>
+      <w:color w:val="60a0b0"/>
+    </w:rPr>
+  </w:style>
+  <w:style w:customStyle="1" w:styleId="WarningTok" w:type="character">
+    <w:name w:val="WarningTok"/>
+    <w:basedOn w:val="VerbatimChar"/>
+    <w:rPr>
+      <w:b/>
+      <w:i/>
+      <w:color w:val="60a0b0"/>
+    </w:rPr>
+  </w:style>
+  <w:style w:customStyle="1" w:styleId="AlertTok" w:type="character">
+    <w:name w:val="AlertTok"/>
+    <w:basedOn w:val="VerbatimChar"/>
+    <w:rPr>
+      <w:b/>
+      <w:color w:val="ff0000"/>
+    </w:rPr>
+  </w:style>
+  <w:style w:customStyle="1" w:styleId="ErrorTok" w:type="character">
+    <w:name w:val="ErrorTok"/>
+    <w:basedOn w:val="VerbatimChar"/>
+    <w:rPr>
+      <w:b/>
+      <w:color w:val="ff0000"/>
+    </w:rPr>
+  </w:style>
+  <w:style w:customStyle="1" w:styleId="NormalTok" w:type="character">
+    <w:name w:val="NormalTok"/>
+    <w:basedOn w:val="VerbatimChar"/>
+    <w:rPr/>
   </w:style>
   <w:style w:customStyle="1" w:styleId="SourceCode" w:type="paragraph">
     <w:name w:val="Source Code"/>

</xml_diff>

<commit_message>
WF-35: contact link restored, and the real cause recorded
The field was never invalid. WF-02 uses it and saves clean. What fails is the
rich-text editor auto-converting it to a hyperlink when you press space or Enter
straight after the closing braces, wrapping the merge field in an anchor tag and
tripping the validator. Recorded the technique that avoids it, since the next
person to hit this will otherwise conclude the field is broken, as I did.

Link placed directly above the 'replying does not reach them' warning rather
than below it. On its own that sentence is a dead end; with the link above, it
tells the reader where to go instead of only what not to do.

Co-Authored-By: Claude Opus 5 <noreply@anthropic.com>
</commit_message>
<xml_diff>
--- a/Enyrgy_Session_Handoff.docx
+++ b/Enyrgy_Session_Handoff.docx
@@ -3992,25 +3992,43 @@
           <w:b/>
           <w:bCs/>
         </w:rPr>
-        <w:t xml:space="preserve">fails GHL merge-field validation.</w:t>
-      </w:r>
-      <w:r>
-        <w:t xml:space="preserve"> </w:t>
-      </w:r>
-      <w:r>
-        <w:t xml:space="preserve">WF-02’s Day 1 notification uses the same field, so its</w:t>
-      </w:r>
-      <w:r>
-        <w:t xml:space="preserve"> </w:t>
-      </w:r>
-      <w:r>
-        <w:t xml:space="preserve">“View contact in GHL”</w:t>
-      </w:r>
-      <w:r>
-        <w:t xml:space="preserve"> </w:t>
-      </w:r>
-      <w:r>
-        <w:t xml:space="preserve">line may be rendering blank. Unchecked.</w:t>
+        <w:t xml:space="preserve">is valid; the editor is what breaks it.</w:t>
+      </w:r>
+      <w:r>
+        <w:t xml:space="preserve"> </w:t>
+      </w:r>
+      <w:r>
+        <w:t xml:space="preserve">Resolved Aug 4. WF-02 uses the field and saves clean. The rich-text editor auto-links it when you press space or Enter after the closing braces, wrapping it in an</w:t>
+      </w:r>
+      <w:r>
+        <w:t xml:space="preserve"> </w:t>
+      </w:r>
+      <w:r>
+        <w:rPr>
+          <w:rStyle w:val="VerbatimChar"/>
+        </w:rPr>
+        <w:t xml:space="preserve">&lt;a&gt;</w:t>
+      </w:r>
+      <w:r>
+        <w:t xml:space="preserve"> </w:t>
+      </w:r>
+      <w:r>
+        <w:t xml:space="preserve">tag and tripping the validator. Type the line then click away, or use the</w:t>
+      </w:r>
+      <w:r>
+        <w:t xml:space="preserve"> </w:t>
+      </w:r>
+      <w:r>
+        <w:rPr>
+          <w:rStyle w:val="VerbatimChar"/>
+        </w:rPr>
+        <w:t xml:space="preserve">&lt;/&gt;</w:t>
+      </w:r>
+      <w:r>
+        <w:t xml:space="preserve"> </w:t>
+      </w:r>
+      <w:r>
+        <w:t xml:space="preserve">source view. Black text is clean, blue means unlink and retry.</w:t>
       </w:r>
     </w:p>
     <w:p>

</xml_diff>

<commit_message>
WF-01 incident closed: sweep found no other affected contacts
Three @enyrgy.com records, all employees or contractors who are also device
users, all carrying drip_bypass and legacy_customer from the Session 10 import
and no type_ tags. None was ever routed as a lead. scott@enyrgy.com was the only
casualty and is deleted.

Recorded that they were deliberately not given no_route: WF-01's domain
condition already excludes @enyrgy.com before the tag check runs, and
drip_bypass covers the drips. A redundant third layer would dilute what the tag
means where it actually matters.

Co-Authored-By: Claude Opus 5 <noreply@anthropic.com>
</commit_message>
<xml_diff>
--- a/Enyrgy_Session_Handoff.docx
+++ b/Enyrgy_Session_Handoff.docx
@@ -3757,13 +3757,13 @@
           <w:b/>
           <w:bCs/>
         </w:rPr>
-        <w:t xml:space="preserve">Also do:</w:t>
-      </w:r>
-      <w:r>
-        <w:t xml:space="preserve"> </w:t>
-      </w:r>
-      <w:r>
-        <w:t xml:space="preserve">filter Contacts on</w:t>
+        <w:t xml:space="preserve">Sweep done Aug 4, incident closed.</w:t>
+      </w:r>
+      <w:r>
+        <w:t xml:space="preserve"> </w:t>
+      </w:r>
+      <w:r>
+        <w:t xml:space="preserve">Filtering Contacts on</w:t>
       </w:r>
       <w:r>
         <w:t xml:space="preserve"> </w:t>
@@ -3778,7 +3778,164 @@
         <w:t xml:space="preserve"> </w:t>
       </w:r>
       <w:r>
-        <w:t xml:space="preserve">and check whether other staff addresses went through the same path. Not yet done.</w:t>
+        <w:t xml:space="preserve">returned three records, all employees or contractors who are also device users. All three carry</w:t>
+      </w:r>
+      <w:r>
+        <w:t xml:space="preserve"> </w:t>
+      </w:r>
+      <w:r>
+        <w:rPr>
+          <w:rStyle w:val="VerbatimChar"/>
+        </w:rPr>
+        <w:t xml:space="preserve">drip_bypass</w:t>
+      </w:r>
+      <w:r>
+        <w:t xml:space="preserve"> </w:t>
+      </w:r>
+      <w:r>
+        <w:t xml:space="preserve">and</w:t>
+      </w:r>
+      <w:r>
+        <w:t xml:space="preserve"> </w:t>
+      </w:r>
+      <w:r>
+        <w:rPr>
+          <w:rStyle w:val="VerbatimChar"/>
+        </w:rPr>
+        <w:t xml:space="preserve">legacy_customer</w:t>
+      </w:r>
+      <w:r>
+        <w:t xml:space="preserve"> </w:t>
+      </w:r>
+      <w:r>
+        <w:t xml:space="preserve">from the Session 10 617-import and</w:t>
+      </w:r>
+      <w:r>
+        <w:t xml:space="preserve"> </w:t>
+      </w:r>
+      <w:r>
+        <w:rPr>
+          <w:b/>
+          <w:bCs/>
+        </w:rPr>
+        <w:t xml:space="preserve">no</w:t>
+      </w:r>
+      <w:r>
+        <w:rPr>
+          <w:b/>
+          <w:bCs/>
+        </w:rPr>
+        <w:t xml:space="preserve"> </w:t>
+      </w:r>
+      <w:r>
+        <w:rPr>
+          <w:rStyle w:val="VerbatimChar"/>
+          <w:b/>
+          <w:bCs/>
+        </w:rPr>
+        <w:t xml:space="preserve">type_</w:t>
+      </w:r>
+      <w:r>
+        <w:rPr>
+          <w:b/>
+          <w:bCs/>
+        </w:rPr>
+        <w:t xml:space="preserve"> </w:t>
+      </w:r>
+      <w:r>
+        <w:rPr>
+          <w:b/>
+          <w:bCs/>
+        </w:rPr>
+        <w:t xml:space="preserve">tags</w:t>
+      </w:r>
+      <w:r>
+        <w:t xml:space="preserve">, so none was ever routed as a lead.</w:t>
+      </w:r>
+      <w:r>
+        <w:t xml:space="preserve"> </w:t>
+      </w:r>
+      <w:r>
+        <w:rPr>
+          <w:rStyle w:val="VerbatimChar"/>
+        </w:rPr>
+        <w:t xml:space="preserve">scott@enyrgy.com</w:t>
+      </w:r>
+      <w:r>
+        <w:t xml:space="preserve"> </w:t>
+      </w:r>
+      <w:r>
+        <w:t xml:space="preserve">was the only casualty and it has been deleted.</w:t>
+      </w:r>
+    </w:p>
+    <w:p>
+      <w:pPr>
+        <w:pStyle w:val="BodyText"/>
+      </w:pPr>
+      <w:r>
+        <w:rPr>
+          <w:b/>
+          <w:bCs/>
+        </w:rPr>
+        <w:t xml:space="preserve">They were deliberately not given</w:t>
+      </w:r>
+      <w:r>
+        <w:rPr>
+          <w:b/>
+          <w:bCs/>
+        </w:rPr>
+        <w:t xml:space="preserve"> </w:t>
+      </w:r>
+      <w:r>
+        <w:rPr>
+          <w:rStyle w:val="VerbatimChar"/>
+          <w:b/>
+          <w:bCs/>
+        </w:rPr>
+        <w:t xml:space="preserve">no_route</w:t>
+      </w:r>
+      <w:r>
+        <w:rPr>
+          <w:b/>
+          <w:bCs/>
+        </w:rPr>
+        <w:t xml:space="preserve">.</w:t>
+      </w:r>
+      <w:r>
+        <w:t xml:space="preserve"> </w:t>
+      </w:r>
+      <w:r>
+        <w:t xml:space="preserve">WF-01’s domain condition already excludes every</w:t>
+      </w:r>
+      <w:r>
+        <w:t xml:space="preserve"> </w:t>
+      </w:r>
+      <w:r>
+        <w:rPr>
+          <w:rStyle w:val="VerbatimChar"/>
+        </w:rPr>
+        <w:t xml:space="preserve">@enyrgy.com</w:t>
+      </w:r>
+      <w:r>
+        <w:t xml:space="preserve"> </w:t>
+      </w:r>
+      <w:r>
+        <w:t xml:space="preserve">address before the tag check runs, and</w:t>
+      </w:r>
+      <w:r>
+        <w:t xml:space="preserve"> </w:t>
+      </w:r>
+      <w:r>
+        <w:rPr>
+          <w:rStyle w:val="VerbatimChar"/>
+        </w:rPr>
+        <w:t xml:space="preserve">drip_bypass</w:t>
+      </w:r>
+      <w:r>
+        <w:t xml:space="preserve"> </w:t>
+      </w:r>
+      <w:r>
+        <w:t xml:space="preserve">covers the drips. A third redundant layer would dilute what the tag means where it actually matters.</w:t>
       </w:r>
     </w:p>
     <w:p>

</xml_diff>

<commit_message>
Handoff: record the decision against a FlexOffers product feed
The Products page in the FlexOffers advertiser UI looks like an obvious win
and is incompatible with how program 250377 attributes sales.

Attribution is capture-and-postback: refid is read on the five lead-magnet
pages, and WF-30 gates the postback on FlexOffers Refid being non-empty. A
product feed sends publishers straight to shop.enyrgy.com, which runs no
capture code, so the sale registers with an empty refid and the publisher is
paid nothing having done exactly what the feed invited. Same failure shape as
the WF-25 reply path. It is also why Deep Linking is already OFF on this
program.

Records the conditions to revisit (Shopify refid capture), why it is low
value regardless at two SKUs, and the tempting wrong fix (pointing feed
LinkUrls at a lead magnet) so it is not rediscovered as a good idea.

Co-Authored-By: Claude Opus 5 <noreply@anthropic.com>
</commit_message>
<xml_diff>
--- a/Enyrgy_Session_Handoff.docx
+++ b/Enyrgy_Session_Handoff.docx
@@ -997,14 +997,6 @@
     </w:p>
     <w:tbl>
       <w:tblPr>
-        <w:tblBorders>
-          <w:top w:val="single" w:sz="6" w:space="0" w:color="AAAAAA"/>
-          <w:left w:val="single" w:sz="6" w:space="0" w:color="AAAAAA"/>
-          <w:bottom w:val="single" w:sz="6" w:space="0" w:color="AAAAAA"/>
-          <w:right w:val="single" w:sz="6" w:space="0" w:color="AAAAAA"/>
-          <w:insideH w:val="single" w:sz="6" w:space="0" w:color="AAAAAA"/>
-          <w:insideV w:val="single" w:sz="6" w:space="0" w:color="AAAAAA"/>
-        </w:tblBorders>
         <w:tblStyle w:val="Table"/>
         <w:tblW w:type="pct" w:w="5000"/>
         <w:tblLayout w:type="fixed"/>
@@ -7128,6 +7120,326 @@
           <w:b/>
           <w:bCs/>
         </w:rPr>
+        <w:t xml:space="preserve">PRODUCT FEED: DECIDED AGAINST, August 16, 2026. Do not set one up until Shopify captures</w:t>
+      </w:r>
+      <w:r>
+        <w:rPr>
+          <w:b/>
+          <w:bCs/>
+        </w:rPr>
+        <w:t xml:space="preserve"> </w:t>
+      </w:r>
+      <w:r>
+        <w:rPr>
+          <w:rStyle w:val="VerbatimChar"/>
+          <w:b/>
+          <w:bCs/>
+        </w:rPr>
+        <w:t xml:space="preserve">refid</w:t>
+      </w:r>
+      <w:r>
+        <w:rPr>
+          <w:b/>
+          <w:bCs/>
+        </w:rPr>
+        <w:t xml:space="preserve">.</w:t>
+      </w:r>
+      <w:r>
+        <w:t xml:space="preserve"> </w:t>
+      </w:r>
+      <w:r>
+        <w:t xml:space="preserve">FlexOffers offers advertisers a product feed (Programs → Products) that publishes a product catalog so publishers can promote individual SKUs. It looks like an obvious win on the page and it is not, because it is incompatible with how 250377 attributes sales.</w:t>
+      </w:r>
+    </w:p>
+    <w:p>
+      <w:pPr>
+        <w:pStyle w:val="BodyText"/>
+      </w:pPr>
+      <w:r>
+        <w:rPr>
+          <w:b/>
+          <w:bCs/>
+        </w:rPr>
+        <w:t xml:space="preserve">Why it breaks.</w:t>
+      </w:r>
+      <w:r>
+        <w:t xml:space="preserve"> </w:t>
+      </w:r>
+      <w:r>
+        <w:t xml:space="preserve">Attribution is capture-and-postback: the five lead-magnet pages read</w:t>
+      </w:r>
+      <w:r>
+        <w:t xml:space="preserve"> </w:t>
+      </w:r>
+      <w:r>
+        <w:rPr>
+          <w:rStyle w:val="VerbatimChar"/>
+        </w:rPr>
+        <w:t xml:space="preserve">refid</w:t>
+      </w:r>
+      <w:r>
+        <w:t xml:space="preserve"> </w:t>
+      </w:r>
+      <w:r>
+        <w:t xml:space="preserve">from the landing URL and store it, and WF-30 fires the postback on Order fulfilled gated on</w:t>
+      </w:r>
+      <w:r>
+        <w:t xml:space="preserve"> </w:t>
+      </w:r>
+      <w:r>
+        <w:rPr>
+          <w:rStyle w:val="VerbatimChar"/>
+        </w:rPr>
+        <w:t xml:space="preserve">FlexOffers Refid is not empty</w:t>
+      </w:r>
+      <w:r>
+        <w:t xml:space="preserve">. A product feed hands publishers product-level links that go</w:t>
+      </w:r>
+      <w:r>
+        <w:t xml:space="preserve"> </w:t>
+      </w:r>
+      <w:r>
+        <w:rPr>
+          <w:b/>
+          <w:bCs/>
+        </w:rPr>
+        <w:t xml:space="preserve">straight to</w:t>
+      </w:r>
+      <w:r>
+        <w:rPr>
+          <w:b/>
+          <w:bCs/>
+        </w:rPr>
+        <w:t xml:space="preserve"> </w:t>
+      </w:r>
+      <w:r>
+        <w:rPr>
+          <w:rStyle w:val="VerbatimChar"/>
+          <w:b/>
+          <w:bCs/>
+        </w:rPr>
+        <w:t xml:space="preserve">shop.enyrgy.com</w:t>
+      </w:r>
+      <w:r>
+        <w:rPr>
+          <w:b/>
+          <w:bCs/>
+        </w:rPr>
+        <w:t xml:space="preserve">, which runs none of that capture code</w:t>
+      </w:r>
+      <w:r>
+        <w:t xml:space="preserve">. A visitor arrives on Shopify with a</w:t>
+      </w:r>
+      <w:r>
+        <w:t xml:space="preserve"> </w:t>
+      </w:r>
+      <w:r>
+        <w:rPr>
+          <w:rStyle w:val="VerbatimChar"/>
+        </w:rPr>
+        <w:t xml:space="preserve">refid</w:t>
+      </w:r>
+      <w:r>
+        <w:t xml:space="preserve"> </w:t>
+      </w:r>
+      <w:r>
+        <w:t xml:space="preserve">nothing reads, buys, and WF-30 finds the field empty and sends no postback. The publisher earns nothing having done exactly what the feed invited. This is the same failure shape as the WF-25 reply path: the tool invites an action the system cannot pay for. It is also why</w:t>
+      </w:r>
+      <w:r>
+        <w:t xml:space="preserve"> </w:t>
+      </w:r>
+      <w:r>
+        <w:rPr>
+          <w:b/>
+          <w:bCs/>
+        </w:rPr>
+        <w:t xml:space="preserve">Deep Linking is OFF</w:t>
+      </w:r>
+      <w:r>
+        <w:t xml:space="preserve"> </w:t>
+      </w:r>
+      <w:r>
+        <w:t xml:space="preserve">on this program — a product feed is a deep-linking mechanism, and the reason it was rejected then still holds.</w:t>
+      </w:r>
+    </w:p>
+    <w:p>
+      <w:pPr>
+        <w:pStyle w:val="BodyText"/>
+      </w:pPr>
+      <w:r>
+        <w:rPr>
+          <w:b/>
+          <w:bCs/>
+        </w:rPr>
+        <w:t xml:space="preserve">Conditions to revisit.</w:t>
+      </w:r>
+      <w:r>
+        <w:t xml:space="preserve"> </w:t>
+      </w:r>
+      <w:r>
+        <w:t xml:space="preserve">Either (a) add</w:t>
+      </w:r>
+      <w:r>
+        <w:t xml:space="preserve"> </w:t>
+      </w:r>
+      <w:r>
+        <w:rPr>
+          <w:rStyle w:val="VerbatimChar"/>
+        </w:rPr>
+        <w:t xml:space="preserve">refid</w:t>
+      </w:r>
+      <w:r>
+        <w:t xml:space="preserve"> </w:t>
+      </w:r>
+      <w:r>
+        <w:t xml:space="preserve">capture to the Shopify product pages and carry it into the order, after which direct product links attribute correctly and deep linking becomes viable generally, or (b) leave it. With</w:t>
+      </w:r>
+      <w:r>
+        <w:t xml:space="preserve"> </w:t>
+      </w:r>
+      <w:r>
+        <w:rPr>
+          <w:b/>
+          <w:bCs/>
+        </w:rPr>
+        <w:t xml:space="preserve">two SKUs</w:t>
+      </w:r>
+      <w:r>
+        <w:t xml:space="preserve"> </w:t>
+      </w:r>
+      <w:r>
+        <w:t xml:space="preserve">(</w:t>
+      </w:r>
+      <w:r>
+        <w:rPr>
+          <w:rStyle w:val="VerbatimChar"/>
+        </w:rPr>
+        <w:t xml:space="preserve">EN-UVB-020</w:t>
+      </w:r>
+      <w:r>
+        <w:t xml:space="preserve"> </w:t>
+      </w:r>
+      <w:r>
+        <w:t xml:space="preserve">and</w:t>
+      </w:r>
+      <w:r>
+        <w:t xml:space="preserve"> </w:t>
+      </w:r>
+      <w:r>
+        <w:rPr>
+          <w:rStyle w:val="VerbatimChar"/>
+        </w:rPr>
+        <w:t xml:space="preserve">ENRG 011</w:t>
+      </w:r>
+      <w:r>
+        <w:t xml:space="preserve">) a feed earns very little regardless; feeds pay off on large catalogs. Do NOT take the third option that suggests itself, pointing every feed</w:t>
+      </w:r>
+      <w:r>
+        <w:t xml:space="preserve"> </w:t>
+      </w:r>
+      <w:r>
+        <w:rPr>
+          <w:rStyle w:val="VerbatimChar"/>
+        </w:rPr>
+        <w:t xml:space="preserve">LinkUrl</w:t>
+      </w:r>
+      <w:r>
+        <w:t xml:space="preserve"> </w:t>
+      </w:r>
+      <w:r>
+        <w:t xml:space="preserve">at a lead magnet — publishers expect a product page, get a quiz, and it reads as bait-and-switch.</w:t>
+      </w:r>
+    </w:p>
+    <w:p>
+      <w:pPr>
+        <w:pStyle w:val="BodyText"/>
+      </w:pPr>
+      <w:r>
+        <w:rPr>
+          <w:b/>
+          <w:bCs/>
+        </w:rPr>
+        <w:t xml:space="preserve">If it is ever built:</w:t>
+      </w:r>
+      <w:r>
+        <w:t xml:space="preserve"> </w:t>
+      </w:r>
+      <w:r>
+        <w:t xml:space="preserve">FlexOffers accepts CSV or XML, requires</w:t>
+      </w:r>
+      <w:r>
+        <w:t xml:space="preserve"> </w:t>
+      </w:r>
+      <w:r>
+        <w:rPr>
+          <w:rStyle w:val="VerbatimChar"/>
+        </w:rPr>
+        <w:t xml:space="preserve">AdvertiserId</w:t>
+      </w:r>
+      <w:r>
+        <w:t xml:space="preserve">,</w:t>
+      </w:r>
+      <w:r>
+        <w:t xml:space="preserve"> </w:t>
+      </w:r>
+      <w:r>
+        <w:rPr>
+          <w:rStyle w:val="VerbatimChar"/>
+        </w:rPr>
+        <w:t xml:space="preserve">Pid</w:t>
+      </w:r>
+      <w:r>
+        <w:t xml:space="preserve">,</w:t>
+      </w:r>
+      <w:r>
+        <w:t xml:space="preserve"> </w:t>
+      </w:r>
+      <w:r>
+        <w:rPr>
+          <w:rStyle w:val="VerbatimChar"/>
+        </w:rPr>
+        <w:t xml:space="preserve">Name</w:t>
+      </w:r>
+      <w:r>
+        <w:t xml:space="preserve">,</w:t>
+      </w:r>
+      <w:r>
+        <w:t xml:space="preserve"> </w:t>
+      </w:r>
+      <w:r>
+        <w:rPr>
+          <w:rStyle w:val="VerbatimChar"/>
+        </w:rPr>
+        <w:t xml:space="preserve">LinkUrl</w:t>
+      </w:r>
+      <w:r>
+        <w:t xml:space="preserve">, and accepts the same CSV used for the website, so</w:t>
+      </w:r>
+      <w:r>
+        <w:t xml:space="preserve"> </w:t>
+      </w:r>
+      <w:r>
+        <w:rPr>
+          <w:rStyle w:val="VerbatimChar"/>
+        </w:rPr>
+        <w:t xml:space="preserve">products_export_1.csv</w:t>
+      </w:r>
+      <w:r>
+        <w:t xml:space="preserve"> </w:t>
+      </w:r>
+      <w:r>
+        <w:t xml:space="preserve">is a starting point. The File Name convention is not in FlexOffers’ public docs; it is on the SPECIFICATIONS tab of that page.</w:t>
+      </w:r>
+    </w:p>
+    <w:p>
+      <w:pPr>
+        <w:pStyle w:val="BodyText"/>
+      </w:pPr>
+      <w:r>
+        <w:rPr>
+          <w:b/>
+          <w:bCs/>
+        </w:rPr>
         <w:t xml:space="preserve">Caution learned:</w:t>
       </w:r>
       <w:r>
@@ -12357,14 +12669,6 @@
     </w:p>
     <w:tbl>
       <w:tblPr>
-        <w:tblBorders>
-          <w:top w:val="single" w:sz="6" w:space="0" w:color="AAAAAA"/>
-          <w:left w:val="single" w:sz="6" w:space="0" w:color="AAAAAA"/>
-          <w:bottom w:val="single" w:sz="6" w:space="0" w:color="AAAAAA"/>
-          <w:right w:val="single" w:sz="6" w:space="0" w:color="AAAAAA"/>
-          <w:insideH w:val="single" w:sz="6" w:space="0" w:color="AAAAAA"/>
-          <w:insideV w:val="single" w:sz="6" w:space="0" w:color="AAAAAA"/>
-        </w:tblBorders>
         <w:tblStyle w:val="Table"/>
         <w:tblW w:type="pct" w:w="5000"/>
         <w:tblLayout w:type="fixed"/>
@@ -13088,14 +13392,6 @@
     </w:p>
     <w:tbl>
       <w:tblPr>
-        <w:tblBorders>
-          <w:top w:val="single" w:sz="6" w:space="0" w:color="AAAAAA"/>
-          <w:left w:val="single" w:sz="6" w:space="0" w:color="AAAAAA"/>
-          <w:bottom w:val="single" w:sz="6" w:space="0" w:color="AAAAAA"/>
-          <w:right w:val="single" w:sz="6" w:space="0" w:color="AAAAAA"/>
-          <w:insideH w:val="single" w:sz="6" w:space="0" w:color="AAAAAA"/>
-          <w:insideV w:val="single" w:sz="6" w:space="0" w:color="AAAAAA"/>
-        </w:tblBorders>
         <w:tblStyle w:val="Table"/>
         <w:tblW w:type="pct" w:w="5000"/>
         <w:tblLayout w:type="fixed"/>
@@ -13672,14 +13968,6 @@
     </w:p>
     <w:tbl>
       <w:tblPr>
-        <w:tblBorders>
-          <w:top w:val="single" w:sz="6" w:space="0" w:color="AAAAAA"/>
-          <w:left w:val="single" w:sz="6" w:space="0" w:color="AAAAAA"/>
-          <w:bottom w:val="single" w:sz="6" w:space="0" w:color="AAAAAA"/>
-          <w:right w:val="single" w:sz="6" w:space="0" w:color="AAAAAA"/>
-          <w:insideH w:val="single" w:sz="6" w:space="0" w:color="AAAAAA"/>
-          <w:insideV w:val="single" w:sz="6" w:space="0" w:color="AAAAAA"/>
-        </w:tblBorders>
         <w:tblStyle w:val="Table"/>
         <w:tblW w:type="pct" w:w="5000"/>
         <w:tblLayout w:type="fixed"/>
@@ -14018,14 +14306,6 @@
     </w:p>
     <w:tbl>
       <w:tblPr>
-        <w:tblBorders>
-          <w:top w:val="single" w:sz="6" w:space="0" w:color="AAAAAA"/>
-          <w:left w:val="single" w:sz="6" w:space="0" w:color="AAAAAA"/>
-          <w:bottom w:val="single" w:sz="6" w:space="0" w:color="AAAAAA"/>
-          <w:right w:val="single" w:sz="6" w:space="0" w:color="AAAAAA"/>
-          <w:insideH w:val="single" w:sz="6" w:space="0" w:color="AAAAAA"/>
-          <w:insideV w:val="single" w:sz="6" w:space="0" w:color="AAAAAA"/>
-        </w:tblBorders>
         <w:tblStyle w:val="Table"/>
         <w:tblW w:type="pct" w:w="5000"/>
         <w:tblLayout w:type="fixed"/>
@@ -14885,14 +15165,6 @@
     </w:p>
     <w:tbl>
       <w:tblPr>
-        <w:tblBorders>
-          <w:top w:val="single" w:sz="6" w:space="0" w:color="AAAAAA"/>
-          <w:left w:val="single" w:sz="6" w:space="0" w:color="AAAAAA"/>
-          <w:bottom w:val="single" w:sz="6" w:space="0" w:color="AAAAAA"/>
-          <w:right w:val="single" w:sz="6" w:space="0" w:color="AAAAAA"/>
-          <w:insideH w:val="single" w:sz="6" w:space="0" w:color="AAAAAA"/>
-          <w:insideV w:val="single" w:sz="6" w:space="0" w:color="AAAAAA"/>
-        </w:tblBorders>
         <w:tblStyle w:val="Table"/>
         <w:tblW w:type="pct" w:w="5000"/>
         <w:tblLayout w:type="fixed"/>
@@ -16190,14 +16462,6 @@
     </w:p>
     <w:tbl>
       <w:tblPr>
-        <w:tblBorders>
-          <w:top w:val="single" w:sz="6" w:space="0" w:color="AAAAAA"/>
-          <w:left w:val="single" w:sz="6" w:space="0" w:color="AAAAAA"/>
-          <w:bottom w:val="single" w:sz="6" w:space="0" w:color="AAAAAA"/>
-          <w:right w:val="single" w:sz="6" w:space="0" w:color="AAAAAA"/>
-          <w:insideH w:val="single" w:sz="6" w:space="0" w:color="AAAAAA"/>
-          <w:insideV w:val="single" w:sz="6" w:space="0" w:color="AAAAAA"/>
-        </w:tblBorders>
         <w:tblStyle w:val="Table"/>
         <w:tblW w:type="pct" w:w="5000"/>
         <w:tblLayout w:type="fixed"/>

</xml_diff>

<commit_message>
KB: record the $600 take-home retail margin, confirmed by Scott
Flagged during the Facility Overview build as a number that appeared in a
client-facing document but nowhere in the KB. Scott confirmed it, so it is now
recorded rather than left as a question for the next session to re-ask.

Noted where it matters: this is the figure a facility will hold Enyrgy to in a
margin conversation, so it belongs beside the pricing rather than only in a
prospect one-pager.

The live Company Skill now needs two edits to re-sync rather than one. Both are
listed in the handoff.

Co-Authored-By: Claude Opus 5 <noreply@anthropic.com>
</commit_message>
<xml_diff>
--- a/Enyrgy_Session_Handoff.docx
+++ b/Enyrgy_Session_Handoff.docx
@@ -2,7 +2,7 @@
 <file path=word/document.xml><?xml version="1.0" encoding="utf-8"?>
 <w:document xmlns:w="http://schemas.openxmlformats.org/wordprocessingml/2006/main" xmlns:m="http://schemas.openxmlformats.org/officeDocument/2006/math" xmlns:r="http://schemas.openxmlformats.org/officeDocument/2006/relationships" xmlns:o="urn:schemas-microsoft-com:office:office" xmlns:v="urn:schemas-microsoft-com:vml" xmlns:w10="urn:schemas-microsoft-com:office:word" xmlns:a="http://schemas.openxmlformats.org/drawingml/2006/main" xmlns:pic="http://schemas.openxmlformats.org/drawingml/2006/picture" xmlns:wp="http://schemas.openxmlformats.org/drawingml/2006/wordprocessingDrawing">
   <w:body>
-    <w:bookmarkStart w:id="80" w:name="enyrgy-ghl---session-handoff"/>
+    <w:bookmarkStart w:id="90" w:name="enyrgy-ghl---session-handoff"/>
     <w:p>
       <w:pPr>
         <w:pStyle w:val="Heading1"/>
@@ -48,7 +48,7 @@
         </w:pict>
       </w:r>
     </w:p>
-    <w:bookmarkStart w:id="9" w:name="how-to-use-this"/>
+    <w:bookmarkStart w:id="19" w:name="how-to-use-this"/>
     <w:p>
       <w:pPr>
         <w:pStyle w:val="Heading2"/>
@@ -99,8 +99,8 @@
         </w:pict>
       </w:r>
     </w:p>
-    <w:bookmarkEnd w:id="9"/>
-    <w:bookmarkStart w:id="10" w:name="X2d999775a38c9ddc5f0d8a9409b96cba42e413d"/>
+    <w:bookmarkEnd w:id="19"/>
+    <w:bookmarkStart w:id="20" w:name="X2d999775a38c9ddc5f0d8a9409b96cba42e413d"/>
     <w:p>
       <w:pPr>
         <w:pStyle w:val="Heading2"/>
@@ -308,8 +308,8 @@
         </w:pict>
       </w:r>
     </w:p>
-    <w:bookmarkEnd w:id="10"/>
-    <w:bookmarkStart w:id="11" w:name="X83f7989c9d53dc8acf736dbf330035db2e2858e"/>
+    <w:bookmarkEnd w:id="20"/>
+    <w:bookmarkStart w:id="21" w:name="X83f7989c9d53dc8acf736dbf330035db2e2858e"/>
     <w:p>
       <w:pPr>
         <w:pStyle w:val="Heading2"/>
@@ -985,8 +985,8 @@
         </w:pict>
       </w:r>
     </w:p>
-    <w:bookmarkEnd w:id="11"/>
-    <w:bookmarkStart w:id="12" w:name="key-constants"/>
+    <w:bookmarkEnd w:id="21"/>
+    <w:bookmarkStart w:id="22" w:name="key-constants"/>
     <w:p>
       <w:pPr>
         <w:pStyle w:val="Heading2"/>
@@ -1436,8 +1436,8 @@
         </w:pict>
       </w:r>
     </w:p>
-    <w:bookmarkEnd w:id="12"/>
-    <w:bookmarkStart w:id="13" w:name="X5afde6c00b6514536673da706456213de7c97df"/>
+    <w:bookmarkEnd w:id="22"/>
+    <w:bookmarkStart w:id="23" w:name="X5afde6c00b6514536673da706456213de7c97df"/>
     <w:p>
       <w:pPr>
         <w:pStyle w:val="Heading2"/>
@@ -1588,8 +1588,8 @@
         </w:pict>
       </w:r>
     </w:p>
-    <w:bookmarkEnd w:id="13"/>
-    <w:bookmarkStart w:id="21" w:name="what-was-done-session-16-july-31-2026"/>
+    <w:bookmarkEnd w:id="23"/>
+    <w:bookmarkStart w:id="31" w:name="what-was-done-session-16-july-31-2026"/>
     <w:p>
       <w:pPr>
         <w:pStyle w:val="Heading2"/>
@@ -1598,7 +1598,7 @@
         <w:t xml:space="preserve">WHAT WAS DONE (Session 16, July 31, 2026)</w:t>
       </w:r>
     </w:p>
-    <w:bookmarkStart w:id="14" w:name="Xdb4eb561f908ed6ff5fec14bb12dc9aac86bfed"/>
+    <w:bookmarkStart w:id="24" w:name="Xdb4eb561f908ed6ff5fec14bb12dc9aac86bfed"/>
     <w:p>
       <w:pPr>
         <w:pStyle w:val="Heading3"/>
@@ -2790,8 +2790,8 @@
         <w:t xml:space="preserve">- Open rate caveat for future comparison: Apple Mail Privacy Protection auto-loads tracking pixels and some corporate scanners pre-fetch images, so opens skew high. Treat 75% as directional, and compare quarter over quarter rather than against an absolute benchmark.</w:t>
       </w:r>
     </w:p>
-    <w:bookmarkEnd w:id="14"/>
-    <w:bookmarkStart w:id="15" w:name="live-kb-skill-re-synced-aug-1-2026"/>
+    <w:bookmarkEnd w:id="24"/>
+    <w:bookmarkStart w:id="25" w:name="live-kb-skill-re-synced-aug-1-2026"/>
     <w:p>
       <w:pPr>
         <w:pStyle w:val="Heading3"/>
@@ -2951,8 +2951,8 @@
         <w:t xml:space="preserve">to see what actually changed, then apply only those hunks as find/replace in Skill Studio. Never select-all-paste. Always reopen after saving and confirm the body has content and the frontmatter appears exactly once.</w:t>
       </w:r>
     </w:p>
-    <w:bookmarkEnd w:id="15"/>
-    <w:bookmarkStart w:id="16" w:name="X3cc25ff4833ef94a23998dd3e92a7809d7710a4"/>
+    <w:bookmarkEnd w:id="25"/>
+    <w:bookmarkStart w:id="26" w:name="X3cc25ff4833ef94a23998dd3e92a7809d7710a4"/>
     <w:p>
       <w:pPr>
         <w:pStyle w:val="Heading3"/>
@@ -3162,8 +3162,8 @@
         <w:t xml:space="preserve">trigger sending an internal notification with the message body and contact link is the answer, the same pattern WF-26 uses. Test what GHL’s built-in notification actually contains before deciding whether to build it.</w:t>
       </w:r>
     </w:p>
-    <w:bookmarkEnd w:id="16"/>
-    <w:bookmarkStart w:id="17" w:name="quarterly-runbook-from-q3-onward"/>
+    <w:bookmarkEnd w:id="26"/>
+    <w:bookmarkStart w:id="27" w:name="quarterly-runbook-from-q3-onward"/>
     <w:p>
       <w:pPr>
         <w:pStyle w:val="Heading3"/>
@@ -3312,8 +3312,8 @@
         <w:t xml:space="preserve">Roughly ten minutes</w:t>
       </w:r>
     </w:p>
-    <w:bookmarkEnd w:id="17"/>
-    <w:bookmarkStart w:id="18" w:name="X79e49eaf88c6b3e95542a59a17dded4de51e90e"/>
+    <w:bookmarkEnd w:id="27"/>
+    <w:bookmarkStart w:id="28" w:name="X79e49eaf88c6b3e95542a59a17dded4de51e90e"/>
     <w:p>
       <w:pPr>
         <w:pStyle w:val="Heading3"/>
@@ -4041,8 +4041,8 @@
         <w:t xml:space="preserve">, built Aug 1 for the Outcode work. This distinction caused confusion once already.</w:t>
       </w:r>
     </w:p>
-    <w:bookmarkEnd w:id="18"/>
-    <w:bookmarkStart w:id="19" w:name="X0e27b19de0979e208ea1bc4f92f3e0b8477cfef"/>
+    <w:bookmarkEnd w:id="28"/>
+    <w:bookmarkStart w:id="29" w:name="X0e27b19de0979e208ea1bc4f92f3e0b8477cfef"/>
     <w:p>
       <w:pPr>
         <w:pStyle w:val="Heading3"/>
@@ -4296,8 +4296,8 @@
         <w:t xml:space="preserve">against the Customer Replied trigger. This is why the built-in Conversation Notification should be switched to In-App rather than turned off.</w:t>
       </w:r>
     </w:p>
-    <w:bookmarkEnd w:id="19"/>
-    <w:bookmarkStart w:id="20" w:name="campaign-capture-complete-aug-2-3-2026"/>
+    <w:bookmarkEnd w:id="29"/>
+    <w:bookmarkStart w:id="30" w:name="campaign-capture-complete-aug-2-3-2026"/>
     <w:p>
       <w:pPr>
         <w:pStyle w:val="Heading3"/>
@@ -4568,9 +4568,9 @@
         </w:pict>
       </w:r>
     </w:p>
-    <w:bookmarkEnd w:id="20"/>
-    <w:bookmarkEnd w:id="21"/>
-    <w:bookmarkStart w:id="22" w:name="what-was-done-session-15-july-27-28-2026"/>
+    <w:bookmarkEnd w:id="30"/>
+    <w:bookmarkEnd w:id="31"/>
+    <w:bookmarkStart w:id="32" w:name="what-was-done-session-15-july-27-28-2026"/>
     <w:p>
       <w:pPr>
         <w:pStyle w:val="Heading2"/>
@@ -7927,8 +7927,8 @@
         <w:t xml:space="preserve">- Also resolved July 28: investor-presentation calendar conflict; Q2 investor update sent to Brian for review; GBP verified/live.</w:t>
       </w:r>
     </w:p>
-    <w:bookmarkEnd w:id="22"/>
-    <w:bookmarkStart w:id="23" w:name="what-was-done-session-14-july-25-26-2026"/>
+    <w:bookmarkEnd w:id="32"/>
+    <w:bookmarkStart w:id="33" w:name="what-was-done-session-14-july-25-26-2026"/>
     <w:p>
       <w:pPr>
         <w:pStyle w:val="Heading2"/>
@@ -8851,8 +8851,8 @@
         <w:t xml:space="preserve">). Its canvas tile does not render; open it via command palette or direct service URL.</w:t>
       </w:r>
     </w:p>
-    <w:bookmarkEnd w:id="23"/>
-    <w:bookmarkStart w:id="24" w:name="what-was-done-session-13-july-22-2026"/>
+    <w:bookmarkEnd w:id="33"/>
+    <w:bookmarkStart w:id="34" w:name="what-was-done-session-13-july-22-2026"/>
     <w:p>
       <w:pPr>
         <w:pStyle w:val="Heading2"/>
@@ -9444,8 +9444,8 @@
         <w:t xml:space="preserve">All 17 agents can read GHL; all writes are held for human approval (8 company-wide ask-first policies plus the CFO’s own gate). No heartbeats run yet, so nothing fires on a schedule until launch. The org is go-live ready.</w:t>
       </w:r>
     </w:p>
-    <w:bookmarkEnd w:id="24"/>
-    <w:bookmarkStart w:id="32" w:name="what-was-done-session-12-july-20-21-2026"/>
+    <w:bookmarkEnd w:id="34"/>
+    <w:bookmarkStart w:id="42" w:name="what-was-done-session-12-july-20-21-2026"/>
     <w:p>
       <w:pPr>
         <w:pStyle w:val="Heading2"/>
@@ -9454,7 +9454,7 @@
         <w:t xml:space="preserve">WHAT WAS DONE (Session 12, July 20-21, 2026)</w:t>
       </w:r>
     </w:p>
-    <w:bookmarkStart w:id="25" w:name="Xad79708e49764ac648f3d5f45964ab3cd542d6f"/>
+    <w:bookmarkStart w:id="35" w:name="Xad79708e49764ac648f3d5f45964ab3cd542d6f"/>
     <w:p>
       <w:pPr>
         <w:pStyle w:val="Heading3"/>
@@ -9608,8 +9608,8 @@
         <w:t xml:space="preserve">(NOT –yes) in the Railway Console so it read the env vars and wrote config.json to the volume; onboard generated the bootstrap-CEO invite URL; opened it and claimed CEO/owner with scott@enyrgy.com.</w:t>
       </w:r>
     </w:p>
-    <w:bookmarkEnd w:id="25"/>
-    <w:bookmarkStart w:id="26" w:name="Xf124d3d22d72216dff1a6fad5ca71afa11782c9"/>
+    <w:bookmarkEnd w:id="35"/>
+    <w:bookmarkStart w:id="36" w:name="Xf124d3d22d72216dff1a6fad5ca71afa11782c9"/>
     <w:p>
       <w:pPr>
         <w:pStyle w:val="Heading3"/>
@@ -9652,8 +9652,8 @@
         <w:t xml:space="preserve">Monthly spend limit = $25 (the API stops serving at $25 in a calendar month). Auto-reload turned OFF, so the prepaid credit balance is a second hard floor - nothing can charge the card without a deliberate top-up. About $8 was spent this session on setup, environment-check probes, and the brief agent runs before cleanup; the counter resets Aug 1.</w:t>
       </w:r>
     </w:p>
-    <w:bookmarkEnd w:id="26"/>
-    <w:bookmarkStart w:id="27" w:name="X7c93f2fc17f574273a7e7707a25d05916cd841a"/>
+    <w:bookmarkEnd w:id="36"/>
+    <w:bookmarkStart w:id="37" w:name="X7c93f2fc17f574273a7e7707a25d05916cd841a"/>
     <w:p>
       <w:pPr>
         <w:pStyle w:val="Heading3"/>
@@ -9716,8 +9716,8 @@
         <w:t xml:space="preserve">The two paused built-in helper agents (Reflection Coach, Summarizer) are Paperclip defaults; left as-is.</w:t>
       </w:r>
     </w:p>
-    <w:bookmarkEnd w:id="27"/>
-    <w:bookmarkStart w:id="28" w:name="Xa811478b79a7118b930d55b212472bac7da4a63"/>
+    <w:bookmarkEnd w:id="37"/>
+    <w:bookmarkStart w:id="38" w:name="Xa811478b79a7118b930d55b212472bac7da4a63"/>
     <w:p>
       <w:pPr>
         <w:pStyle w:val="Heading3"/>
@@ -9746,8 +9746,8 @@
         <w:t xml:space="preserve">Private Integration in GHL with exactly 15 scopes: contacts (r/w), conversations (r/w), conversations/message (r/w), opportunities (r/w), locations/tags (r/w), workflows.readonly, calendars.readonly, calendars/events.readonly, forms.readonly, locations/customFields.readonly. Deliberately withheld billing, users, oauth, payments, and settings scopes. Token copied and held by Scott (not stored in chat).</w:t>
       </w:r>
     </w:p>
-    <w:bookmarkEnd w:id="28"/>
-    <w:bookmarkStart w:id="29" w:name="X5b6a8001376f3af2fcf65764685f829c50a953d"/>
+    <w:bookmarkEnd w:id="38"/>
+    <w:bookmarkStart w:id="39" w:name="X5b6a8001376f3af2fcf65764685f829c50a953d"/>
     <w:p>
       <w:pPr>
         <w:pStyle w:val="Heading3"/>
@@ -9788,8 +9788,8 @@
         <w:t xml:space="preserve">Building this bridge is the first task next session and unblocks the rest of the agent-org build.</w:t>
       </w:r>
     </w:p>
-    <w:bookmarkEnd w:id="29"/>
-    <w:bookmarkStart w:id="30" w:name="X2ac6b8e8d2fc49e12399051a2e50a433e682a53"/>
+    <w:bookmarkEnd w:id="39"/>
+    <w:bookmarkStart w:id="40" w:name="X2ac6b8e8d2fc49e12399051a2e50a433e682a53"/>
     <w:p>
       <w:pPr>
         <w:pStyle w:val="Heading3"/>
@@ -9834,8 +9834,8 @@
         <w:t xml:space="preserve">NOT STARTED: Step 3 Load KB; Steps 4-6 build the remaining 15 agents (CEO already exists); Step 7 compliance gate; Step 8 5-contact test; Step 9 staged go-live.</w:t>
       </w:r>
     </w:p>
-    <w:bookmarkEnd w:id="30"/>
-    <w:bookmarkStart w:id="31" w:name="Xf91d26447d0b09b2d9eb7e6479e104dbfc30e41"/>
+    <w:bookmarkEnd w:id="40"/>
+    <w:bookmarkStart w:id="41" w:name="Xf91d26447d0b09b2d9eb7e6479e104dbfc30e41"/>
     <w:p>
       <w:pPr>
         <w:pStyle w:val="Heading3"/>
@@ -9899,9 +9899,9 @@
         </w:pict>
       </w:r>
     </w:p>
-    <w:bookmarkEnd w:id="31"/>
-    <w:bookmarkEnd w:id="32"/>
-    <w:bookmarkStart w:id="42" w:name="what-was-done-session-11-july-19-2026"/>
+    <w:bookmarkEnd w:id="41"/>
+    <w:bookmarkEnd w:id="42"/>
+    <w:bookmarkStart w:id="52" w:name="what-was-done-session-11-july-19-2026"/>
     <w:p>
       <w:pPr>
         <w:pStyle w:val="Heading2"/>
@@ -9910,7 +9910,7 @@
         <w:t xml:space="preserve">WHAT WAS DONE (Session 11, July 19, 2026)</w:t>
       </w:r>
     </w:p>
-    <w:bookmarkStart w:id="33" w:name="Xa3d538e25c540d7ac9ef4f4a452f35807541e37"/>
+    <w:bookmarkStart w:id="43" w:name="Xa3d538e25c540d7ac9ef4f4a452f35807541e37"/>
     <w:p>
       <w:pPr>
         <w:pStyle w:val="Heading3"/>
@@ -10064,8 +10064,8 @@
         <w:t xml:space="preserve">tag.</w:t>
       </w:r>
     </w:p>
-    <w:bookmarkEnd w:id="33"/>
-    <w:bookmarkStart w:id="34" w:name="Xb24fa00c0e662b9de7db923ef015abe50dd6a8b"/>
+    <w:bookmarkEnd w:id="43"/>
+    <w:bookmarkStart w:id="44" w:name="Xb24fa00c0e662b9de7db923ef015abe50dd6a8b"/>
     <w:p>
       <w:pPr>
         <w:pStyle w:val="Heading3"/>
@@ -10118,8 +10118,8 @@
         <w:t xml:space="preserve">. Allow Re-Entry ON. This shields every new Shopify buyer from lead nurture (they already purchased) while flagging them as a customer. Closes the going-forward gap created by Contact Sync (new buyers auto-create contacts that would otherwise hit WF-01).</w:t>
       </w:r>
     </w:p>
-    <w:bookmarkEnd w:id="34"/>
-    <w:bookmarkStart w:id="35" w:name="remaining-shopify-not-done-today"/>
+    <w:bookmarkEnd w:id="44"/>
+    <w:bookmarkStart w:id="45" w:name="remaining-shopify-not-done-today"/>
     <w:p>
       <w:pPr>
         <w:pStyle w:val="Heading3"/>
@@ -10197,8 +10197,8 @@
         <w:t xml:space="preserve">Abandoned-checkout webhook: developer build, highest-ROI recovery piece.</w:t>
       </w:r>
     </w:p>
-    <w:bookmarkEnd w:id="35"/>
-    <w:bookmarkStart w:id="36" w:name="X76fadb91bef3eef1f3a22b9dabd964c23af8599"/>
+    <w:bookmarkEnd w:id="45"/>
+    <w:bookmarkStart w:id="46" w:name="X76fadb91bef3eef1f3a22b9dabd964c23af8599"/>
     <w:p>
       <w:pPr>
         <w:pStyle w:val="Heading3"/>
@@ -10242,8 +10242,8 @@
         <w:t xml:space="preserve">now reliably suppresses all five drips.</w:t>
       </w:r>
     </w:p>
-    <w:bookmarkEnd w:id="36"/>
-    <w:bookmarkStart w:id="37" w:name="X38b1a71603fdcc4c7a23ee3ff736692e228b793"/>
+    <w:bookmarkEnd w:id="46"/>
+    <w:bookmarkStart w:id="47" w:name="X38b1a71603fdcc4c7a23ee3ff736692e228b793"/>
     <w:p>
       <w:pPr>
         <w:pStyle w:val="Heading3"/>
@@ -10272,8 +10272,8 @@
         <w:t xml:space="preserve">branch and renamed the gate to a router; the accreditation nudge stays for non-accredited. Accreditation is still required later, before commitment/subscription/wire (handled in the pipeline, untouched). The PPM email copy was confirmed accreditation-neutral (Session 11).</w:t>
       </w:r>
     </w:p>
-    <w:bookmarkEnd w:id="37"/>
-    <w:bookmarkStart w:id="38" w:name="X588532203d8bd4aa54ed8cf766cdad02a5db62d"/>
+    <w:bookmarkEnd w:id="47"/>
+    <w:bookmarkStart w:id="48" w:name="X588532203d8bd4aa54ed8cf766cdad02a5db62d"/>
     <w:p>
       <w:pPr>
         <w:pStyle w:val="Heading3"/>
@@ -10373,8 +10373,8 @@
         <w:t xml:space="preserve">(carrier queue, typically a few business days). SMS cannot send from the toll-free until this passes.</w:t>
       </w:r>
     </w:p>
-    <w:bookmarkEnd w:id="38"/>
-    <w:bookmarkStart w:id="39" w:name="X66a8e1d39418aa85f3166dd9446a8437db0a1b3"/>
+    <w:bookmarkEnd w:id="48"/>
+    <w:bookmarkStart w:id="49" w:name="X66a8e1d39418aa85f3166dd9446a8437db0a1b3"/>
     <w:p>
       <w:pPr>
         <w:pStyle w:val="Heading3"/>
@@ -10441,8 +10441,8 @@
         <w:t xml:space="preserve">(instant/Search Console was overridden, likely due to the shared GCU address). Scott records the live walkthrough video at the office next (a pre-existing Instagram clip cannot be used; must be a fresh, unedited recording through Google’s tool showing signage, the demo unit, and proof of management). Once verified, grab the review link and wire into WF-07.</w:t>
       </w:r>
     </w:p>
-    <w:bookmarkEnd w:id="39"/>
-    <w:bookmarkStart w:id="40" w:name="X88e666813efa23d3f1c5379efe3f1b34d612a87"/>
+    <w:bookmarkEnd w:id="49"/>
+    <w:bookmarkStart w:id="50" w:name="X88e666813efa23d3f1c5379efe3f1b34d612a87"/>
     <w:p>
       <w:pPr>
         <w:pStyle w:val="Heading3"/>
@@ -10751,8 +10751,8 @@
         <w:t xml:space="preserve">(.md + .docx, WF-29 spec + the three reassurance emails).</w:t>
       </w:r>
     </w:p>
-    <w:bookmarkEnd w:id="40"/>
-    <w:bookmarkStart w:id="41" w:name="Xf6b1f1ebbf33969a49fb05f42c51b3df4bd891e"/>
+    <w:bookmarkEnd w:id="50"/>
+    <w:bookmarkStart w:id="51" w:name="Xf6b1f1ebbf33969a49fb05f42c51b3df4bd891e"/>
     <w:p>
       <w:pPr>
         <w:pStyle w:val="Heading3"/>
@@ -10804,9 +10804,9 @@
         </w:pict>
       </w:r>
     </w:p>
-    <w:bookmarkEnd w:id="41"/>
-    <w:bookmarkEnd w:id="42"/>
-    <w:bookmarkStart w:id="48" w:name="what-was-done-session-10-july-18-2026"/>
+    <w:bookmarkEnd w:id="51"/>
+    <w:bookmarkEnd w:id="52"/>
+    <w:bookmarkStart w:id="58" w:name="what-was-done-session-10-july-18-2026"/>
     <w:p>
       <w:pPr>
         <w:pStyle w:val="Heading2"/>
@@ -10815,7 +10815,7 @@
         <w:t xml:space="preserve">WHAT WAS DONE (Session 10, July 18, 2026)</w:t>
       </w:r>
     </w:p>
-    <w:bookmarkStart w:id="43" w:name="X8a593e7fd46c540d90065ea17972e7bed0449ce"/>
+    <w:bookmarkStart w:id="53" w:name="X8a593e7fd46c540d90065ea17972e7bed0449ce"/>
     <w:p>
       <w:pPr>
         <w:pStyle w:val="Heading3"/>
@@ -11082,8 +11082,8 @@
         <w:t xml:space="preserve">(.md + .docx). The form’s share URL (https://api.leadconnectorhq.com/widget/form/OjahkWeVDeozQkfG9dW2) is the video upload link in both emails.</w:t>
       </w:r>
     </w:p>
-    <w:bookmarkEnd w:id="43"/>
-    <w:bookmarkStart w:id="44" w:name="Xc979635fde4ee3b49e75c81ba773b12defa98c7"/>
+    <w:bookmarkEnd w:id="53"/>
+    <w:bookmarkStart w:id="54" w:name="Xc979635fde4ee3b49e75c81ba773b12defa98c7"/>
     <w:p>
       <w:pPr>
         <w:pStyle w:val="Heading3"/>
@@ -11100,8 +11100,8 @@
         <w:t xml:space="preserve">Registration Date (Date), Skin Type (Single Options 1-6), Gender (Single Options Male/Female), Height (Text, ft/in), Weight (Number, lbs), Vitamin D Level (Number, ng/mL), plus Age was intentionally skipped (derivable from birthdate and goes stale). Birthdate uses GHL’s native Date of Birth field, not a custom field.</w:t>
       </w:r>
     </w:p>
-    <w:bookmarkEnd w:id="44"/>
-    <w:bookmarkStart w:id="45" w:name="Xf313635a57578d15d4ec79da1e50fcc4e357623"/>
+    <w:bookmarkEnd w:id="54"/>
+    <w:bookmarkStart w:id="55" w:name="Xf313635a57578d15d4ec79da1e50fcc4e357623"/>
     <w:p>
       <w:pPr>
         <w:pStyle w:val="Heading3"/>
@@ -11331,8 +11331,8 @@
         <w:t xml:space="preserve">(617 rows).</w:t>
       </w:r>
     </w:p>
-    <w:bookmarkEnd w:id="45"/>
-    <w:bookmarkStart w:id="46" w:name="note-found-during-the-audit-not-blocking"/>
+    <w:bookmarkEnd w:id="55"/>
+    <w:bookmarkStart w:id="56" w:name="note-found-during-the-audit-not-blocking"/>
     <w:p>
       <w:pPr>
         <w:pStyle w:val="Heading3"/>
@@ -11394,8 +11394,8 @@
         <w:t xml:space="preserve">tag does. Worth adding a bypass gate to those three later for consistency.</w:t>
       </w:r>
     </w:p>
-    <w:bookmarkEnd w:id="46"/>
-    <w:bookmarkStart w:id="47" w:name="next-up-testimonials"/>
+    <w:bookmarkEnd w:id="56"/>
+    <w:bookmarkStart w:id="57" w:name="next-up-testimonials"/>
     <w:p>
       <w:pPr>
         <w:pStyle w:val="Heading3"/>
@@ -11446,9 +11446,9 @@
         </w:pict>
       </w:r>
     </w:p>
-    <w:bookmarkEnd w:id="47"/>
-    <w:bookmarkEnd w:id="48"/>
-    <w:bookmarkStart w:id="55" w:name="what-was-done-session-9-july-17-2026"/>
+    <w:bookmarkEnd w:id="57"/>
+    <w:bookmarkEnd w:id="58"/>
+    <w:bookmarkStart w:id="65" w:name="what-was-done-session-9-july-17-2026"/>
     <w:p>
       <w:pPr>
         <w:pStyle w:val="Heading2"/>
@@ -11457,7 +11457,7 @@
         <w:t xml:space="preserve">WHAT WAS DONE (Session 9, July 17, 2026)</w:t>
       </w:r>
     </w:p>
-    <w:bookmarkStart w:id="49" w:name="X7969b9da8b6bf8be6a4b3ecbd5db5f877a6c563"/>
+    <w:bookmarkStart w:id="59" w:name="X7969b9da8b6bf8be6a4b3ecbd5db5f877a6c563"/>
     <w:p>
       <w:pPr>
         <w:pStyle w:val="Heading3"/>
@@ -11474,8 +11474,8 @@
         <w:t xml:space="preserve">Walked through the full GHL integration for the Vitamin D Assessment (Lead Magnet 5) and took it live and tested. WF-21 Vitamin D Assessment Capture: Inbound Webhook trigger, Create Contact with all 11 fields mapped, a Standard Add Tag with the six always-on tags (type_consumer, source_lead_magnet, status_new, magnet_lead, drip_bypass, magnet_vitamin_d_assessment), a Dynamic Add Tag that reads the quiz’s tags list, the CUB-refined results email, and (redundant now) a risk-band Condition. Two custom fields added (Deficiency Risk Score, Deficiency Risk Band). Page deployed to go.enyrgy.com/vitamin-d-assessment. Live end-to-end test passed: contact created with fields and tags, results email delivered.</w:t>
       </w:r>
     </w:p>
-    <w:bookmarkEnd w:id="49"/>
-    <w:bookmarkStart w:id="50" w:name="segmentation-solved-in-one-action"/>
+    <w:bookmarkEnd w:id="59"/>
+    <w:bookmarkStart w:id="60" w:name="segmentation-solved-in-one-action"/>
     <w:p>
       <w:pPr>
         <w:pStyle w:val="Heading3"/>
@@ -11522,8 +11522,8 @@
         <w:t xml:space="preserve">applies them all. This replaced the planned SMS Consent field plus separate goal and SMS workflows. GHL requires one action per mode (Standard vs Dynamic), so WF-21 has both.</w:t>
       </w:r>
     </w:p>
-    <w:bookmarkEnd w:id="50"/>
-    <w:bookmarkStart w:id="51" w:name="X0c1b816f89adb039ac6cefe75845b5183d72531"/>
+    <w:bookmarkEnd w:id="60"/>
+    <w:bookmarkStart w:id="61" w:name="X0c1b816f89adb039ac6cefe75845b5183d72531"/>
     <w:p>
       <w:pPr>
         <w:pStyle w:val="Heading3"/>
@@ -11540,8 +11540,8 @@
         <w:t xml:space="preserve">A 3-email solution-aware series. Trigger on the magnet tag, 2-day wait, Email 1 (Your D3 does one job. Light does five.), 2-day wait, Email 2 (study and safety), 3-day wait, Email 3 (own-labs close), then Add to WF-17 Long-Term Nurture. Emails routed through CUB, eugene-skill, and humanize-pro.</w:t>
       </w:r>
     </w:p>
-    <w:bookmarkEnd w:id="51"/>
-    <w:bookmarkStart w:id="52" w:name="key-fixes-found-during-go-live"/>
+    <w:bookmarkEnd w:id="61"/>
+    <w:bookmarkStart w:id="62" w:name="key-fixes-found-during-go-live"/>
     <w:p>
       <w:pPr>
         <w:pStyle w:val="Heading3"/>
@@ -11598,8 +11598,8 @@
         <w:t xml:space="preserve">Disclosures: removed the annual skin-exam line from all emails, the page footer, and the Brand Guide, per Scott.</w:t>
       </w:r>
     </w:p>
-    <w:bookmarkEnd w:id="52"/>
-    <w:bookmarkStart w:id="53" w:name="website-ctas-added"/>
+    <w:bookmarkEnd w:id="62"/>
+    <w:bookmarkStart w:id="63" w:name="website-ctas-added"/>
     <w:p>
       <w:pPr>
         <w:pStyle w:val="Heading3"/>
@@ -11628,8 +11628,8 @@
         <w:t xml:space="preserve">CTA on five pages, all linking to go.enyrgy.com/vitamin-d-assessment: The Science and FAQ (primary orange), Home, The Platform, and Our Story (secondary outline).</w:t>
       </w:r>
     </w:p>
-    <w:bookmarkEnd w:id="53"/>
-    <w:bookmarkStart w:id="54" w:name="follow-ons"/>
+    <w:bookmarkEnd w:id="63"/>
+    <w:bookmarkStart w:id="64" w:name="follow-ons"/>
     <w:p>
       <w:pPr>
         <w:pStyle w:val="Heading3"/>
@@ -11693,9 +11693,9 @@
         </w:pict>
       </w:r>
     </w:p>
-    <w:bookmarkEnd w:id="54"/>
-    <w:bookmarkEnd w:id="55"/>
-    <w:bookmarkStart w:id="61" w:name="what-was-done-session-8-july-17-2026"/>
+    <w:bookmarkEnd w:id="64"/>
+    <w:bookmarkEnd w:id="65"/>
+    <w:bookmarkStart w:id="71" w:name="what-was-done-session-8-july-17-2026"/>
     <w:p>
       <w:pPr>
         <w:pStyle w:val="Heading2"/>
@@ -11704,7 +11704,7 @@
         <w:t xml:space="preserve">WHAT WAS DONE (Session 8, July 17, 2026)</w:t>
       </w:r>
     </w:p>
-    <w:bookmarkStart w:id="56" w:name="yourtango-partnership-assets"/>
+    <w:bookmarkStart w:id="66" w:name="yourtango-partnership-assets"/>
     <w:p>
       <w:pPr>
         <w:pStyle w:val="Heading3"/>
@@ -11727,8 +11727,8 @@
         <w:t xml:space="preserve">) and produced: the revised article for Tom (7 signs, 729 words, single CTA to the Tired Test), an internal editorial record, and Scott’s response to Millie. Article and CTA were run through humanize-pro and CUB rather than hand-edited; CUB found a vague antecedent and a buried lede that a manual read missed.</w:t>
       </w:r>
     </w:p>
-    <w:bookmarkEnd w:id="56"/>
-    <w:bookmarkStart w:id="57" w:name="lead-magnets.md-repaired-v2.0-to-v2.1"/>
+    <w:bookmarkEnd w:id="66"/>
+    <w:bookmarkStart w:id="67" w:name="lead-magnets.md-repaired-v2.0-to-v2.1"/>
     <w:p>
       <w:pPr>
         <w:pStyle w:val="Heading3"/>
@@ -11745,8 +11745,8 @@
         <w:t xml:space="preserve">The Tired Test section contained the Vitamin D Assessment’s questions (Fitzpatrick skin type, latitude, an ICP router) filed under the wrong heading. Those were moved to a new Lead Magnet 5 section. The Tired Test section now matches its source spec and the live quiz: four Problem-Aware questions, one result for everyone. The single-path design is now documented as intentional so it is not mistaken for a gap again.</w:t>
       </w:r>
     </w:p>
-    <w:bookmarkEnd w:id="57"/>
-    <w:bookmarkStart w:id="58" w:name="vitamin-d-assessment-documented"/>
+    <w:bookmarkEnd w:id="67"/>
+    <w:bookmarkStart w:id="68" w:name="vitamin-d-assessment-documented"/>
     <w:p>
       <w:pPr>
         <w:pStyle w:val="Heading3"/>
@@ -11763,8 +11763,8 @@
         <w:t xml:space="preserve">Lead Magnet 5 existed as built HTML but was never documented in lead-magnets.md. It now has a full section: fields, tags, scoring, build steps outstanding, and its place in the funnel relative to the Tired Test.</w:t>
       </w:r>
     </w:p>
-    <w:bookmarkEnd w:id="58"/>
-    <w:bookmarkStart w:id="59" w:name="in-4-claim-corrected"/>
+    <w:bookmarkEnd w:id="68"/>
+    <w:bookmarkStart w:id="69" w:name="in-4-claim-corrected"/>
     <w:p>
       <w:pPr>
         <w:pStyle w:val="Heading3"/>
@@ -11817,8 +11817,8 @@
         <w:t xml:space="preserve">(trials were 71, 35, and 25 participants). The objections sheet needs this correction.</w:t>
       </w:r>
     </w:p>
-    <w:bookmarkEnd w:id="59"/>
-    <w:bookmarkStart w:id="60" w:name="about-me.md-cleaned"/>
+    <w:bookmarkEnd w:id="69"/>
+    <w:bookmarkStart w:id="70" w:name="about-me.md-cleaned"/>
     <w:p>
       <w:pPr>
         <w:pStyle w:val="Heading3"/>
@@ -11887,9 +11887,9 @@
         </w:pict>
       </w:r>
     </w:p>
-    <w:bookmarkEnd w:id="60"/>
-    <w:bookmarkEnd w:id="61"/>
-    <w:bookmarkStart w:id="66" w:name="Xf8697388ee1f0c921a2cc901f609b36fb20cf09"/>
+    <w:bookmarkEnd w:id="70"/>
+    <w:bookmarkEnd w:id="71"/>
+    <w:bookmarkStart w:id="76" w:name="Xf8697388ee1f0c921a2cc901f609b36fb20cf09"/>
     <w:p>
       <w:pPr>
         <w:pStyle w:val="Heading2"/>
@@ -11898,7 +11898,7 @@
         <w:t xml:space="preserve">WHAT WAS DONE THIS SESSION (Session 7, July 13, 2026)</w:t>
       </w:r>
     </w:p>
-    <w:bookmarkStart w:id="62" w:name="Xfe651bf2b93763394aca303f217d9d0fe647ed5"/>
+    <w:bookmarkStart w:id="72" w:name="Xfe651bf2b93763394aca303f217d9d0fe647ed5"/>
     <w:p>
       <w:pPr>
         <w:pStyle w:val="Heading3"/>
@@ -11930,8 +11930,8 @@
         <w:t xml:space="preserve">(.md + .docx). It takes Scott from an empty Paperclip install to a tested, governed 16-agent organization operating the GHL sub-account. Contents: what Paperclip is and how it connects to GHL (open-source, self-hosted, bring-your-own-agent, acting on GHL via API); prerequisites and key constants; the reconciled org chart; deploy and connect steps with least-privilege scopes; KB load checklist; ready-to-paste instruction blocks for the CEO orchestrator and every COO and CRO division agent; the compliance gate wired as a hard approval gate with the attorney-confirmed PPM and accreditation rule; the agent-to-workflow mapping (WF-01 through WF-10); governance (budgets, heartbeats, config revisioning, rollback); a 5-contact test plan with pass and fail criteria per agent; and a staged go-live with graceful fallback to Phase 1.</w:t>
       </w:r>
     </w:p>
-    <w:bookmarkEnd w:id="62"/>
-    <w:bookmarkStart w:id="63" w:name="agent-count-reconciled"/>
+    <w:bookmarkEnd w:id="72"/>
+    <w:bookmarkStart w:id="73" w:name="agent-count-reconciled"/>
     <w:p>
       <w:pPr>
         <w:pStyle w:val="Heading3"/>
@@ -11960,8 +11960,8 @@
         <w:t xml:space="preserve">figure in WIP-3 was an error; the correct upper bound is 22 (16 core plus all six recommended Phase 2 additions). Corrected in WIP-3 and stated in the Phase 2 guide.</w:t>
       </w:r>
     </w:p>
-    <w:bookmarkEnd w:id="63"/>
-    <w:bookmarkStart w:id="64" w:name="em-dash-rule-enforced-across-all-docs"/>
+    <w:bookmarkEnd w:id="73"/>
+    <w:bookmarkStart w:id="74" w:name="em-dash-rule-enforced-across-all-docs"/>
     <w:p>
       <w:pPr>
         <w:pStyle w:val="Heading3"/>
@@ -12011,8 +12011,8 @@
         <w:t xml:space="preserve">) was also corrected.</w:t>
       </w:r>
     </w:p>
-    <w:bookmarkEnd w:id="64"/>
-    <w:bookmarkStart w:id="65" w:name="brand-style-rebuilt-on-all-.docx"/>
+    <w:bookmarkEnd w:id="74"/>
+    <w:bookmarkStart w:id="75" w:name="brand-style-rebuilt-on-all-.docx"/>
     <w:p>
       <w:pPr>
         <w:pStyle w:val="Heading3"/>
@@ -12099,9 +12099,9 @@
         </w:pict>
       </w:r>
     </w:p>
-    <w:bookmarkEnd w:id="65"/>
-    <w:bookmarkEnd w:id="66"/>
-    <w:bookmarkStart w:id="69" w:name="what-was-done-session-6-july-13-2026"/>
+    <w:bookmarkEnd w:id="75"/>
+    <w:bookmarkEnd w:id="76"/>
+    <w:bookmarkStart w:id="79" w:name="what-was-done-session-6-july-13-2026"/>
     <w:p>
       <w:pPr>
         <w:pStyle w:val="Heading2"/>
@@ -12110,7 +12110,7 @@
         <w:t xml:space="preserve">WHAT WAS DONE (Session 6, July 13, 2026)</w:t>
       </w:r>
     </w:p>
-    <w:bookmarkStart w:id="67" w:name="implementation-guide-v3.8.4---v3.9"/>
+    <w:bookmarkStart w:id="77" w:name="implementation-guide-v3.8.4---v3.9"/>
     <w:p>
       <w:pPr>
         <w:pStyle w:val="Heading3"/>
@@ -12409,8 +12409,8 @@
         <w:t xml:space="preserve">- Brand fonts updated to Montserrat throughout the Word doc</w:t>
       </w:r>
     </w:p>
-    <w:bookmarkEnd w:id="67"/>
-    <w:bookmarkStart w:id="68" w:name="wip-tracker-updated-enyrgy_ghl_wip-3"/>
+    <w:bookmarkEnd w:id="77"/>
+    <w:bookmarkStart w:id="78" w:name="wip-tracker-updated-enyrgy_ghl_wip-3"/>
     <w:p>
       <w:pPr>
         <w:pStyle w:val="Heading3"/>
@@ -12564,9 +12564,9 @@
         </w:pict>
       </w:r>
     </w:p>
-    <w:bookmarkEnd w:id="68"/>
-    <w:bookmarkEnd w:id="69"/>
-    <w:bookmarkStart w:id="70" w:name="Xfe56ff4e1dcd5a74aec735bb0b50325b1f7d45f"/>
+    <w:bookmarkEnd w:id="78"/>
+    <w:bookmarkEnd w:id="79"/>
+    <w:bookmarkStart w:id="80" w:name="Xfe56ff4e1dcd5a74aec735bb0b50325b1f7d45f"/>
     <w:p>
       <w:pPr>
         <w:pStyle w:val="Heading2"/>
@@ -12656,8 +12656,8 @@
         </w:pict>
       </w:r>
     </w:p>
-    <w:bookmarkEnd w:id="70"/>
-    <w:bookmarkStart w:id="75" w:name="remaining-open-tasks"/>
+    <w:bookmarkEnd w:id="80"/>
+    <w:bookmarkStart w:id="85" w:name="remaining-open-tasks"/>
     <w:p>
       <w:pPr>
         <w:pStyle w:val="Heading2"/>
@@ -12666,7 +12666,7 @@
         <w:t xml:space="preserve">REMAINING OPEN TASKS</w:t>
       </w:r>
     </w:p>
-    <w:bookmarkStart w:id="71" w:name="high-priority"/>
+    <w:bookmarkStart w:id="81" w:name="high-priority"/>
     <w:p>
       <w:pPr>
         <w:pStyle w:val="Heading3"/>
@@ -13396,8 +13396,8 @@
         </w:tc>
       </w:tr>
     </w:tbl>
-    <w:bookmarkEnd w:id="71"/>
-    <w:bookmarkStart w:id="72" w:name="medium-priority"/>
+    <w:bookmarkEnd w:id="81"/>
+    <w:bookmarkStart w:id="82" w:name="medium-priority"/>
     <w:p>
       <w:pPr>
         <w:pStyle w:val="Heading3"/>
@@ -13828,8 +13828,8 @@
         </w:tc>
       </w:tr>
     </w:tbl>
-    <w:bookmarkEnd w:id="72"/>
-    <w:bookmarkStart w:id="73" w:name="website-punch-list-enyrgy.com"/>
+    <w:bookmarkEnd w:id="82"/>
+    <w:bookmarkStart w:id="83" w:name="website-punch-list-enyrgy.com"/>
     <w:p>
       <w:pPr>
         <w:pStyle w:val="Heading3"/>
@@ -13980,8 +13980,8 @@
         <w:t xml:space="preserve">row linking to go.enyrgy.com/winter-protocol (NOT enyrgy.com/winter-protocol, which is blank). Funnel WF-19/WF-20 is already live; this is website surfacing only. Optional: seasonal hero band Aug-Mar, hidden Apr-Jul. A scheduled reminder is also set for late August.</w:t>
       </w:r>
     </w:p>
-    <w:bookmarkEnd w:id="73"/>
-    <w:bookmarkStart w:id="74" w:name="low-priority-future"/>
+    <w:bookmarkEnd w:id="83"/>
+    <w:bookmarkStart w:id="84" w:name="low-priority-future"/>
     <w:p>
       <w:pPr>
         <w:pStyle w:val="Heading3"/>
@@ -14325,9 +14325,9 @@
         </w:pict>
       </w:r>
     </w:p>
-    <w:bookmarkEnd w:id="74"/>
-    <w:bookmarkEnd w:id="75"/>
-    <w:bookmarkStart w:id="76" w:name="Xd5e62dec0e4aa635b1cc955a3d912b35f7f6a98"/>
+    <w:bookmarkEnd w:id="84"/>
+    <w:bookmarkEnd w:id="85"/>
+    <w:bookmarkStart w:id="86" w:name="Xd5e62dec0e4aa635b1cc955a3d912b35f7f6a98"/>
     <w:p>
       <w:pPr>
         <w:pStyle w:val="Heading2"/>
@@ -14942,8 +14942,8 @@
         </w:pict>
       </w:r>
     </w:p>
-    <w:bookmarkEnd w:id="76"/>
-    <w:bookmarkStart w:id="77" w:name="key-urls-webhooks"/>
+    <w:bookmarkEnd w:id="86"/>
+    <w:bookmarkStart w:id="87" w:name="key-urls-webhooks"/>
     <w:p>
       <w:pPr>
         <w:pStyle w:val="Heading2"/>
@@ -15193,8 +15193,8 @@
         </w:pict>
       </w:r>
     </w:p>
-    <w:bookmarkEnd w:id="77"/>
-    <w:bookmarkStart w:id="78" w:name="documents-current-as-of-this-session"/>
+    <w:bookmarkEnd w:id="87"/>
+    <w:bookmarkStart w:id="88" w:name="documents-current-as-of-this-session"/>
     <w:p>
       <w:pPr>
         <w:pStyle w:val="Heading2"/>
@@ -16245,13 +16245,28 @@
                 <w:b/>
                 <w:bCs/>
               </w:rPr>
-              <w:t xml:space="preserve">One-line edit to re-sync: delete that sentence from Section 11 in Skill Studio.</w:t>
+              <w:t xml:space="preserve">TWO edits now needed to re-sync:</w:t>
             </w:r>
             <w:r>
               <w:t xml:space="preserve"> </w:t>
             </w:r>
             <w:r>
-              <w:t xml:space="preserve">That sync carried nine targeted edits: S1 users-not-customers (a home unit supports six users, so</w:t>
+              <w:t xml:space="preserve">(1) delete that sentence from Section 11, and (2) add the take-home retail margin line to Section 3,</w:t>
+            </w:r>
+            <w:r>
+              <w:t xml:space="preserve"> </w:t>
+            </w:r>
+            <w:r>
+              <w:rPr>
+                <w:rStyle w:val="VerbatimChar"/>
+              </w:rPr>
+              <w:t xml:space="preserve">Take-home retail margin: approximately $600 per device</w:t>
+            </w:r>
+            <w:r>
+              <w:t xml:space="preserve"> </w:t>
+            </w:r>
+            <w:r>
+              <w:t xml:space="preserve">to a facility or shop reselling consumer units, confirmed by Scott during the Facility Overview build. That sync carried nine targeted edits: S1 users-not-customers (a home unit supports six users, so</w:t>
             </w:r>
             <w:r>
               <w:t xml:space="preserve"> </w:t>
@@ -16565,8 +16580,8 @@
         </w:pict>
       </w:r>
     </w:p>
-    <w:bookmarkEnd w:id="78"/>
-    <w:bookmarkStart w:id="79" w:name="Xae771769396c083263e27c67a98ebffd5730439"/>
+    <w:bookmarkEnd w:id="88"/>
+    <w:bookmarkStart w:id="89" w:name="Xae771769396c083263e27c67a98ebffd5730439"/>
     <w:p>
       <w:pPr>
         <w:pStyle w:val="Heading2"/>
@@ -17351,12 +17366,14 @@
         <w:t xml:space="preserve">CONFIDENTIAL - Enyrgy Inc - 5115 N 27th Ave, Bld 66, Phoenix, AZ 85017 - enyrgy.com - Sunlight. Evolved.</w:t>
       </w:r>
     </w:p>
-    <w:bookmarkEnd w:id="79"/>
-    <w:bookmarkEnd w:id="80"/>
+    <w:bookmarkEnd w:id="89"/>
+    <w:bookmarkEnd w:id="90"/>
     <w:sectPr>
-      <w:footnotePr>
-        <w:numRestart w:val="eachSect"/>
-      </w:footnotePr>
+      <w:headerReference r:id="rId9" w:type="default"/>
+      <w:footerReference r:id="rId10" w:type="default"/>
+      <w:pgSz w:h="15840" w:w="12240"/>
+      <w:pgMar w:bottom="1440" w:footer="720" w:gutter="0" w:header="720" w:left="1440" w:right="1440" w:top="1440"/>
+      <w:cols w:space="720"/>
     </w:sectPr>
   </w:body>
 </w:document>
@@ -17366,6 +17383,154 @@
 <w:comments xmlns:w="http://schemas.openxmlformats.org/wordprocessingml/2006/main" xmlns:m="http://schemas.openxmlformats.org/officeDocument/2006/math" xmlns:r="http://schemas.openxmlformats.org/officeDocument/2006/relationships" xmlns:o="urn:schemas-microsoft-com:office:office" xmlns:v="urn:schemas-microsoft-com:vml" xmlns:w10="urn:schemas-microsoft-com:office:word" xmlns:a="http://schemas.openxmlformats.org/drawingml/2006/main" xmlns:pic="http://schemas.openxmlformats.org/drawingml/2006/picture" xmlns:wp="http://schemas.openxmlformats.org/drawingml/2006/wordprocessingDrawing"/>
 </file>
 
+<file path=word/footer1.xml><?xml version="1.0" encoding="utf-8"?>
+<w:ftr xmlns:wpc="http://schemas.microsoft.com/office/word/2010/wordprocessingCanvas" xmlns:cx="http://schemas.microsoft.com/office/drawing/2014/chartex" xmlns:cx1="http://schemas.microsoft.com/office/drawing/2015/9/8/chartex" xmlns:cx2="http://schemas.microsoft.com/office/drawing/2015/10/21/chartex" xmlns:cx3="http://schemas.microsoft.com/office/drawing/2016/5/9/chartex" xmlns:cx4="http://schemas.microsoft.com/office/drawing/2016/5/10/chartex" xmlns:cx5="http://schemas.microsoft.com/office/drawing/2016/5/11/chartex" xmlns:cx6="http://schemas.microsoft.com/office/drawing/2016/5/12/chartex" xmlns:cx7="http://schemas.microsoft.com/office/drawing/2016/5/13/chartex" xmlns:cx8="http://schemas.microsoft.com/office/drawing/2016/5/14/chartex" xmlns:mc="http://schemas.openxmlformats.org/markup-compatibility/2006" xmlns:m="http://schemas.openxmlformats.org/officeDocument/2006/math" xmlns:aink="http://schemas.microsoft.com/office/drawing/2016/ink" xmlns:am3d="http://schemas.microsoft.com/office/drawing/2017/model3d" xmlns:oel="http://schemas.microsoft.com/office/2019/extlst" xmlns:r="http://schemas.openxmlformats.org/officeDocument/2006/relationships" xmlns:wp14="http://schemas.microsoft.com/office/word/2010/wordprocessingDrawing" xmlns:wp="http://schemas.openxmlformats.org/drawingml/2006/wordprocessingDrawing" xmlns:wpg="http://schemas.microsoft.com/office/word/2010/wordprocessingGroup" xmlns:wpi="http://schemas.microsoft.com/office/word/2010/wordprocessingInk" xmlns:wps="http://schemas.microsoft.com/office/word/2010/wordprocessingShape" xmlns:o="urn:schemas-microsoft-com:office:office" xmlns:v="urn:schemas-microsoft-com:vml" xmlns:w10="urn:schemas-microsoft-com:office:word" xmlns:w="http://schemas.openxmlformats.org/wordprocessingml/2006/main" xmlns:w14="http://schemas.microsoft.com/office/word/2010/wordml" xmlns:w15="http://schemas.microsoft.com/office/word/2012/wordml" xmlns:w16cex="http://schemas.microsoft.com/office/word/2018/wordml/cex" xmlns:w16cid="http://schemas.microsoft.com/office/word/2016/wordml/cid" xmlns:w16="http://schemas.microsoft.com/office/word/2018/wordml" xmlns:w16sdtdh="http://schemas.microsoft.com/office/word/2020/wordml/sdtdatahash" xmlns:w16sdtfl="http://schemas.microsoft.com/office/word/2024/wordml/sdtformatlock" xmlns:w16se="http://schemas.microsoft.com/office/word/2015/wordml/symex" xmlns:w16du="http://schemas.microsoft.com/office/word/2023/wordml/word16du" xmlns:wne="http://schemas.microsoft.com/office/word/2006/wordml" mc:Ignorable="w14 w15 w16se w16cid w16 w16cex w16sdtdh w16sdtfl w16du wp14">
+  <w:p>
+    <w:pPr>
+      <w:pBdr>
+        <w:top w:val="single" w:sz="4" w:space="1" w:color="CCCCCC"/>
+      </w:pBdr>
+      <w:jc w:val="center"/>
+    </w:pPr>
+    <w:r>
+      <w:rPr>
+        <w:rFonts w:ascii="Montserrat" w:eastAsia="Montserrat" w:hAnsi="Montserrat" w:cs="Montserrat"/>
+        <w:color w:val="888888"/>
+        <w:sz w:val="16"/>
+        <w:szCs w:val="16"/>
+      </w:rPr>
+      <w:t xml:space="preserve">Enyrgy </w:t>
+    </w:r>
+    <w:proofErr w:type="gramStart"/>
+    <w:r>
+      <w:rPr>
+        <w:rFonts w:ascii="Montserrat" w:eastAsia="Montserrat" w:hAnsi="Montserrat" w:cs="Montserrat"/>
+        <w:color w:val="888888"/>
+        <w:sz w:val="16"/>
+        <w:szCs w:val="16"/>
+      </w:rPr>
+      <w:t>Inc  ·</w:t>
+    </w:r>
+    <w:proofErr w:type="gramEnd"/>
+    <w:r>
+      <w:rPr>
+        <w:rFonts w:ascii="Montserrat" w:eastAsia="Montserrat" w:hAnsi="Montserrat" w:cs="Montserrat"/>
+        <w:color w:val="888888"/>
+        <w:sz w:val="16"/>
+        <w:szCs w:val="16"/>
+      </w:rPr>
+      <w:t xml:space="preserve">  Phoenix, </w:t>
+    </w:r>
+    <w:proofErr w:type="gramStart"/>
+    <w:r>
+      <w:rPr>
+        <w:rFonts w:ascii="Montserrat" w:eastAsia="Montserrat" w:hAnsi="Montserrat" w:cs="Montserrat"/>
+        <w:color w:val="888888"/>
+        <w:sz w:val="16"/>
+        <w:szCs w:val="16"/>
+      </w:rPr>
+      <w:t>AZ  ·</w:t>
+    </w:r>
+    <w:proofErr w:type="gramEnd"/>
+    <w:r>
+      <w:rPr>
+        <w:rFonts w:ascii="Montserrat" w:eastAsia="Montserrat" w:hAnsi="Montserrat" w:cs="Montserrat"/>
+        <w:color w:val="888888"/>
+        <w:sz w:val="16"/>
+        <w:szCs w:val="16"/>
+      </w:rPr>
+      <w:t xml:space="preserve">  </w:t>
+    </w:r>
+    <w:proofErr w:type="gramStart"/>
+    <w:r>
+      <w:rPr>
+        <w:rFonts w:ascii="Montserrat" w:eastAsia="Montserrat" w:hAnsi="Montserrat" w:cs="Montserrat"/>
+        <w:color w:val="888888"/>
+        <w:sz w:val="16"/>
+        <w:szCs w:val="16"/>
+      </w:rPr>
+      <w:t>enyrgy.com  ·</w:t>
+    </w:r>
+    <w:proofErr w:type="gramEnd"/>
+    <w:r>
+      <w:rPr>
+        <w:rFonts w:ascii="Montserrat" w:eastAsia="Montserrat" w:hAnsi="Montserrat" w:cs="Montserrat"/>
+        <w:color w:val="888888"/>
+        <w:sz w:val="16"/>
+        <w:szCs w:val="16"/>
+      </w:rPr>
+      <w:t xml:space="preserve">  Sunlight. Evolved.  </w:t>
+    </w:r>
+    <w:proofErr w:type="gramStart"/>
+    <w:r>
+      <w:rPr>
+        <w:rFonts w:ascii="Montserrat" w:eastAsia="Montserrat" w:hAnsi="Montserrat" w:cs="Montserrat"/>
+        <w:color w:val="888888"/>
+        <w:sz w:val="16"/>
+        <w:szCs w:val="16"/>
+      </w:rPr>
+      <w:t>·  Page</w:t>
+    </w:r>
+    <w:proofErr w:type="gramEnd"/>
+    <w:r>
+      <w:rPr>
+        <w:rFonts w:ascii="Montserrat" w:eastAsia="Montserrat" w:hAnsi="Montserrat" w:cs="Montserrat"/>
+        <w:color w:val="888888"/>
+        <w:sz w:val="16"/>
+        <w:szCs w:val="16"/>
+      </w:rPr>
+      <w:t xml:space="preserve"> </w:t>
+    </w:r>
+    <w:r>
+      <w:rPr>
+        <w:rFonts w:ascii="Montserrat" w:eastAsia="Montserrat" w:hAnsi="Montserrat" w:cs="Montserrat"/>
+        <w:color w:val="888888"/>
+        <w:sz w:val="16"/>
+        <w:szCs w:val="16"/>
+      </w:rPr>
+      <w:fldChar w:fldCharType="begin"/>
+    </w:r>
+    <w:r>
+      <w:rPr>
+        <w:rFonts w:ascii="Montserrat" w:eastAsia="Montserrat" w:hAnsi="Montserrat" w:cs="Montserrat"/>
+        <w:color w:val="888888"/>
+        <w:sz w:val="16"/>
+        <w:szCs w:val="16"/>
+      </w:rPr>
+      <w:instrText>PAGE</w:instrText>
+    </w:r>
+    <w:r>
+      <w:rPr>
+        <w:rFonts w:ascii="Montserrat" w:eastAsia="Montserrat" w:hAnsi="Montserrat" w:cs="Montserrat"/>
+        <w:color w:val="888888"/>
+        <w:sz w:val="16"/>
+        <w:szCs w:val="16"/>
+      </w:rPr>
+      <w:fldChar w:fldCharType="separate"/>
+    </w:r>
+    <w:r>
+      <w:rPr>
+        <w:rFonts w:ascii="Montserrat" w:eastAsia="Montserrat" w:hAnsi="Montserrat" w:cs="Montserrat"/>
+        <w:noProof/>
+        <w:color w:val="888888"/>
+        <w:sz w:val="16"/>
+        <w:szCs w:val="16"/>
+      </w:rPr>
+      <w:t>8</w:t>
+    </w:r>
+    <w:r>
+      <w:rPr>
+        <w:rFonts w:ascii="Montserrat" w:eastAsia="Montserrat" w:hAnsi="Montserrat" w:cs="Montserrat"/>
+        <w:color w:val="888888"/>
+        <w:sz w:val="16"/>
+        <w:szCs w:val="16"/>
+      </w:rPr>
+      <w:fldChar w:fldCharType="end"/>
+    </w:r>
+  </w:p>
+</w:ftr>
+</file>
+
 <file path=word/footnotes.xml><?xml version="1.0" encoding="utf-8"?>
 <w:footnotes xmlns:w="http://schemas.openxmlformats.org/wordprocessingml/2006/main" xmlns:m="http://schemas.openxmlformats.org/officeDocument/2006/math" xmlns:r="http://schemas.openxmlformats.org/officeDocument/2006/relationships" xmlns:o="urn:schemas-microsoft-com:office:office" xmlns:v="urn:schemas-microsoft-com:vml" xmlns:w10="urn:schemas-microsoft-com:office:word" xmlns:a="http://schemas.openxmlformats.org/drawingml/2006/main" xmlns:pic="http://schemas.openxmlformats.org/drawingml/2006/picture" xmlns:wp="http://schemas.openxmlformats.org/drawingml/2006/wordprocessingDrawing">
   <w:footnote w:type="continuationSeparator" w:id="0">
@@ -17385,8 +17550,487 @@
 </w:footnotes>
 </file>
 
+<file path=word/header1.xml><?xml version="1.0" encoding="utf-8"?>
+<w:hdr xmlns:wpc="http://schemas.microsoft.com/office/word/2010/wordprocessingCanvas" xmlns:cx="http://schemas.microsoft.com/office/drawing/2014/chartex" xmlns:cx1="http://schemas.microsoft.com/office/drawing/2015/9/8/chartex" xmlns:cx2="http://schemas.microsoft.com/office/drawing/2015/10/21/chartex" xmlns:cx3="http://schemas.microsoft.com/office/drawing/2016/5/9/chartex" xmlns:cx4="http://schemas.microsoft.com/office/drawing/2016/5/10/chartex" xmlns:cx5="http://schemas.microsoft.com/office/drawing/2016/5/11/chartex" xmlns:cx6="http://schemas.microsoft.com/office/drawing/2016/5/12/chartex" xmlns:cx7="http://schemas.microsoft.com/office/drawing/2016/5/13/chartex" xmlns:cx8="http://schemas.microsoft.com/office/drawing/2016/5/14/chartex" xmlns:mc="http://schemas.openxmlformats.org/markup-compatibility/2006" xmlns:m="http://schemas.openxmlformats.org/officeDocument/2006/math" xmlns:aink="http://schemas.microsoft.com/office/drawing/2016/ink" xmlns:am3d="http://schemas.microsoft.com/office/drawing/2017/model3d" xmlns:oel="http://schemas.microsoft.com/office/2019/extlst" xmlns:r="http://schemas.openxmlformats.org/officeDocument/2006/relationships" xmlns:wp14="http://schemas.microsoft.com/office/word/2010/wordprocessingDrawing" xmlns:wp="http://schemas.openxmlformats.org/drawingml/2006/wordprocessingDrawing" xmlns:wpg="http://schemas.microsoft.com/office/word/2010/wordprocessingGroup" xmlns:wpi="http://schemas.microsoft.com/office/word/2010/wordprocessingInk" xmlns:wps="http://schemas.microsoft.com/office/word/2010/wordprocessingShape" xmlns:o="urn:schemas-microsoft-com:office:office" xmlns:v="urn:schemas-microsoft-com:vml" xmlns:w10="urn:schemas-microsoft-com:office:word" xmlns:w="http://schemas.openxmlformats.org/wordprocessingml/2006/main" xmlns:w14="http://schemas.microsoft.com/office/word/2010/wordml" xmlns:w15="http://schemas.microsoft.com/office/word/2012/wordml" xmlns:w16cex="http://schemas.microsoft.com/office/word/2018/wordml/cex" xmlns:w16cid="http://schemas.microsoft.com/office/word/2016/wordml/cid" xmlns:w16="http://schemas.microsoft.com/office/word/2018/wordml" xmlns:w16sdtdh="http://schemas.microsoft.com/office/word/2020/wordml/sdtdatahash" xmlns:w16sdtfl="http://schemas.microsoft.com/office/word/2024/wordml/sdtformatlock" xmlns:w16se="http://schemas.microsoft.com/office/word/2015/wordml/symex" xmlns:w16du="http://schemas.microsoft.com/office/word/2023/wordml/word16du" xmlns:wne="http://schemas.microsoft.com/office/word/2006/wordml" mc:Ignorable="w14 w15 w16se w16cid w16 w16cex w16sdtdh w16sdtfl w16du wp14">
+  <w:p>
+    <w:pPr>
+      <w:pBdr>
+        <w:bottom w:val="single" w:sz="4" w:space="1" w:color="E64C38"/>
+      </w:pBdr>
+    </w:pPr>
+    <w:r>
+      <w:rPr>
+        <w:rFonts w:ascii="Montserrat" w:eastAsia="Montserrat" w:hAnsi="Montserrat" w:cs="Montserrat"/>
+        <w:b/>
+        <w:bCs/>
+        <w:color w:val="E64C38"/>
+        <w:sz w:val="18"/>
+        <w:szCs w:val="18"/>
+      </w:rPr>
+      <w:t xml:space="preserve">ENYRGY | Session Handoff </w:t>
+    </w:r>
+    <w:proofErr w:type="gramStart"/>
+    <w:r>
+      <w:rPr>
+        <w:rFonts w:ascii="Montserrat" w:eastAsia="Montserrat" w:hAnsi="Montserrat" w:cs="Montserrat"/>
+        <w:b/>
+        <w:bCs/>
+        <w:color w:val="E64C38"/>
+        <w:sz w:val="18"/>
+        <w:szCs w:val="18"/>
+      </w:rPr>
+      <w:t xml:space="preserve">v3.9  </w:t>
+    </w:r>
+    <w:r>
+      <w:rPr>
+        <w:rFonts w:ascii="Montserrat" w:eastAsia="Montserrat" w:hAnsi="Montserrat" w:cs="Montserrat"/>
+        <w:color w:val="999999"/>
+        <w:sz w:val="18"/>
+        <w:szCs w:val="18"/>
+      </w:rPr>
+      <w:t>CONFIDENTIAL</w:t>
+    </w:r>
+    <w:proofErr w:type="gramEnd"/>
+  </w:p>
+</w:hdr>
+</file>
+
 <file path=word/numbering.xml><?xml version="1.0" encoding="utf-8"?>
-<w:numbering xmlns:w="http://schemas.openxmlformats.org/wordprocessingml/2006/main">
+<w:numbering xmlns:aink="http://schemas.microsoft.com/office/drawing/2016/ink" xmlns:am3d="http://schemas.microsoft.com/office/drawing/2017/model3d" xmlns:cx="http://schemas.microsoft.com/office/drawing/2014/chartex" xmlns:cx1="http://schemas.microsoft.com/office/drawing/2015/9/8/chartex" xmlns:cx2="http://schemas.microsoft.com/office/drawing/2015/10/21/chartex" xmlns:cx3="http://schemas.microsoft.com/office/drawing/2016/5/9/chartex" xmlns:cx4="http://schemas.microsoft.com/office/drawing/2016/5/10/chartex" xmlns:cx5="http://schemas.microsoft.com/office/drawing/2016/5/11/chartex" xmlns:cx6="http://schemas.microsoft.com/office/drawing/2016/5/12/chartex" xmlns:cx7="http://schemas.microsoft.com/office/drawing/2016/5/13/chartex" xmlns:cx8="http://schemas.microsoft.com/office/drawing/2016/5/14/chartex" xmlns:m="http://schemas.openxmlformats.org/officeDocument/2006/math" xmlns:mc="http://schemas.openxmlformats.org/markup-compatibility/2006" xmlns:o="urn:schemas-microsoft-com:office:office" xmlns:oel="http://schemas.microsoft.com/office/2019/extlst" xmlns:r="http://schemas.openxmlformats.org/officeDocument/2006/relationships" xmlns:v="urn:schemas-microsoft-com:vml" xmlns:w="http://schemas.openxmlformats.org/wordprocessingml/2006/main" xmlns:w10="urn:schemas-microsoft-com:office:word" xmlns:w14="http://schemas.microsoft.com/office/word/2010/wordml" xmlns:w15="http://schemas.microsoft.com/office/word/2012/wordml" xmlns:w16="http://schemas.microsoft.com/office/word/2018/wordml" xmlns:w16cex="http://schemas.microsoft.com/office/word/2018/wordml/cex" xmlns:w16cid="http://schemas.microsoft.com/office/word/2016/wordml/cid" xmlns:w16du="http://schemas.microsoft.com/office/word/2023/wordml/word16du" xmlns:w16sdtdh="http://schemas.microsoft.com/office/word/2020/wordml/sdtdatahash" xmlns:w16sdtfl="http://schemas.microsoft.com/office/word/2024/wordml/sdtformatlock" xmlns:w16se="http://schemas.microsoft.com/office/word/2015/wordml/symex" xmlns:wne="http://schemas.microsoft.com/office/word/2006/wordml" xmlns:wp="http://schemas.openxmlformats.org/drawingml/2006/wordprocessingDrawing" xmlns:wp14="http://schemas.microsoft.com/office/word/2010/wordprocessingDrawing" xmlns:wpc="http://schemas.microsoft.com/office/word/2010/wordprocessingCanvas" xmlns:wpg="http://schemas.microsoft.com/office/word/2010/wordprocessingGroup" xmlns:wpi="http://schemas.microsoft.com/office/word/2010/wordprocessingInk" xmlns:wps="http://schemas.microsoft.com/office/word/2010/wordprocessingShape" mc:Ignorable="w14 w15 w16se w16cid w16 w16cex w16sdtdh w16sdtfl w16du wp14">
+  <w:abstractNum w15:restartNumberingAfterBreak="0" w:abstractNumId="0">
+    <w:nsid w:val="EA454B4C"/>
+    <w:multiLevelType w:val="multilevel"/>
+    <w:tmpl w:val="BDE24088"/>
+    <w:lvl w:ilvl="0">
+      <w:numFmt w:val="bullet"/>
+      <w:lvlText w:val="•"/>
+      <w:lvlJc w:val="left"/>
+      <w:pPr>
+        <w:tabs>
+          <w:tab w:pos="0" w:val="num"/>
+        </w:tabs>
+        <w:ind w:hanging="480" w:left="480"/>
+      </w:pPr>
+    </w:lvl>
+    <w:lvl w:ilvl="1">
+      <w:numFmt w:val="bullet"/>
+      <w:lvlText w:val="–"/>
+      <w:lvlJc w:val="left"/>
+      <w:pPr>
+        <w:tabs>
+          <w:tab w:pos="720" w:val="num"/>
+        </w:tabs>
+        <w:ind w:hanging="480" w:left="1200"/>
+      </w:pPr>
+    </w:lvl>
+    <w:lvl w:ilvl="2">
+      <w:numFmt w:val="bullet"/>
+      <w:lvlText w:val="•"/>
+      <w:lvlJc w:val="left"/>
+      <w:pPr>
+        <w:tabs>
+          <w:tab w:pos="1440" w:val="num"/>
+        </w:tabs>
+        <w:ind w:hanging="480" w:left="1920"/>
+      </w:pPr>
+    </w:lvl>
+    <w:lvl w:ilvl="3">
+      <w:numFmt w:val="bullet"/>
+      <w:lvlText w:val="–"/>
+      <w:lvlJc w:val="left"/>
+      <w:pPr>
+        <w:tabs>
+          <w:tab w:pos="2160" w:val="num"/>
+        </w:tabs>
+        <w:ind w:hanging="480" w:left="2640"/>
+      </w:pPr>
+    </w:lvl>
+    <w:lvl w:ilvl="4">
+      <w:numFmt w:val="bullet"/>
+      <w:lvlText w:val="•"/>
+      <w:lvlJc w:val="left"/>
+      <w:pPr>
+        <w:tabs>
+          <w:tab w:pos="2880" w:val="num"/>
+        </w:tabs>
+        <w:ind w:hanging="480" w:left="3360"/>
+      </w:pPr>
+    </w:lvl>
+    <w:lvl w:ilvl="5">
+      <w:numFmt w:val="bullet"/>
+      <w:lvlText w:val="–"/>
+      <w:lvlJc w:val="left"/>
+      <w:pPr>
+        <w:tabs>
+          <w:tab w:pos="3600" w:val="num"/>
+        </w:tabs>
+        <w:ind w:hanging="480" w:left="4080"/>
+      </w:pPr>
+    </w:lvl>
+    <w:lvl w:ilvl="6">
+      <w:numFmt w:val="bullet"/>
+      <w:lvlText w:val="•"/>
+      <w:lvlJc w:val="left"/>
+      <w:pPr>
+        <w:tabs>
+          <w:tab w:pos="4320" w:val="num"/>
+        </w:tabs>
+        <w:ind w:hanging="480" w:left="4800"/>
+      </w:pPr>
+    </w:lvl>
+    <w:lvl w:ilvl="7">
+      <w:numFmt w:val="bullet"/>
+      <w:lvlText w:val="–"/>
+      <w:lvlJc w:val="left"/>
+      <w:pPr>
+        <w:tabs>
+          <w:tab w:pos="5040" w:val="num"/>
+        </w:tabs>
+        <w:ind w:hanging="480" w:left="5520"/>
+      </w:pPr>
+    </w:lvl>
+    <w:lvl w:ilvl="8">
+      <w:numFmt w:val="bullet"/>
+      <w:lvlText w:val="•"/>
+      <w:lvlJc w:val="left"/>
+      <w:pPr>
+        <w:tabs>
+          <w:tab w:pos="5760" w:val="num"/>
+        </w:tabs>
+        <w:ind w:hanging="480" w:left="6240"/>
+      </w:pPr>
+    </w:lvl>
+  </w:abstractNum>
+  <w:abstractNum w15:restartNumberingAfterBreak="0" w:abstractNumId="1">
+    <w:nsid w:val="2C1AE401"/>
+    <w:multiLevelType w:val="multilevel"/>
+    <w:tmpl w:val="07FA7514"/>
+    <w:lvl w:ilvl="0">
+      <w:numFmt w:val="bullet"/>
+      <w:lvlText w:val=" "/>
+      <w:lvlJc w:val="left"/>
+      <w:pPr>
+        <w:tabs>
+          <w:tab w:pos="0" w:val="num"/>
+        </w:tabs>
+        <w:ind w:hanging="480" w:left="480"/>
+      </w:pPr>
+    </w:lvl>
+    <w:lvl w:ilvl="1">
+      <w:numFmt w:val="bullet"/>
+      <w:lvlText w:val=" "/>
+      <w:lvlJc w:val="left"/>
+      <w:pPr>
+        <w:tabs>
+          <w:tab w:pos="720" w:val="num"/>
+        </w:tabs>
+        <w:ind w:hanging="480" w:left="1200"/>
+      </w:pPr>
+    </w:lvl>
+    <w:lvl w:ilvl="2">
+      <w:numFmt w:val="bullet"/>
+      <w:lvlText w:val=" "/>
+      <w:lvlJc w:val="left"/>
+      <w:pPr>
+        <w:tabs>
+          <w:tab w:pos="1440" w:val="num"/>
+        </w:tabs>
+        <w:ind w:hanging="480" w:left="1920"/>
+      </w:pPr>
+    </w:lvl>
+    <w:lvl w:ilvl="3">
+      <w:numFmt w:val="bullet"/>
+      <w:lvlText w:val=" "/>
+      <w:lvlJc w:val="left"/>
+      <w:pPr>
+        <w:tabs>
+          <w:tab w:pos="2160" w:val="num"/>
+        </w:tabs>
+        <w:ind w:hanging="480" w:left="2640"/>
+      </w:pPr>
+    </w:lvl>
+    <w:lvl w:ilvl="4">
+      <w:numFmt w:val="bullet"/>
+      <w:lvlText w:val=" "/>
+      <w:lvlJc w:val="left"/>
+      <w:pPr>
+        <w:tabs>
+          <w:tab w:pos="2880" w:val="num"/>
+        </w:tabs>
+        <w:ind w:hanging="480" w:left="3360"/>
+      </w:pPr>
+    </w:lvl>
+    <w:lvl w:ilvl="5">
+      <w:numFmt w:val="bullet"/>
+      <w:lvlText w:val=" "/>
+      <w:lvlJc w:val="left"/>
+      <w:pPr>
+        <w:tabs>
+          <w:tab w:pos="3600" w:val="num"/>
+        </w:tabs>
+        <w:ind w:hanging="480" w:left="4080"/>
+      </w:pPr>
+    </w:lvl>
+    <w:lvl w:ilvl="6">
+      <w:numFmt w:val="bullet"/>
+      <w:lvlText w:val=" "/>
+      <w:lvlJc w:val="left"/>
+      <w:pPr>
+        <w:tabs>
+          <w:tab w:pos="4320" w:val="num"/>
+        </w:tabs>
+        <w:ind w:hanging="480" w:left="4800"/>
+      </w:pPr>
+    </w:lvl>
+    <w:lvl w:ilvl="7">
+      <w:numFmt w:val="bullet"/>
+      <w:lvlText w:val=" "/>
+      <w:lvlJc w:val="left"/>
+      <w:pPr>
+        <w:tabs>
+          <w:tab w:pos="5040" w:val="num"/>
+        </w:tabs>
+        <w:ind w:hanging="480" w:left="5520"/>
+      </w:pPr>
+    </w:lvl>
+    <w:lvl w:ilvl="8">
+      <w:numFmt w:val="bullet"/>
+      <w:lvlText w:val=" "/>
+      <w:lvlJc w:val="left"/>
+      <w:pPr>
+        <w:tabs>
+          <w:tab w:pos="5760" w:val="num"/>
+        </w:tabs>
+        <w:ind w:hanging="480" w:left="6240"/>
+      </w:pPr>
+    </w:lvl>
+  </w:abstractNum>
+  <w:abstractNum w15:restartNumberingAfterBreak="0" w:abstractNumId="2">
+    <w:nsid w:val="47261BAD"/>
+    <w:multiLevelType w:val="multilevel"/>
+    <w:tmpl w:val="8ECE1826"/>
+    <w:lvl w:ilvl="0">
+      <w:start w:val="7"/>
+      <w:numFmt w:val="decimal"/>
+      <w:lvlText w:val="%1."/>
+      <w:lvlJc w:val="left"/>
+      <w:pPr>
+        <w:tabs>
+          <w:tab w:pos="0" w:val="num"/>
+        </w:tabs>
+        <w:ind w:hanging="480" w:left="480"/>
+      </w:pPr>
+    </w:lvl>
+    <w:lvl w:ilvl="1">
+      <w:start w:val="7"/>
+      <w:numFmt w:val="decimal"/>
+      <w:lvlText w:val="%2."/>
+      <w:lvlJc w:val="left"/>
+      <w:pPr>
+        <w:tabs>
+          <w:tab w:pos="720" w:val="num"/>
+        </w:tabs>
+        <w:ind w:hanging="480" w:left="1200"/>
+      </w:pPr>
+    </w:lvl>
+    <w:lvl w:ilvl="2">
+      <w:start w:val="7"/>
+      <w:numFmt w:val="decimal"/>
+      <w:lvlText w:val="%3."/>
+      <w:lvlJc w:val="left"/>
+      <w:pPr>
+        <w:tabs>
+          <w:tab w:pos="1440" w:val="num"/>
+        </w:tabs>
+        <w:ind w:hanging="480" w:left="1920"/>
+      </w:pPr>
+    </w:lvl>
+    <w:lvl w:ilvl="3">
+      <w:start w:val="7"/>
+      <w:numFmt w:val="decimal"/>
+      <w:lvlText w:val="%4."/>
+      <w:lvlJc w:val="left"/>
+      <w:pPr>
+        <w:tabs>
+          <w:tab w:pos="2160" w:val="num"/>
+        </w:tabs>
+        <w:ind w:hanging="480" w:left="2640"/>
+      </w:pPr>
+    </w:lvl>
+    <w:lvl w:ilvl="4">
+      <w:start w:val="7"/>
+      <w:numFmt w:val="decimal"/>
+      <w:lvlText w:val="%5."/>
+      <w:lvlJc w:val="left"/>
+      <w:pPr>
+        <w:tabs>
+          <w:tab w:pos="2880" w:val="num"/>
+        </w:tabs>
+        <w:ind w:hanging="480" w:left="3360"/>
+      </w:pPr>
+    </w:lvl>
+    <w:lvl w:ilvl="5">
+      <w:start w:val="7"/>
+      <w:numFmt w:val="decimal"/>
+      <w:lvlText w:val="%6."/>
+      <w:lvlJc w:val="left"/>
+      <w:pPr>
+        <w:tabs>
+          <w:tab w:pos="3600" w:val="num"/>
+        </w:tabs>
+        <w:ind w:hanging="480" w:left="4080"/>
+      </w:pPr>
+    </w:lvl>
+    <w:lvl w:ilvl="6">
+      <w:start w:val="7"/>
+      <w:numFmt w:val="decimal"/>
+      <w:lvlText w:val="%7."/>
+      <w:lvlJc w:val="left"/>
+      <w:pPr>
+        <w:tabs>
+          <w:tab w:pos="4320" w:val="num"/>
+        </w:tabs>
+        <w:ind w:hanging="480" w:left="4800"/>
+      </w:pPr>
+    </w:lvl>
+    <w:lvl w:ilvl="7">
+      <w:start w:val="7"/>
+      <w:numFmt w:val="decimal"/>
+      <w:lvlText w:val="%8."/>
+      <w:lvlJc w:val="left"/>
+      <w:pPr>
+        <w:tabs>
+          <w:tab w:pos="5040" w:val="num"/>
+        </w:tabs>
+        <w:ind w:hanging="480" w:left="5520"/>
+      </w:pPr>
+    </w:lvl>
+    <w:lvl w:ilvl="8">
+      <w:start w:val="7"/>
+      <w:numFmt w:val="decimal"/>
+      <w:lvlText w:val="%9."/>
+      <w:lvlJc w:val="left"/>
+      <w:pPr>
+        <w:tabs>
+          <w:tab w:pos="5760" w:val="num"/>
+        </w:tabs>
+        <w:ind w:hanging="480" w:left="6240"/>
+      </w:pPr>
+    </w:lvl>
+  </w:abstractNum>
+  <w:abstractNum w15:restartNumberingAfterBreak="0" w:abstractNumId="3">
+    <w:nsid w:val="71315DCA"/>
+    <w:multiLevelType w:val="multilevel"/>
+    <w:tmpl w:val="8F1A713C"/>
+    <w:lvl w:ilvl="0">
+      <w:start w:val="1"/>
+      <w:numFmt w:val="decimal"/>
+      <w:lvlText w:val="%1."/>
+      <w:lvlJc w:val="left"/>
+      <w:pPr>
+        <w:tabs>
+          <w:tab w:pos="0" w:val="num"/>
+        </w:tabs>
+        <w:ind w:hanging="480" w:left="480"/>
+      </w:pPr>
+    </w:lvl>
+    <w:lvl w:ilvl="1">
+      <w:start w:val="1"/>
+      <w:numFmt w:val="decimal"/>
+      <w:lvlText w:val="%2."/>
+      <w:lvlJc w:val="left"/>
+      <w:pPr>
+        <w:tabs>
+          <w:tab w:pos="720" w:val="num"/>
+        </w:tabs>
+        <w:ind w:hanging="480" w:left="1200"/>
+      </w:pPr>
+    </w:lvl>
+    <w:lvl w:ilvl="2">
+      <w:start w:val="1"/>
+      <w:numFmt w:val="decimal"/>
+      <w:lvlText w:val="%3."/>
+      <w:lvlJc w:val="left"/>
+      <w:pPr>
+        <w:tabs>
+          <w:tab w:pos="1440" w:val="num"/>
+        </w:tabs>
+        <w:ind w:hanging="480" w:left="1920"/>
+      </w:pPr>
+    </w:lvl>
+    <w:lvl w:ilvl="3">
+      <w:start w:val="1"/>
+      <w:numFmt w:val="decimal"/>
+      <w:lvlText w:val="%4."/>
+      <w:lvlJc w:val="left"/>
+      <w:pPr>
+        <w:tabs>
+          <w:tab w:pos="2160" w:val="num"/>
+        </w:tabs>
+        <w:ind w:hanging="480" w:left="2640"/>
+      </w:pPr>
+    </w:lvl>
+    <w:lvl w:ilvl="4">
+      <w:start w:val="1"/>
+      <w:numFmt w:val="decimal"/>
+      <w:lvlText w:val="%5."/>
+      <w:lvlJc w:val="left"/>
+      <w:pPr>
+        <w:tabs>
+          <w:tab w:pos="2880" w:val="num"/>
+        </w:tabs>
+        <w:ind w:hanging="480" w:left="3360"/>
+      </w:pPr>
+    </w:lvl>
+    <w:lvl w:ilvl="5">
+      <w:start w:val="1"/>
+      <w:numFmt w:val="decimal"/>
+      <w:lvlText w:val="%6."/>
+      <w:lvlJc w:val="left"/>
+      <w:pPr>
+        <w:tabs>
+          <w:tab w:pos="3600" w:val="num"/>
+        </w:tabs>
+        <w:ind w:hanging="480" w:left="4080"/>
+      </w:pPr>
+    </w:lvl>
+    <w:lvl w:ilvl="6">
+      <w:start w:val="1"/>
+      <w:numFmt w:val="decimal"/>
+      <w:lvlText w:val="%7."/>
+      <w:lvlJc w:val="left"/>
+      <w:pPr>
+        <w:tabs>
+          <w:tab w:pos="4320" w:val="num"/>
+        </w:tabs>
+        <w:ind w:hanging="480" w:left="4800"/>
+      </w:pPr>
+    </w:lvl>
+    <w:lvl w:ilvl="7">
+      <w:start w:val="1"/>
+      <w:numFmt w:val="decimal"/>
+      <w:lvlText w:val="%8."/>
+      <w:lvlJc w:val="left"/>
+      <w:pPr>
+        <w:tabs>
+          <w:tab w:pos="5040" w:val="num"/>
+        </w:tabs>
+        <w:ind w:hanging="480" w:left="5520"/>
+      </w:pPr>
+    </w:lvl>
+    <w:lvl w:ilvl="8">
+      <w:start w:val="1"/>
+      <w:numFmt w:val="decimal"/>
+      <w:lvlText w:val="%9."/>
+      <w:lvlJc w:val="left"/>
+      <w:pPr>
+        <w:tabs>
+          <w:tab w:pos="5760" w:val="num"/>
+        </w:tabs>
+        <w:ind w:hanging="480" w:left="6240"/>
+      </w:pPr>
+    </w:lvl>
+  </w:abstractNum>
   <w:abstractNum w:abstractNumId="990">
     <w:nsid w:val="0000A990"/>
     <w:multiLevelType w:val="multilevel"/>
@@ -17651,6 +18295,114 @@
       </w:pPr>
     </w:lvl>
   </w:abstractNum>
+  <w:num w16cid:durableId="666442937" w:numId="1">
+    <w:abstractNumId w:val="1"/>
+  </w:num>
+  <w:num w16cid:durableId="611596762" w:numId="2">
+    <w:abstractNumId w:val="0"/>
+  </w:num>
+  <w:num w16cid:durableId="388962429" w:numId="3">
+    <w:abstractNumId w:val="0"/>
+  </w:num>
+  <w:num w16cid:durableId="1208103481" w:numId="4">
+    <w:abstractNumId w:val="0"/>
+  </w:num>
+  <w:num w16cid:durableId="2058387244" w:numId="5">
+    <w:abstractNumId w:val="0"/>
+  </w:num>
+  <w:num w16cid:durableId="571309507" w:numId="6">
+    <w:abstractNumId w:val="0"/>
+  </w:num>
+  <w:num w16cid:durableId="564293530" w:numId="7">
+    <w:abstractNumId w:val="0"/>
+  </w:num>
+  <w:num w16cid:durableId="1537962493" w:numId="8">
+    <w:abstractNumId w:val="0"/>
+  </w:num>
+  <w:num w16cid:durableId="1458573164" w:numId="9">
+    <w:abstractNumId w:val="0"/>
+  </w:num>
+  <w:num w16cid:durableId="2042437547" w:numId="10">
+    <w:abstractNumId w:val="0"/>
+  </w:num>
+  <w:num w16cid:durableId="2042438987" w:numId="11">
+    <w:abstractNumId w:val="0"/>
+  </w:num>
+  <w:num w16cid:durableId="477458780" w:numId="12">
+    <w:abstractNumId w:val="0"/>
+  </w:num>
+  <w:num w16cid:durableId="698898323" w:numId="13">
+    <w:abstractNumId w:val="0"/>
+  </w:num>
+  <w:num w16cid:durableId="424956732" w:numId="14">
+    <w:abstractNumId w:val="0"/>
+  </w:num>
+  <w:num w16cid:durableId="69932026" w:numId="15">
+    <w:abstractNumId w:val="0"/>
+  </w:num>
+  <w:num w16cid:durableId="1401829951" w:numId="16">
+    <w:abstractNumId w:val="3"/>
+    <w:lvlOverride w:ilvl="0">
+      <w:startOverride w:val="1"/>
+    </w:lvlOverride>
+    <w:lvlOverride w:ilvl="1">
+      <w:startOverride w:val="1"/>
+    </w:lvlOverride>
+    <w:lvlOverride w:ilvl="2">
+      <w:startOverride w:val="1"/>
+    </w:lvlOverride>
+    <w:lvlOverride w:ilvl="3">
+      <w:startOverride w:val="1"/>
+    </w:lvlOverride>
+    <w:lvlOverride w:ilvl="4">
+      <w:startOverride w:val="1"/>
+    </w:lvlOverride>
+    <w:lvlOverride w:ilvl="5">
+      <w:startOverride w:val="1"/>
+    </w:lvlOverride>
+    <w:lvlOverride w:ilvl="6">
+      <w:startOverride w:val="1"/>
+    </w:lvlOverride>
+    <w:lvlOverride w:ilvl="7">
+      <w:startOverride w:val="1"/>
+    </w:lvlOverride>
+    <w:lvlOverride w:ilvl="8">
+      <w:startOverride w:val="1"/>
+    </w:lvlOverride>
+  </w:num>
+  <w:num w16cid:durableId="1720593767" w:numId="17">
+    <w:abstractNumId w:val="0"/>
+  </w:num>
+  <w:num w16cid:durableId="293027331" w:numId="18">
+    <w:abstractNumId w:val="2"/>
+    <w:lvlOverride w:ilvl="0">
+      <w:startOverride w:val="7"/>
+    </w:lvlOverride>
+    <w:lvlOverride w:ilvl="1">
+      <w:startOverride w:val="7"/>
+    </w:lvlOverride>
+    <w:lvlOverride w:ilvl="2">
+      <w:startOverride w:val="7"/>
+    </w:lvlOverride>
+    <w:lvlOverride w:ilvl="3">
+      <w:startOverride w:val="7"/>
+    </w:lvlOverride>
+    <w:lvlOverride w:ilvl="4">
+      <w:startOverride w:val="7"/>
+    </w:lvlOverride>
+    <w:lvlOverride w:ilvl="5">
+      <w:startOverride w:val="7"/>
+    </w:lvlOverride>
+    <w:lvlOverride w:ilvl="6">
+      <w:startOverride w:val="7"/>
+    </w:lvlOverride>
+    <w:lvlOverride w:ilvl="7">
+      <w:startOverride w:val="7"/>
+    </w:lvlOverride>
+    <w:lvlOverride w:ilvl="8">
+      <w:startOverride w:val="7"/>
+    </w:lvlOverride>
+  </w:num>
   <w:num w:numId="1000">
     <w:abstractNumId w:val="990"/>
   </w:num>
@@ -17829,14 +18581,15 @@
 </file>
 
 <file path=word/styles.xml><?xml version="1.0" encoding="utf-8"?>
-<w:styles xmlns:r="http://schemas.openxmlformats.org/officeDocument/2006/relationships" xmlns:w="http://schemas.openxmlformats.org/wordprocessingml/2006/main">
+<w:styles xmlns:mc="http://schemas.openxmlformats.org/markup-compatibility/2006" xmlns:r="http://schemas.openxmlformats.org/officeDocument/2006/relationships" xmlns:w="http://schemas.openxmlformats.org/wordprocessingml/2006/main" xmlns:w14="http://schemas.microsoft.com/office/word/2010/wordml" xmlns:w15="http://schemas.microsoft.com/office/word/2012/wordml" xmlns:w16="http://schemas.microsoft.com/office/word/2018/wordml" xmlns:w16cex="http://schemas.microsoft.com/office/word/2018/wordml/cex" xmlns:w16cid="http://schemas.microsoft.com/office/word/2016/wordml/cid" xmlns:w16du="http://schemas.microsoft.com/office/word/2023/wordml/word16du" xmlns:w16sdtdh="http://schemas.microsoft.com/office/word/2020/wordml/sdtdatahash" xmlns:w16sdtfl="http://schemas.microsoft.com/office/word/2024/wordml/sdtformatlock" xmlns:w16se="http://schemas.microsoft.com/office/word/2015/wordml/symex" mc:Ignorable="w14 w15 w16se w16cid w16 w16cex w16sdtdh w16sdtfl w16du">
   <w:docDefaults>
     <w:rPrDefault>
       <w:rPr>
-        <w:rFonts w:asciiTheme="minorHAnsi" w:cstheme="minorBidi" w:eastAsiaTheme="minorEastAsia" w:hAnsiTheme="minorHAnsi"/>
-        <w:sz w:val="24"/>
-        <w:szCs w:val="24"/>
-        <w:lang w:bidi="ar-SA" w:eastAsia="zh-CN" w:val="en-US"/>
+        <w:rFonts w:asciiTheme="minorHAnsi" w:cstheme="minorBidi" w:eastAsiaTheme="minorHAnsi" w:hAnsiTheme="minorHAnsi"/>
+        <w:color w:val="1A1A1A"/>
+        <w:sz w:val="22"/>
+        <w:szCs w:val="22"/>
+        <w:lang w:bidi="ar-SA" w:eastAsia="en-US" w:val="en-US"/>
       </w:rPr>
     </w:rPrDefault>
     <w:pPrDefault>
@@ -17845,15 +18598,475 @@
       </w:pPr>
     </w:pPrDefault>
   </w:docDefaults>
-  <w:latentStyles w:count="276" w:defLockedState="0" w:defQFormat="0" w:defSemiHidden="0" w:defUIPriority="0" w:defUnhideWhenUsed="0"/>
+  <w:latentStyles w:count="376" w:defLockedState="0" w:defQFormat="0" w:defSemiHidden="0" w:defUIPriority="0" w:defUnhideWhenUsed="0">
+    <w:lsdException w:name="toc 1" w:uiPriority="39"/>
+    <w:lsdException w:name="toc 2" w:uiPriority="39"/>
+    <w:lsdException w:name="Hyperlink" w:uiPriority="99"/>
+    <w:lsdException w:name="Normal Table" w:semiHidden="1" w:unhideWhenUsed="1"/>
+    <w:lsdException w:name="Table Simple 1" w:semiHidden="1" w:unhideWhenUsed="1"/>
+    <w:lsdException w:name="Table Simple 2" w:semiHidden="1" w:unhideWhenUsed="1"/>
+    <w:lsdException w:name="Table Simple 3" w:semiHidden="1" w:unhideWhenUsed="1"/>
+    <w:lsdException w:name="Table Classic 1" w:semiHidden="1" w:unhideWhenUsed="1"/>
+    <w:lsdException w:name="Table Classic 2" w:semiHidden="1" w:unhideWhenUsed="1"/>
+    <w:lsdException w:name="Table Classic 3" w:semiHidden="1" w:unhideWhenUsed="1"/>
+    <w:lsdException w:name="Table Classic 4" w:semiHidden="1" w:unhideWhenUsed="1"/>
+    <w:lsdException w:name="Table Colorful 1" w:semiHidden="1" w:unhideWhenUsed="1"/>
+    <w:lsdException w:name="Table Colorful 2" w:semiHidden="1" w:unhideWhenUsed="1"/>
+    <w:lsdException w:name="Table Colorful 3" w:semiHidden="1" w:unhideWhenUsed="1"/>
+    <w:lsdException w:name="Table Columns 1" w:semiHidden="1" w:unhideWhenUsed="1"/>
+    <w:lsdException w:name="Table Columns 2" w:semiHidden="1" w:unhideWhenUsed="1"/>
+    <w:lsdException w:name="Table Columns 3" w:semiHidden="1" w:unhideWhenUsed="1"/>
+    <w:lsdException w:name="Table Columns 4" w:semiHidden="1" w:unhideWhenUsed="1"/>
+    <w:lsdException w:name="Table Columns 5" w:semiHidden="1" w:unhideWhenUsed="1"/>
+    <w:lsdException w:name="Table Grid 1" w:semiHidden="1" w:unhideWhenUsed="1"/>
+    <w:lsdException w:name="Table Grid 2" w:semiHidden="1" w:unhideWhenUsed="1"/>
+    <w:lsdException w:name="Table Grid 3" w:semiHidden="1" w:unhideWhenUsed="1"/>
+    <w:lsdException w:name="Table Grid 4" w:semiHidden="1" w:unhideWhenUsed="1"/>
+    <w:lsdException w:name="Table Grid 5" w:semiHidden="1" w:unhideWhenUsed="1"/>
+    <w:lsdException w:name="Table Grid 6" w:semiHidden="1" w:unhideWhenUsed="1"/>
+    <w:lsdException w:name="Table Grid 7" w:semiHidden="1" w:unhideWhenUsed="1"/>
+    <w:lsdException w:name="Table Grid 8" w:semiHidden="1" w:unhideWhenUsed="1"/>
+    <w:lsdException w:name="Table List 1" w:semiHidden="1" w:unhideWhenUsed="1"/>
+    <w:lsdException w:name="Table List 2" w:semiHidden="1" w:unhideWhenUsed="1"/>
+    <w:lsdException w:name="Table List 3" w:semiHidden="1" w:unhideWhenUsed="1"/>
+    <w:lsdException w:name="Table List 4" w:semiHidden="1" w:unhideWhenUsed="1"/>
+    <w:lsdException w:name="Table List 5" w:semiHidden="1" w:unhideWhenUsed="1"/>
+    <w:lsdException w:name="Table List 6" w:semiHidden="1" w:unhideWhenUsed="1"/>
+    <w:lsdException w:name="Table List 7" w:semiHidden="1" w:unhideWhenUsed="1"/>
+    <w:lsdException w:name="Table List 8" w:semiHidden="1" w:unhideWhenUsed="1"/>
+    <w:lsdException w:name="Table 3D effects 1" w:semiHidden="1" w:unhideWhenUsed="1"/>
+    <w:lsdException w:name="Table 3D effects 2" w:semiHidden="1" w:unhideWhenUsed="1"/>
+    <w:lsdException w:name="Table 3D effects 3" w:semiHidden="1" w:unhideWhenUsed="1"/>
+    <w:lsdException w:name="Table Contemporary" w:semiHidden="1" w:unhideWhenUsed="1"/>
+    <w:lsdException w:name="Table Elegant" w:semiHidden="1" w:unhideWhenUsed="1"/>
+    <w:lsdException w:name="Table Professional" w:semiHidden="1" w:unhideWhenUsed="1"/>
+    <w:lsdException w:name="Table Subtle 1" w:semiHidden="1" w:unhideWhenUsed="1"/>
+    <w:lsdException w:name="Table Subtle 2" w:semiHidden="1" w:unhideWhenUsed="1"/>
+    <w:lsdException w:name="Table Web 1" w:semiHidden="1" w:unhideWhenUsed="1"/>
+    <w:lsdException w:name="Table Web 2" w:semiHidden="1" w:unhideWhenUsed="1"/>
+    <w:lsdException w:name="Table Web 3" w:semiHidden="1" w:unhideWhenUsed="1"/>
+    <w:lsdException w:name="Table Theme" w:semiHidden="1" w:unhideWhenUsed="1"/>
+    <w:lsdException w:name="Light Shading"/>
+    <w:lsdException w:name="Light List"/>
+    <w:lsdException w:name="Light Grid"/>
+    <w:lsdException w:name="Medium Shading 1"/>
+    <w:lsdException w:name="Medium Shading 2"/>
+    <w:lsdException w:name="Medium List 1"/>
+    <w:lsdException w:name="Medium List 2"/>
+    <w:lsdException w:name="Medium Grid 1"/>
+    <w:lsdException w:name="Medium Grid 2"/>
+    <w:lsdException w:name="Medium Grid 3"/>
+    <w:lsdException w:name="Dark List"/>
+    <w:lsdException w:name="Colorful Shading"/>
+    <w:lsdException w:name="Colorful List"/>
+    <w:lsdException w:name="Colorful Grid"/>
+    <w:lsdException w:name="Light Shading Accent 1"/>
+    <w:lsdException w:name="Light List Accent 1"/>
+    <w:lsdException w:name="Light Grid Accent 1"/>
+    <w:lsdException w:name="Medium Shading 1 Accent 1"/>
+    <w:lsdException w:name="Medium Shading 2 Accent 1"/>
+    <w:lsdException w:name="Medium List 1 Accent 1"/>
+    <w:lsdException w:name="Medium List 2 Accent 1"/>
+    <w:lsdException w:name="Medium Grid 1 Accent 1"/>
+    <w:lsdException w:name="Medium Grid 2 Accent 1"/>
+    <w:lsdException w:name="Medium Grid 3 Accent 1"/>
+    <w:lsdException w:name="Dark List Accent 1"/>
+    <w:lsdException w:name="Colorful Shading Accent 1"/>
+    <w:lsdException w:name="Colorful List Accent 1"/>
+    <w:lsdException w:name="Colorful Grid Accent 1"/>
+    <w:lsdException w:name="Light Shading Accent 2"/>
+    <w:lsdException w:name="Light List Accent 2"/>
+    <w:lsdException w:name="Light Grid Accent 2"/>
+    <w:lsdException w:name="Medium Shading 1 Accent 2"/>
+    <w:lsdException w:name="Medium Shading 2 Accent 2"/>
+    <w:lsdException w:name="Medium List 1 Accent 2"/>
+    <w:lsdException w:name="Medium List 2 Accent 2"/>
+    <w:lsdException w:name="Medium Grid 1 Accent 2"/>
+    <w:lsdException w:name="Medium Grid 2 Accent 2"/>
+    <w:lsdException w:name="Medium Grid 3 Accent 2"/>
+    <w:lsdException w:name="Dark List Accent 2"/>
+    <w:lsdException w:name="Colorful Shading Accent 2"/>
+    <w:lsdException w:name="Colorful List Accent 2"/>
+    <w:lsdException w:name="Colorful Grid Accent 2"/>
+    <w:lsdException w:name="Light Shading Accent 3"/>
+    <w:lsdException w:name="Light List Accent 3"/>
+    <w:lsdException w:name="Light Grid Accent 3"/>
+    <w:lsdException w:name="Medium Shading 1 Accent 3"/>
+    <w:lsdException w:name="Medium Shading 2 Accent 3"/>
+    <w:lsdException w:name="Medium List 1 Accent 3"/>
+    <w:lsdException w:name="Medium List 2 Accent 3"/>
+    <w:lsdException w:name="Medium Grid 1 Accent 3"/>
+    <w:lsdException w:name="Medium Grid 2 Accent 3"/>
+    <w:lsdException w:name="Medium Grid 3 Accent 3"/>
+    <w:lsdException w:name="Dark List Accent 3"/>
+    <w:lsdException w:name="Colorful Shading Accent 3"/>
+    <w:lsdException w:name="Colorful List Accent 3"/>
+    <w:lsdException w:name="Colorful Grid Accent 3"/>
+    <w:lsdException w:name="Light Shading Accent 4"/>
+    <w:lsdException w:name="Light List Accent 4"/>
+    <w:lsdException w:name="Light Grid Accent 4"/>
+    <w:lsdException w:name="Medium Shading 1 Accent 4"/>
+    <w:lsdException w:name="Medium Shading 2 Accent 4"/>
+    <w:lsdException w:name="Medium List 1 Accent 4"/>
+    <w:lsdException w:name="Medium List 2 Accent 4"/>
+    <w:lsdException w:name="Medium Grid 1 Accent 4"/>
+    <w:lsdException w:name="Medium Grid 2 Accent 4"/>
+    <w:lsdException w:name="Medium Grid 3 Accent 4"/>
+    <w:lsdException w:name="Dark List Accent 4"/>
+    <w:lsdException w:name="Colorful Shading Accent 4"/>
+    <w:lsdException w:name="Colorful List Accent 4"/>
+    <w:lsdException w:name="Colorful Grid Accent 4"/>
+    <w:lsdException w:name="Light Shading Accent 5"/>
+    <w:lsdException w:name="Light List Accent 5"/>
+    <w:lsdException w:name="Light Grid Accent 5"/>
+    <w:lsdException w:name="Medium Shading 1 Accent 5"/>
+    <w:lsdException w:name="Medium Shading 2 Accent 5"/>
+    <w:lsdException w:name="Medium List 1 Accent 5"/>
+    <w:lsdException w:name="Medium List 2 Accent 5"/>
+    <w:lsdException w:name="Medium Grid 1 Accent 5"/>
+    <w:lsdException w:name="Medium Grid 2 Accent 5"/>
+    <w:lsdException w:name="Medium Grid 3 Accent 5"/>
+    <w:lsdException w:name="Dark List Accent 5"/>
+    <w:lsdException w:name="Colorful Shading Accent 5"/>
+    <w:lsdException w:name="Colorful List Accent 5"/>
+    <w:lsdException w:name="Colorful Grid Accent 5"/>
+    <w:lsdException w:name="Light Shading Accent 6"/>
+    <w:lsdException w:name="Light List Accent 6"/>
+    <w:lsdException w:name="Light Grid Accent 6"/>
+    <w:lsdException w:name="Medium Shading 1 Accent 6"/>
+    <w:lsdException w:name="Medium Shading 2 Accent 6"/>
+    <w:lsdException w:name="Medium List 1 Accent 6"/>
+    <w:lsdException w:name="Medium List 2 Accent 6"/>
+    <w:lsdException w:name="Medium Grid 1 Accent 6"/>
+    <w:lsdException w:name="Medium Grid 2 Accent 6"/>
+    <w:lsdException w:name="Medium Grid 3 Accent 6"/>
+    <w:lsdException w:name="Dark List Accent 6"/>
+    <w:lsdException w:name="Colorful Shading Accent 6"/>
+    <w:lsdException w:name="Colorful List Accent 6"/>
+    <w:lsdException w:name="Colorful Grid Accent 6"/>
+    <w:lsdException w:name="Grid Table 4" w:uiPriority="49"/>
+    <w:lsdException w:name="Grid Table 5 Dark" w:uiPriority="50"/>
+    <w:lsdException w:name="Grid Table 6 Colorful" w:uiPriority="51"/>
+    <w:lsdException w:name="Grid Table 7 Colorful" w:uiPriority="52"/>
+    <w:lsdException w:name="Grid Table 1 Light Accent 1" w:uiPriority="46"/>
+    <w:lsdException w:name="Grid Table 2 Accent 1" w:uiPriority="47"/>
+    <w:lsdException w:name="Grid Table 3 Accent 1" w:uiPriority="48"/>
+    <w:lsdException w:name="Grid Table 4 Accent 1" w:uiPriority="49"/>
+    <w:lsdException w:name="Grid Table 5 Dark Accent 1" w:uiPriority="50"/>
+    <w:lsdException w:name="Grid Table 6 Colorful Accent 1" w:uiPriority="51"/>
+    <w:lsdException w:name="Grid Table 7 Colorful Accent 1" w:uiPriority="52"/>
+    <w:lsdException w:name="Grid Table 1 Light Accent 2" w:uiPriority="46"/>
+    <w:lsdException w:name="Grid Table 2 Accent 2" w:uiPriority="47"/>
+    <w:lsdException w:name="Grid Table 3 Accent 2" w:uiPriority="48"/>
+    <w:lsdException w:name="Grid Table 4 Accent 2" w:uiPriority="49"/>
+    <w:lsdException w:name="Grid Table 5 Dark Accent 2" w:uiPriority="50"/>
+    <w:lsdException w:name="Grid Table 6 Colorful Accent 2" w:uiPriority="51"/>
+    <w:lsdException w:name="Grid Table 7 Colorful Accent 2" w:uiPriority="52"/>
+    <w:lsdException w:name="Grid Table 1 Light Accent 3" w:uiPriority="46"/>
+    <w:lsdException w:name="Grid Table 2 Accent 3" w:uiPriority="47"/>
+    <w:lsdException w:name="Grid Table 3 Accent 3" w:uiPriority="48"/>
+    <w:lsdException w:name="Grid Table 4 Accent 3" w:uiPriority="49"/>
+    <w:lsdException w:name="Grid Table 5 Dark Accent 3" w:uiPriority="50"/>
+    <w:lsdException w:name="Grid Table 6 Colorful Accent 3" w:uiPriority="51"/>
+    <w:lsdException w:name="Grid Table 7 Colorful Accent 3" w:uiPriority="52"/>
+    <w:lsdException w:name="Grid Table 1 Light Accent 4" w:uiPriority="46"/>
+    <w:lsdException w:name="Grid Table 2 Accent 4" w:uiPriority="47"/>
+    <w:lsdException w:name="Grid Table 3 Accent 4" w:uiPriority="48"/>
+    <w:lsdException w:name="Grid Table 4 Accent 4" w:uiPriority="49"/>
+    <w:lsdException w:name="Grid Table 5 Dark Accent 4" w:uiPriority="50"/>
+    <w:lsdException w:name="Grid Table 6 Colorful Accent 4" w:uiPriority="51"/>
+    <w:lsdException w:name="Grid Table 7 Colorful Accent 4" w:uiPriority="52"/>
+    <w:lsdException w:name="Grid Table 1 Light Accent 5" w:uiPriority="46"/>
+    <w:lsdException w:name="Grid Table 2 Accent 5" w:uiPriority="47"/>
+    <w:lsdException w:name="Grid Table 3 Accent 5" w:uiPriority="48"/>
+    <w:lsdException w:name="Grid Table 4 Accent 5" w:uiPriority="49"/>
+    <w:lsdException w:name="Grid Table 5 Dark Accent 5" w:uiPriority="50"/>
+    <w:lsdException w:name="Grid Table 6 Colorful Accent 5" w:uiPriority="51"/>
+    <w:lsdException w:name="Grid Table 7 Colorful Accent 5" w:uiPriority="52"/>
+    <w:lsdException w:name="Grid Table 1 Light Accent 6" w:uiPriority="46"/>
+    <w:lsdException w:name="Grid Table 2 Accent 6" w:uiPriority="47"/>
+    <w:lsdException w:name="Grid Table 3 Accent 6" w:uiPriority="48"/>
+    <w:lsdException w:name="Grid Table 4 Accent 6" w:uiPriority="49"/>
+    <w:lsdException w:name="Grid Table 5 Dark Accent 6" w:uiPriority="50"/>
+    <w:lsdException w:name="Grid Table 6 Colorful Accent 6" w:uiPriority="51"/>
+    <w:lsdException w:name="Grid Table 7 Colorful Accent 6" w:uiPriority="52"/>
+    <w:lsdException w:name="List Table 1 Light" w:uiPriority="46"/>
+    <w:lsdException w:name="List Table 2" w:uiPriority="47"/>
+    <w:lsdException w:name="List Table 3" w:uiPriority="48"/>
+    <w:lsdException w:name="List Table 4" w:uiPriority="49"/>
+    <w:lsdException w:name="List Table 5 Dark" w:uiPriority="50"/>
+    <w:lsdException w:name="List Table 6 Colorful" w:uiPriority="51"/>
+    <w:lsdException w:name="List Table 7 Colorful" w:uiPriority="52"/>
+    <w:lsdException w:name="List Table 1 Light Accent 1" w:uiPriority="46"/>
+    <w:lsdException w:name="List Table 2 Accent 1" w:uiPriority="47"/>
+    <w:lsdException w:name="List Table 3 Accent 1" w:uiPriority="48"/>
+    <w:lsdException w:name="List Table 4 Accent 1" w:uiPriority="49"/>
+    <w:lsdException w:name="List Table 5 Dark Accent 1" w:uiPriority="50"/>
+    <w:lsdException w:name="List Table 6 Colorful Accent 1" w:uiPriority="51"/>
+    <w:lsdException w:name="List Table 7 Colorful Accent 1" w:uiPriority="52"/>
+    <w:lsdException w:name="List Table 1 Light Accent 2" w:uiPriority="46"/>
+    <w:lsdException w:name="List Table 2 Accent 2" w:uiPriority="47"/>
+    <w:lsdException w:name="List Table 3 Accent 2" w:uiPriority="48"/>
+    <w:lsdException w:name="List Table 4 Accent 2" w:uiPriority="49"/>
+    <w:lsdException w:name="List Table 5 Dark Accent 2" w:uiPriority="50"/>
+    <w:lsdException w:name="List Table 6 Colorful Accent 2" w:uiPriority="51"/>
+    <w:lsdException w:name="List Table 7 Colorful Accent 2" w:uiPriority="52"/>
+    <w:lsdException w:name="List Table 1 Light Accent 3" w:uiPriority="46"/>
+    <w:lsdException w:name="List Table 2 Accent 3" w:uiPriority="47"/>
+    <w:lsdException w:name="List Table 3 Accent 3" w:uiPriority="48"/>
+    <w:lsdException w:name="List Table 4 Accent 3" w:uiPriority="49"/>
+    <w:lsdException w:name="List Table 5 Dark Accent 3" w:uiPriority="50"/>
+    <w:lsdException w:name="List Table 6 Colorful Accent 3" w:uiPriority="51"/>
+    <w:lsdException w:name="List Table 7 Colorful Accent 3" w:uiPriority="52"/>
+    <w:lsdException w:name="List Table 1 Light Accent 4" w:uiPriority="46"/>
+    <w:lsdException w:name="List Table 2 Accent 4" w:uiPriority="47"/>
+    <w:lsdException w:name="List Table 3 Accent 4" w:uiPriority="48"/>
+    <w:lsdException w:name="List Table 4 Accent 4" w:uiPriority="49"/>
+    <w:lsdException w:name="List Table 5 Dark Accent 4" w:uiPriority="50"/>
+    <w:lsdException w:name="List Table 6 Colorful Accent 4" w:uiPriority="51"/>
+    <w:lsdException w:name="List Table 7 Colorful Accent 4" w:uiPriority="52"/>
+    <w:lsdException w:name="List Table 1 Light Accent 5" w:uiPriority="46"/>
+    <w:lsdException w:name="List Table 2 Accent 5" w:uiPriority="47"/>
+    <w:lsdException w:name="List Table 3 Accent 5" w:uiPriority="48"/>
+    <w:lsdException w:name="List Table 4 Accent 5" w:uiPriority="49"/>
+    <w:lsdException w:name="List Table 5 Dark Accent 5" w:uiPriority="50"/>
+    <w:lsdException w:name="List Table 6 Colorful Accent 5" w:uiPriority="51"/>
+    <w:lsdException w:name="List Table 7 Colorful Accent 5" w:uiPriority="52"/>
+    <w:lsdException w:name="List Table 1 Light Accent 6" w:uiPriority="46"/>
+    <w:lsdException w:name="List Table 2 Accent 6" w:uiPriority="47"/>
+    <w:lsdException w:name="List Table 3 Accent 6" w:uiPriority="48"/>
+    <w:lsdException w:name="List Table 4 Accent 6" w:uiPriority="49"/>
+    <w:lsdException w:name="List Table 5 Dark Accent 6" w:uiPriority="50"/>
+    <w:lsdException w:name="List Table 6 Colorful Accent 6" w:uiPriority="51"/>
+    <w:lsdException w:name="List Table 7 Colorful Accent 6" w:uiPriority="52"/>
+    <w:lsdException w:name="Mention" w:semiHidden="1" w:uiPriority="99" w:unhideWhenUsed="1"/>
+    <w:lsdException w:name="Smart Hyperlink" w:semiHidden="1" w:uiPriority="99" w:unhideWhenUsed="1"/>
+    <w:lsdException w:name="Hashtag" w:semiHidden="1" w:uiPriority="99" w:unhideWhenUsed="1"/>
+    <w:lsdException w:name="Unresolved Mention" w:semiHidden="1" w:uiPriority="99" w:unhideWhenUsed="1"/>
+    <w:lsdException w:name="Smart Link" w:semiHidden="1" w:uiPriority="99" w:unhideWhenUsed="1"/>
+  </w:latentStyles>
   <w:style w:default="1" w:styleId="Normal" w:type="paragraph">
     <w:name w:val="Normal"/>
     <w:qFormat/>
   </w:style>
+  <w:style w:styleId="Heading1" w:type="paragraph">
+    <w:name w:val="heading 1"/>
+    <w:basedOn w:val="Normal"/>
+    <w:next w:val="BodyText"/>
+    <w:uiPriority w:val="9"/>
+    <w:qFormat/>
+    <w:pPr>
+      <w:keepNext/>
+      <w:keepLines/>
+      <w:spacing w:after="0" w:before="480"/>
+      <w:outlineLvl w:val="0"/>
+    </w:pPr>
+    <w:rPr>
+      <w:rFonts w:asciiTheme="majorHAnsi" w:cstheme="majorBidi" w:eastAsiaTheme="majorEastAsia" w:hAnsiTheme="majorHAnsi"/>
+      <w:b/>
+      <w:bCs/>
+      <w:color w:val="E64C38"/>
+      <w:sz w:val="32"/>
+      <w:szCs w:val="32"/>
+    </w:rPr>
+  </w:style>
+  <w:style w:styleId="Heading2" w:type="paragraph">
+    <w:name w:val="heading 2"/>
+    <w:basedOn w:val="Normal"/>
+    <w:next w:val="BodyText"/>
+    <w:uiPriority w:val="9"/>
+    <w:unhideWhenUsed/>
+    <w:qFormat/>
+    <w:pPr>
+      <w:keepNext/>
+      <w:keepLines/>
+      <w:spacing w:after="0" w:before="200"/>
+      <w:outlineLvl w:val="1"/>
+    </w:pPr>
+    <w:rPr>
+      <w:rFonts w:asciiTheme="majorHAnsi" w:cstheme="majorBidi" w:eastAsiaTheme="majorEastAsia" w:hAnsiTheme="majorHAnsi"/>
+      <w:b/>
+      <w:bCs/>
+      <w:color w:val="E64C38"/>
+      <w:sz w:val="28"/>
+      <w:szCs w:val="28"/>
+    </w:rPr>
+  </w:style>
+  <w:style w:styleId="Heading3" w:type="paragraph">
+    <w:name w:val="heading 3"/>
+    <w:basedOn w:val="Normal"/>
+    <w:next w:val="BodyText"/>
+    <w:uiPriority w:val="9"/>
+    <w:unhideWhenUsed/>
+    <w:qFormat/>
+    <w:pPr>
+      <w:keepNext/>
+      <w:keepLines/>
+      <w:spacing w:after="0" w:before="200"/>
+      <w:outlineLvl w:val="2"/>
+    </w:pPr>
+    <w:rPr>
+      <w:rFonts w:asciiTheme="majorHAnsi" w:cstheme="majorBidi" w:eastAsiaTheme="majorEastAsia" w:hAnsiTheme="majorHAnsi"/>
+      <w:b/>
+      <w:bCs/>
+      <w:color w:val="E64C38"/>
+      <w:sz w:val="24"/>
+      <w:szCs w:val="24"/>
+    </w:rPr>
+  </w:style>
+  <w:style w:styleId="Heading4" w:type="paragraph">
+    <w:name w:val="heading 4"/>
+    <w:basedOn w:val="Normal"/>
+    <w:next w:val="BodyText"/>
+    <w:uiPriority w:val="9"/>
+    <w:unhideWhenUsed/>
+    <w:qFormat/>
+    <w:pPr>
+      <w:keepNext/>
+      <w:keepLines/>
+      <w:spacing w:after="0" w:before="200"/>
+      <w:outlineLvl w:val="3"/>
+    </w:pPr>
+    <w:rPr>
+      <w:rFonts w:asciiTheme="majorHAnsi" w:cstheme="majorBidi" w:eastAsiaTheme="majorEastAsia" w:hAnsiTheme="majorHAnsi"/>
+      <w:bCs/>
+      <w:i/>
+      <w:color w:val="E64C38"/>
+      <w:sz w:val="24"/>
+      <w:szCs w:val="24"/>
+    </w:rPr>
+  </w:style>
+  <w:style w:styleId="Heading5" w:type="paragraph">
+    <w:name w:val="heading 5"/>
+    <w:basedOn w:val="Normal"/>
+    <w:next w:val="BodyText"/>
+    <w:uiPriority w:val="9"/>
+    <w:unhideWhenUsed/>
+    <w:qFormat/>
+    <w:pPr>
+      <w:keepNext/>
+      <w:keepLines/>
+      <w:spacing w:after="0" w:before="200"/>
+      <w:outlineLvl w:val="4"/>
+    </w:pPr>
+    <w:rPr>
+      <w:rFonts w:asciiTheme="majorHAnsi" w:cstheme="majorBidi" w:eastAsiaTheme="majorEastAsia" w:hAnsiTheme="majorHAnsi"/>
+      <w:iCs/>
+      <w:color w:val="E64C38"/>
+      <w:sz w:val="24"/>
+      <w:szCs w:val="24"/>
+    </w:rPr>
+  </w:style>
+  <w:style w:styleId="Heading6" w:type="paragraph">
+    <w:name w:val="heading 6"/>
+    <w:basedOn w:val="Normal"/>
+    <w:next w:val="BodyText"/>
+    <w:uiPriority w:val="9"/>
+    <w:unhideWhenUsed/>
+    <w:qFormat/>
+    <w:pPr>
+      <w:keepNext/>
+      <w:keepLines/>
+      <w:spacing w:after="0" w:before="200"/>
+      <w:outlineLvl w:val="5"/>
+    </w:pPr>
+    <w:rPr>
+      <w:rFonts w:asciiTheme="majorHAnsi" w:cstheme="majorBidi" w:eastAsiaTheme="majorEastAsia" w:hAnsiTheme="majorHAnsi"/>
+      <w:color w:val="E64C38"/>
+      <w:sz w:val="24"/>
+      <w:szCs w:val="24"/>
+    </w:rPr>
+  </w:style>
+  <w:style w:styleId="Heading7" w:type="paragraph">
+    <w:name w:val="heading 7"/>
+    <w:basedOn w:val="Normal"/>
+    <w:next w:val="BodyText"/>
+    <w:uiPriority w:val="9"/>
+    <w:unhideWhenUsed/>
+    <w:qFormat/>
+    <w:pPr>
+      <w:keepNext/>
+      <w:keepLines/>
+      <w:spacing w:after="0" w:before="200"/>
+      <w:outlineLvl w:val="6"/>
+    </w:pPr>
+    <w:rPr>
+      <w:rFonts w:asciiTheme="majorHAnsi" w:cstheme="majorBidi" w:eastAsiaTheme="majorEastAsia" w:hAnsiTheme="majorHAnsi"/>
+      <w:color w:val="E64C38"/>
+      <w:sz w:val="24"/>
+      <w:szCs w:val="24"/>
+    </w:rPr>
+  </w:style>
+  <w:style w:styleId="Heading8" w:type="paragraph">
+    <w:name w:val="heading 8"/>
+    <w:basedOn w:val="Normal"/>
+    <w:next w:val="BodyText"/>
+    <w:uiPriority w:val="9"/>
+    <w:unhideWhenUsed/>
+    <w:qFormat/>
+    <w:pPr>
+      <w:keepNext/>
+      <w:keepLines/>
+      <w:spacing w:after="0" w:before="200"/>
+      <w:outlineLvl w:val="7"/>
+    </w:pPr>
+    <w:rPr>
+      <w:rFonts w:asciiTheme="majorHAnsi" w:cstheme="majorBidi" w:eastAsiaTheme="majorEastAsia" w:hAnsiTheme="majorHAnsi"/>
+      <w:color w:val="E64C38"/>
+      <w:sz w:val="24"/>
+      <w:szCs w:val="24"/>
+    </w:rPr>
+  </w:style>
+  <w:style w:styleId="Heading9" w:type="paragraph">
+    <w:name w:val="heading 9"/>
+    <w:basedOn w:val="Normal"/>
+    <w:next w:val="BodyText"/>
+    <w:uiPriority w:val="9"/>
+    <w:unhideWhenUsed/>
+    <w:qFormat/>
+    <w:pPr>
+      <w:keepNext/>
+      <w:keepLines/>
+      <w:spacing w:after="0" w:before="200"/>
+      <w:outlineLvl w:val="8"/>
+    </w:pPr>
+    <w:rPr>
+      <w:rFonts w:asciiTheme="majorHAnsi" w:cstheme="majorBidi" w:eastAsiaTheme="majorEastAsia" w:hAnsiTheme="majorHAnsi"/>
+      <w:color w:val="E64C38"/>
+      <w:sz w:val="24"/>
+      <w:szCs w:val="24"/>
+    </w:rPr>
+  </w:style>
+  <w:style w:default="1" w:styleId="DefaultParagraphFont" w:type="character">
+    <w:name w:val="Default Paragraph Font"/>
+    <w:uiPriority w:val="1"/>
+    <w:semiHidden/>
+    <w:unhideWhenUsed/>
+  </w:style>
+  <w:style w:default="1" w:styleId="TableNormal" w:type="table">
+    <w:name w:val="Normal Table"/>
+    <w:uiPriority w:val="99"/>
+    <w:semiHidden/>
+    <w:unhideWhenUsed/>
+    <w:tblPr>
+      <w:tblInd w:type="dxa" w:w="0"/>
+      <w:tblCellMar>
+        <w:top w:type="dxa" w:w="0"/>
+        <w:left w:type="dxa" w:w="108"/>
+        <w:bottom w:type="dxa" w:w="0"/>
+        <w:right w:type="dxa" w:w="108"/>
+      </w:tblCellMar>
+    </w:tblPr>
+  </w:style>
+  <w:style w:default="1" w:styleId="NoList" w:type="numbering">
+    <w:name w:val="No List"/>
+    <w:uiPriority w:val="99"/>
+    <w:semiHidden/>
+    <w:unhideWhenUsed/>
+  </w:style>
   <w:style w:styleId="BodyText" w:type="paragraph">
     <w:name w:val="Body Text"/>
     <w:basedOn w:val="Normal"/>
-    <w:link w:val="BodyTextChar"/>
     <w:qFormat/>
     <w:pPr>
       <w:spacing w:after="180" w:before="180"/>
@@ -17877,111 +19090,52 @@
     <w:name w:val="Title"/>
     <w:basedOn w:val="Normal"/>
     <w:next w:val="BodyText"/>
-    <w:link w:val="TitleChar"/>
-    <w:uiPriority w:val="10"/>
     <w:qFormat/>
-    <w:rsid w:val="00A10FD9"/>
     <w:pPr>
-      <w:spacing w:after="80" w:line="240" w:lineRule="auto"/>
-      <w:contextualSpacing/>
+      <w:keepNext/>
+      <w:keepLines/>
+      <w:spacing w:after="240" w:before="480"/>
       <w:jc w:val="center"/>
     </w:pPr>
     <w:rPr>
-      <w:rFonts w:asciiTheme="majorHAnsi" w:cstheme="majorBidi" w:eastAsiaTheme="majorEastAsia" w:hAnsiTheme="majorHAnsi"/>
-      <w:sz w:val="56"/>
-      <w:szCs w:val="56"/>
-    </w:rPr>
-  </w:style>
-  <w:style w:customStyle="1" w:styleId="TitleChar" w:type="character">
-    <w:name w:val="Title Char"/>
-    <w:basedOn w:val="DefaultParagraphFont"/>
-    <w:link w:val="Title"/>
-    <w:uiPriority w:val="10"/>
-    <w:rsid w:val="00A10FD9"/>
-    <w:rPr>
-      <w:rFonts w:asciiTheme="majorHAnsi" w:cstheme="majorBidi" w:eastAsiaTheme="majorEastAsia" w:hAnsiTheme="majorHAnsi"/>
-      <w:sz w:val="56"/>
-      <w:szCs w:val="56"/>
+      <w:b/>
+      <w:color w:val="E64C38"/>
+      <w:sz w:val="52"/>
+      <w:szCs w:val="52"/>
     </w:rPr>
   </w:style>
   <w:style w:styleId="Subtitle" w:type="paragraph">
     <w:name w:val="Subtitle"/>
     <w:basedOn w:val="Title"/>
     <w:next w:val="BodyText"/>
-    <w:link w:val="SubtitleChar"/>
-    <w:uiPriority w:val="11"/>
     <w:qFormat/>
-    <w:rsid w:val="00A10FD9"/>
     <w:pPr>
-      <w:numPr>
-        <w:ilvl w:val="1"/>
-      </w:numPr>
+      <w:spacing w:before="240"/>
     </w:pPr>
     <w:rPr>
-      <w:rFonts w:cstheme="majorBidi" w:eastAsiaTheme="majorEastAsia"/>
-      <w:spacing w:val="15"/>
-      <w:sz w:val="28"/>
-      <w:szCs w:val="28"/>
-    </w:rPr>
-  </w:style>
-  <w:style w:customStyle="1" w:styleId="SubtitleChar" w:type="character">
-    <w:name w:val="Subtitle Char"/>
-    <w:basedOn w:val="DefaultParagraphFont"/>
-    <w:link w:val="Subtitle"/>
-    <w:uiPriority w:val="11"/>
-    <w:rsid w:val="00A10FD9"/>
-    <w:rPr>
-      <w:rFonts w:cstheme="majorBidi" w:eastAsiaTheme="majorEastAsia"/>
-      <w:color w:themeColor="text1" w:themeTint="A6" w:val="595959"/>
-      <w:spacing w:val="15"/>
-      <w:sz w:val="28"/>
-      <w:szCs w:val="28"/>
+      <w:sz w:val="30"/>
+      <w:szCs w:val="30"/>
     </w:rPr>
   </w:style>
   <w:style w:customStyle="1" w:styleId="Author" w:type="paragraph">
     <w:name w:val="Author"/>
-    <w:basedOn w:val="Title"/>
     <w:next w:val="BodyText"/>
     <w:qFormat/>
     <w:pPr>
       <w:keepNext/>
       <w:keepLines/>
+      <w:jc w:val="center"/>
     </w:pPr>
-    <w:rPr>
-      <w:sz w:val="24"/>
-      <w:szCs w:val="24"/>
-    </w:rPr>
   </w:style>
   <w:style w:styleId="Date" w:type="paragraph">
     <w:name w:val="Date"/>
-    <w:basedOn w:val="Title"/>
     <w:next w:val="BodyText"/>
     <w:qFormat/>
     <w:pPr>
       <w:keepNext/>
       <w:keepLines/>
-    </w:pPr>
-    <w:rPr>
-      <w:sz w:val="24"/>
-      <w:szCs w:val="24"/>
-    </w:rPr>
-  </w:style>
-  <w:style w:customStyle="1" w:styleId="AbstractTitle" w:type="paragraph">
-    <w:name w:val="Abstract Title"/>
-    <w:basedOn w:val="Normal"/>
-    <w:next w:val="Abstract"/>
-    <w:qFormat/>
-    <w:pPr>
-      <w:keepNext/>
-      <w:keepLines/>
-      <w:spacing w:after="0" w:before="300"/>
       <w:jc w:val="center"/>
     </w:pPr>
-    <w:rPr>
-      <w:b/>
-      <w:sz w:val="20"/>
-      <w:szCs w:val="20"/>
-    </w:rPr>
   </w:style>
   <w:style w:customStyle="1" w:styleId="Abstract" w:type="paragraph">
     <w:name w:val="Abstract"/>
@@ -17991,7 +19145,7 @@
     <w:pPr>
       <w:keepNext/>
       <w:keepLines/>
-      <w:spacing w:after="300" w:before="100"/>
+      <w:spacing w:after="300" w:before="300"/>
     </w:pPr>
     <w:rPr>
       <w:sz w:val="20"/>
@@ -18001,328 +19155,7 @@
   <w:style w:styleId="Bibliography" w:type="paragraph">
     <w:name w:val="Bibliography"/>
     <w:basedOn w:val="Normal"/>
-    <w:next w:val="Bibliography"/>
     <w:qFormat/>
-    <w:pPr/>
-    <w:rPr/>
-  </w:style>
-  <w:style w:styleId="Heading1" w:type="paragraph">
-    <w:name w:val="heading 1"/>
-    <w:basedOn w:val="Normal"/>
-    <w:next w:val="BodyText"/>
-    <w:link w:val="Heading1Char"/>
-    <w:uiPriority w:val="9"/>
-    <w:qFormat/>
-    <w:rsid w:val="00A10FD9"/>
-    <w:pPr>
-      <w:keepNext/>
-      <w:keepLines/>
-      <w:spacing w:after="80" w:before="360"/>
-      <w:outlineLvl w:val="0"/>
-    </w:pPr>
-    <w:rPr>
-      <w:rFonts w:asciiTheme="majorHAnsi" w:cstheme="majorBidi" w:eastAsiaTheme="majorEastAsia" w:hAnsiTheme="majorHAnsi"/>
-      <w:color w:themeColor="accent1" w:themeShade="BF" w:val="0F4761"/>
-      <w:sz w:val="40"/>
-      <w:szCs w:val="40"/>
-    </w:rPr>
-  </w:style>
-  <w:style w:styleId="Heading2" w:type="paragraph">
-    <w:name w:val="heading 2"/>
-    <w:basedOn w:val="Normal"/>
-    <w:next w:val="BodyText"/>
-    <w:link w:val="Heading2Char"/>
-    <w:uiPriority w:val="9"/>
-    <w:semiHidden/>
-    <w:unhideWhenUsed/>
-    <w:qFormat/>
-    <w:rsid w:val="00A10FD9"/>
-    <w:pPr>
-      <w:keepNext/>
-      <w:keepLines/>
-      <w:spacing w:after="80" w:before="160"/>
-      <w:outlineLvl w:val="1"/>
-    </w:pPr>
-    <w:rPr>
-      <w:rFonts w:asciiTheme="majorHAnsi" w:cstheme="majorBidi" w:eastAsiaTheme="majorEastAsia" w:hAnsiTheme="majorHAnsi"/>
-      <w:color w:themeColor="accent1" w:themeShade="BF" w:val="0F4761"/>
-      <w:sz w:val="32"/>
-      <w:szCs w:val="32"/>
-    </w:rPr>
-  </w:style>
-  <w:style w:styleId="Heading3" w:type="paragraph">
-    <w:name w:val="heading 3"/>
-    <w:basedOn w:val="Normal"/>
-    <w:next w:val="BodyText"/>
-    <w:link w:val="Heading3Char"/>
-    <w:uiPriority w:val="9"/>
-    <w:semiHidden/>
-    <w:unhideWhenUsed/>
-    <w:qFormat/>
-    <w:rsid w:val="00A10FD9"/>
-    <w:pPr>
-      <w:keepNext/>
-      <w:keepLines/>
-      <w:spacing w:after="80" w:before="160"/>
-      <w:outlineLvl w:val="2"/>
-    </w:pPr>
-    <w:rPr>
-      <w:rFonts w:cstheme="majorBidi" w:eastAsiaTheme="majorEastAsia"/>
-      <w:color w:themeColor="accent1" w:themeShade="BF" w:val="0F4761"/>
-      <w:sz w:val="28"/>
-      <w:szCs w:val="28"/>
-    </w:rPr>
-  </w:style>
-  <w:style w:styleId="Heading4" w:type="paragraph">
-    <w:name w:val="heading 4"/>
-    <w:basedOn w:val="Normal"/>
-    <w:next w:val="BodyText"/>
-    <w:link w:val="Heading4Char"/>
-    <w:uiPriority w:val="9"/>
-    <w:semiHidden/>
-    <w:unhideWhenUsed/>
-    <w:qFormat/>
-    <w:rsid w:val="00A10FD9"/>
-    <w:pPr>
-      <w:keepNext/>
-      <w:keepLines/>
-      <w:spacing w:after="40" w:before="80"/>
-      <w:outlineLvl w:val="3"/>
-    </w:pPr>
-    <w:rPr>
-      <w:rFonts w:cstheme="majorBidi" w:eastAsiaTheme="majorEastAsia"/>
-      <w:i/>
-      <w:iCs/>
-      <w:color w:themeColor="accent1" w:themeShade="BF" w:val="0F4761"/>
-    </w:rPr>
-  </w:style>
-  <w:style w:styleId="Heading5" w:type="paragraph">
-    <w:name w:val="heading 5"/>
-    <w:basedOn w:val="Normal"/>
-    <w:next w:val="BodyText"/>
-    <w:link w:val="Heading5Char"/>
-    <w:uiPriority w:val="9"/>
-    <w:semiHidden/>
-    <w:unhideWhenUsed/>
-    <w:qFormat/>
-    <w:rsid w:val="00A10FD9"/>
-    <w:pPr>
-      <w:keepNext/>
-      <w:keepLines/>
-      <w:spacing w:after="40" w:before="80"/>
-      <w:outlineLvl w:val="4"/>
-    </w:pPr>
-    <w:rPr>
-      <w:rFonts w:cstheme="majorBidi" w:eastAsiaTheme="majorEastAsia"/>
-      <w:color w:themeColor="accent1" w:themeShade="BF" w:val="0F4761"/>
-    </w:rPr>
-  </w:style>
-  <w:style w:styleId="Heading6" w:type="paragraph">
-    <w:name w:val="heading 6"/>
-    <w:basedOn w:val="Normal"/>
-    <w:next w:val="BodyText"/>
-    <w:link w:val="Heading6Char"/>
-    <w:uiPriority w:val="9"/>
-    <w:semiHidden/>
-    <w:unhideWhenUsed/>
-    <w:qFormat/>
-    <w:rsid w:val="00A10FD9"/>
-    <w:pPr>
-      <w:keepNext/>
-      <w:keepLines/>
-      <w:spacing w:after="0" w:before="40"/>
-      <w:outlineLvl w:val="5"/>
-    </w:pPr>
-    <w:rPr>
-      <w:rFonts w:cstheme="majorBidi" w:eastAsiaTheme="majorEastAsia"/>
-      <w:i/>
-      <w:iCs/>
-      <w:color w:themeColor="text1" w:themeTint="A6" w:val="595959"/>
-    </w:rPr>
-  </w:style>
-  <w:style w:styleId="Heading7" w:type="paragraph">
-    <w:name w:val="heading 7"/>
-    <w:basedOn w:val="Normal"/>
-    <w:next w:val="BodyText"/>
-    <w:link w:val="Heading7Char"/>
-    <w:uiPriority w:val="9"/>
-    <w:semiHidden/>
-    <w:unhideWhenUsed/>
-    <w:qFormat/>
-    <w:rsid w:val="00A10FD9"/>
-    <w:pPr>
-      <w:keepNext/>
-      <w:keepLines/>
-      <w:spacing w:after="0" w:before="40"/>
-      <w:outlineLvl w:val="6"/>
-    </w:pPr>
-    <w:rPr>
-      <w:rFonts w:cstheme="majorBidi" w:eastAsiaTheme="majorEastAsia"/>
-      <w:color w:themeColor="text1" w:themeTint="A6" w:val="595959"/>
-    </w:rPr>
-  </w:style>
-  <w:style w:styleId="Heading8" w:type="paragraph">
-    <w:name w:val="heading 8"/>
-    <w:basedOn w:val="Normal"/>
-    <w:next w:val="BodyText"/>
-    <w:link w:val="Heading8Char"/>
-    <w:uiPriority w:val="9"/>
-    <w:semiHidden/>
-    <w:unhideWhenUsed/>
-    <w:qFormat/>
-    <w:rsid w:val="00A10FD9"/>
-    <w:pPr>
-      <w:keepNext/>
-      <w:keepLines/>
-      <w:spacing w:after="0"/>
-      <w:outlineLvl w:val="7"/>
-    </w:pPr>
-    <w:rPr>
-      <w:rFonts w:cstheme="majorBidi" w:eastAsiaTheme="majorEastAsia"/>
-      <w:i/>
-      <w:iCs/>
-      <w:color w:themeColor="text1" w:themeTint="D8" w:val="272727"/>
-    </w:rPr>
-  </w:style>
-  <w:style w:styleId="Heading9" w:type="paragraph">
-    <w:name w:val="heading 9"/>
-    <w:basedOn w:val="Normal"/>
-    <w:next w:val="BodyText"/>
-    <w:link w:val="Heading9Char"/>
-    <w:uiPriority w:val="9"/>
-    <w:semiHidden/>
-    <w:unhideWhenUsed/>
-    <w:qFormat/>
-    <w:rsid w:val="00A10FD9"/>
-    <w:pPr>
-      <w:keepNext/>
-      <w:keepLines/>
-      <w:spacing w:after="0"/>
-      <w:outlineLvl w:val="8"/>
-    </w:pPr>
-    <w:rPr>
-      <w:rFonts w:cstheme="majorBidi" w:eastAsiaTheme="majorEastAsia"/>
-      <w:color w:themeColor="text1" w:themeTint="D8" w:val="272727"/>
-    </w:rPr>
-  </w:style>
-  <w:style w:customStyle="1" w:styleId="Heading1Char" w:type="character">
-    <w:name w:val="Heading 1 Char"/>
-    <w:basedOn w:val="DefaultParagraphFont"/>
-    <w:link w:val="Heading1"/>
-    <w:uiPriority w:val="9"/>
-    <w:rsid w:val="00A10FD9"/>
-    <w:rPr>
-      <w:rFonts w:asciiTheme="majorHAnsi" w:cstheme="majorBidi" w:eastAsiaTheme="majorEastAsia" w:hAnsiTheme="majorHAnsi"/>
-      <w:color w:themeColor="accent1" w:themeShade="BF" w:val="0F4761"/>
-      <w:sz w:val="40"/>
-      <w:szCs w:val="40"/>
-    </w:rPr>
-  </w:style>
-  <w:style w:customStyle="1" w:styleId="Heading2Char" w:type="character">
-    <w:name w:val="Heading 2 Char"/>
-    <w:basedOn w:val="DefaultParagraphFont"/>
-    <w:link w:val="Heading2"/>
-    <w:uiPriority w:val="9"/>
-    <w:semiHidden/>
-    <w:rsid w:val="00A10FD9"/>
-    <w:rPr>
-      <w:rFonts w:asciiTheme="majorHAnsi" w:cstheme="majorBidi" w:eastAsiaTheme="majorEastAsia" w:hAnsiTheme="majorHAnsi"/>
-      <w:color w:themeColor="accent1" w:themeShade="BF" w:val="0F4761"/>
-      <w:sz w:val="32"/>
-      <w:szCs w:val="32"/>
-    </w:rPr>
-  </w:style>
-  <w:style w:customStyle="1" w:styleId="Heading3Char" w:type="character">
-    <w:name w:val="Heading 3 Char"/>
-    <w:basedOn w:val="DefaultParagraphFont"/>
-    <w:link w:val="Heading3"/>
-    <w:uiPriority w:val="9"/>
-    <w:semiHidden/>
-    <w:rsid w:val="00A10FD9"/>
-    <w:rPr>
-      <w:rFonts w:cstheme="majorBidi" w:eastAsiaTheme="majorEastAsia"/>
-      <w:color w:themeColor="accent1" w:themeShade="BF" w:val="0F4761"/>
-      <w:sz w:val="28"/>
-      <w:szCs w:val="28"/>
-    </w:rPr>
-  </w:style>
-  <w:style w:customStyle="1" w:styleId="Heading4Char" w:type="character">
-    <w:name w:val="Heading 4 Char"/>
-    <w:basedOn w:val="DefaultParagraphFont"/>
-    <w:link w:val="Heading4"/>
-    <w:uiPriority w:val="9"/>
-    <w:semiHidden/>
-    <w:rsid w:val="00A10FD9"/>
-    <w:rPr>
-      <w:rFonts w:cstheme="majorBidi" w:eastAsiaTheme="majorEastAsia"/>
-      <w:i/>
-      <w:iCs/>
-      <w:color w:themeColor="accent1" w:themeShade="BF" w:val="0F4761"/>
-    </w:rPr>
-  </w:style>
-  <w:style w:customStyle="1" w:styleId="Heading5Char" w:type="character">
-    <w:name w:val="Heading 5 Char"/>
-    <w:basedOn w:val="DefaultParagraphFont"/>
-    <w:link w:val="Heading5"/>
-    <w:uiPriority w:val="9"/>
-    <w:semiHidden/>
-    <w:rsid w:val="00A10FD9"/>
-    <w:rPr>
-      <w:rFonts w:cstheme="majorBidi" w:eastAsiaTheme="majorEastAsia"/>
-      <w:color w:themeColor="accent1" w:themeShade="BF" w:val="0F4761"/>
-    </w:rPr>
-  </w:style>
-  <w:style w:customStyle="1" w:styleId="Heading6Char" w:type="character">
-    <w:name w:val="Heading 6 Char"/>
-    <w:basedOn w:val="DefaultParagraphFont"/>
-    <w:link w:val="Heading6"/>
-    <w:uiPriority w:val="9"/>
-    <w:semiHidden/>
-    <w:rsid w:val="00A10FD9"/>
-    <w:rPr>
-      <w:rFonts w:cstheme="majorBidi" w:eastAsiaTheme="majorEastAsia"/>
-      <w:i/>
-      <w:iCs/>
-      <w:color w:themeColor="text1" w:themeTint="A6" w:val="595959"/>
-    </w:rPr>
-  </w:style>
-  <w:style w:customStyle="1" w:styleId="Heading7Char" w:type="character">
-    <w:name w:val="Heading 7 Char"/>
-    <w:basedOn w:val="DefaultParagraphFont"/>
-    <w:link w:val="Heading7"/>
-    <w:uiPriority w:val="9"/>
-    <w:semiHidden/>
-    <w:rsid w:val="00A10FD9"/>
-    <w:rPr>
-      <w:rFonts w:cstheme="majorBidi" w:eastAsiaTheme="majorEastAsia"/>
-      <w:color w:themeColor="text1" w:themeTint="A6" w:val="595959"/>
-    </w:rPr>
-  </w:style>
-  <w:style w:customStyle="1" w:styleId="Heading8Char" w:type="character">
-    <w:name w:val="Heading 8 Char"/>
-    <w:basedOn w:val="DefaultParagraphFont"/>
-    <w:link w:val="Heading8"/>
-    <w:uiPriority w:val="9"/>
-    <w:semiHidden/>
-    <w:rsid w:val="00A10FD9"/>
-    <w:rPr>
-      <w:rFonts w:cstheme="majorBidi" w:eastAsiaTheme="majorEastAsia"/>
-      <w:i/>
-      <w:iCs/>
-      <w:color w:themeColor="text1" w:themeTint="D8" w:val="272727"/>
-    </w:rPr>
-  </w:style>
-  <w:style w:customStyle="1" w:styleId="Heading9Char" w:type="character">
-    <w:name w:val="Heading 9 Char"/>
-    <w:basedOn w:val="DefaultParagraphFont"/>
-    <w:link w:val="Heading9"/>
-    <w:uiPriority w:val="9"/>
-    <w:semiHidden/>
-    <w:rsid w:val="00A10FD9"/>
-    <w:rPr>
-      <w:rFonts w:cstheme="majorBidi" w:eastAsiaTheme="majorEastAsia"/>
-      <w:color w:themeColor="text1" w:themeTint="D8" w:val="272727"/>
-    </w:rPr>
   </w:style>
   <w:style w:styleId="BlockText" w:type="paragraph">
     <w:name w:val="Block Text"/>
@@ -18333,37 +19166,18 @@
     <w:qFormat/>
     <w:pPr>
       <w:spacing w:after="100" w:before="100"/>
-      <w:ind w:firstLine="0" w:left="480" w:right="480"/>
+      <w:ind w:left="480" w:right="480"/>
     </w:pPr>
   </w:style>
   <w:style w:styleId="FootnoteText" w:type="paragraph">
-    <w:name w:val="Footnote Text"/>
+    <w:name w:val="footnote text"/>
     <w:basedOn w:val="Normal"/>
-    <w:next w:val="FootnoteText"/>
     <w:uiPriority w:val="9"/>
     <w:unhideWhenUsed/>
     <w:qFormat/>
   </w:style>
-  <w:style w:styleId="FootnoteBlockText" w:type="paragraph">
-    <w:name w:val="Footnote Block Text"/>
-    <w:basedOn w:val="FootnoteText"/>
-    <w:next w:val="FootnoteText"/>
-    <w:uiPriority w:val="9"/>
-    <w:unhideWhenUsed/>
-    <w:qFormat/>
-    <w:pPr>
-      <w:spacing w:after="100" w:before="100"/>
-      <w:ind w:firstLine="0" w:left="480" w:right="480"/>
-    </w:pPr>
-  </w:style>
-  <w:style w:default="1" w:styleId="DefaultParagraphFont" w:type="character">
-    <w:name w:val="Default Paragraph Font"/>
-    <w:semiHidden/>
-    <w:unhideWhenUsed/>
-  </w:style>
-  <w:style w:default="1" w:styleId="Table" w:type="table">
+  <w:style w:customStyle="1" w:styleId="Table" w:type="table">
     <w:name w:val="Table"/>
-    <w:basedOn w:val="TableNormal"/>
     <w:semiHidden/>
     <w:unhideWhenUsed/>
     <w:qFormat/>
@@ -18376,14 +19190,6 @@
         <w:right w:type="dxa" w:w="108"/>
       </w:tblCellMar>
     </w:tblPr>
-    <w:tblStylePr w:type="firstRow">
-      <w:tcPr>
-        <w:tcBorders>
-          <w:bottom w:val="single"/>
-        </w:tcBorders>
-        <w:vAlign w:val="bottom"/>
-      </w:tcPr>
-    </w:tblStylePr>
   </w:style>
   <w:style w:customStyle="1" w:styleId="DefinitionTerm" w:type="paragraph">
     <w:name w:val="Definition Term"/>
@@ -18403,11 +19209,11 @@
     <w:basedOn w:val="Normal"/>
   </w:style>
   <w:style w:styleId="Caption" w:type="paragraph">
-    <w:name w:val="Caption"/>
+    <w:name w:val="caption"/>
     <w:basedOn w:val="Normal"/>
-    <w:link w:val="BodyTextChar"/>
+    <w:link w:val="CaptionChar"/>
     <w:pPr>
-      <w:spacing w:after="120" w:before="0"/>
+      <w:spacing w:after="120"/>
     </w:pPr>
     <w:rPr>
       <w:i/>
@@ -18435,35 +19241,33 @@
       <w:keepNext/>
     </w:pPr>
   </w:style>
-  <w:style w:customStyle="1" w:styleId="BodyTextChar" w:type="character">
-    <w:name w:val="Body Text Char"/>
+  <w:style w:customStyle="1" w:styleId="CaptionChar" w:type="character">
+    <w:name w:val="Caption Char"/>
     <w:basedOn w:val="DefaultParagraphFont"/>
-    <w:link w:val="BodyText"/>
+    <w:link w:val="Caption"/>
   </w:style>
   <w:style w:customStyle="1" w:styleId="VerbatimChar" w:type="character">
     <w:name w:val="Verbatim Char"/>
-    <w:basedOn w:val="BodyTextChar"/>
+    <w:basedOn w:val="CaptionChar"/>
+    <w:link w:val="SourceCode"/>
     <w:rPr>
       <w:rFonts w:ascii="Consolas" w:hAnsi="Consolas"/>
       <w:sz w:val="22"/>
     </w:rPr>
   </w:style>
-  <w:style w:customStyle="1" w:styleId="SectionNumber" w:type="character">
-    <w:name w:val="Section Number"/>
-    <w:basedOn w:val="BodyTextChar"/>
-  </w:style>
   <w:style w:styleId="FootnoteReference" w:type="character">
-    <w:name w:val="Footnote Reference"/>
-    <w:basedOn w:val="BodyTextChar"/>
+    <w:name w:val="footnote reference"/>
+    <w:basedOn w:val="CaptionChar"/>
     <w:rPr>
       <w:vertAlign w:val="superscript"/>
     </w:rPr>
   </w:style>
   <w:style w:styleId="Hyperlink" w:type="character">
     <w:name w:val="Hyperlink"/>
-    <w:basedOn w:val="BodyTextChar"/>
+    <w:basedOn w:val="CaptionChar"/>
+    <w:uiPriority w:val="99"/>
     <w:rPr>
-      <w:color w:themeColor="accent1" w:val="4F81BD"/>
+      <w:color w:val="E64C38"/>
     </w:rPr>
   </w:style>
   <w:style w:styleId="TOCHeading" w:type="paragraph">
@@ -18478,245 +19282,328 @@
       <w:outlineLvl w:val="9"/>
     </w:pPr>
     <w:rPr>
-      <w:rFonts w:asciiTheme="majorHAnsi" w:cstheme="majorBidi" w:eastAsiaTheme="majorEastAsia" w:hAnsiTheme="majorHAnsi"/>
       <w:b w:val="0"/>
       <w:bCs w:val="0"/>
-      <w:color w:themeColor="accent1" w:themeShade="BF" w:val="365F91"/>
     </w:rPr>
   </w:style>
-  <w:style w:type="paragraph" w:customStyle="1" w:styleId="SourceCode">
+  <w:style w:customStyle="1" w:styleId="SourceCode" w:type="paragraph">
     <w:name w:val="Source Code"/>
     <w:basedOn w:val="Normal"/>
     <w:link w:val="VerbatimChar"/>
     <w:pPr>
-      <w:wordWrap w:val="off"/>
+      <w:wordWrap w:val="0"/>
     </w:pPr>
   </w:style>
-  <w:style w:type="character" w:customStyle="1" w:styleId="KeywordTok">
+  <w:style w:customStyle="1" w:styleId="KeywordTok" w:type="character">
     <w:name w:val="KeywordTok"/>
     <w:basedOn w:val="VerbatimChar"/>
     <w:rPr>
+      <w:rFonts w:ascii="Consolas" w:hAnsi="Consolas"/>
       <w:b/>
       <w:color w:val="007020"/>
+      <w:sz w:val="22"/>
     </w:rPr>
   </w:style>
-  <w:style w:type="character" w:customStyle="1" w:styleId="DataTypeTok">
+  <w:style w:customStyle="1" w:styleId="DataTypeTok" w:type="character">
     <w:name w:val="DataTypeTok"/>
     <w:basedOn w:val="VerbatimChar"/>
     <w:rPr>
+      <w:rFonts w:ascii="Consolas" w:hAnsi="Consolas"/>
       <w:color w:val="902000"/>
+      <w:sz w:val="22"/>
     </w:rPr>
   </w:style>
-  <w:style w:type="character" w:customStyle="1" w:styleId="DecValTok">
+  <w:style w:customStyle="1" w:styleId="DecValTok" w:type="character">
     <w:name w:val="DecValTok"/>
     <w:basedOn w:val="VerbatimChar"/>
     <w:rPr>
-      <w:color w:val="40a070"/>
+      <w:rFonts w:ascii="Consolas" w:hAnsi="Consolas"/>
+      <w:color w:val="40A070"/>
+      <w:sz w:val="22"/>
     </w:rPr>
   </w:style>
-  <w:style w:type="character" w:customStyle="1" w:styleId="BaseNTok">
+  <w:style w:customStyle="1" w:styleId="BaseNTok" w:type="character">
     <w:name w:val="BaseNTok"/>
     <w:basedOn w:val="VerbatimChar"/>
     <w:rPr>
-      <w:color w:val="40a070"/>
+      <w:rFonts w:ascii="Consolas" w:hAnsi="Consolas"/>
+      <w:color w:val="40A070"/>
+      <w:sz w:val="22"/>
     </w:rPr>
   </w:style>
-  <w:style w:type="character" w:customStyle="1" w:styleId="FloatTok">
+  <w:style w:customStyle="1" w:styleId="FloatTok" w:type="character">
     <w:name w:val="FloatTok"/>
     <w:basedOn w:val="VerbatimChar"/>
     <w:rPr>
-      <w:color w:val="40a070"/>
+      <w:rFonts w:ascii="Consolas" w:hAnsi="Consolas"/>
+      <w:color w:val="40A070"/>
+      <w:sz w:val="22"/>
     </w:rPr>
   </w:style>
-  <w:style w:type="character" w:customStyle="1" w:styleId="ConstantTok">
+  <w:style w:customStyle="1" w:styleId="ConstantTok" w:type="character">
     <w:name w:val="ConstantTok"/>
     <w:basedOn w:val="VerbatimChar"/>
     <w:rPr>
+      <w:rFonts w:ascii="Consolas" w:hAnsi="Consolas"/>
       <w:color w:val="880000"/>
+      <w:sz w:val="22"/>
     </w:rPr>
   </w:style>
-  <w:style w:type="character" w:customStyle="1" w:styleId="CharTok">
+  <w:style w:customStyle="1" w:styleId="CharTok" w:type="character">
     <w:name w:val="CharTok"/>
     <w:basedOn w:val="VerbatimChar"/>
     <w:rPr>
-      <w:color w:val="4070a0"/>
+      <w:rFonts w:ascii="Consolas" w:hAnsi="Consolas"/>
+      <w:color w:val="4070A0"/>
+      <w:sz w:val="22"/>
     </w:rPr>
   </w:style>
-  <w:style w:type="character" w:customStyle="1" w:styleId="SpecialCharTok">
+  <w:style w:customStyle="1" w:styleId="SpecialCharTok" w:type="character">
     <w:name w:val="SpecialCharTok"/>
     <w:basedOn w:val="VerbatimChar"/>
     <w:rPr>
-      <w:color w:val="4070a0"/>
+      <w:rFonts w:ascii="Consolas" w:hAnsi="Consolas"/>
+      <w:color w:val="4070A0"/>
+      <w:sz w:val="22"/>
     </w:rPr>
   </w:style>
-  <w:style w:type="character" w:customStyle="1" w:styleId="StringTok">
+  <w:style w:customStyle="1" w:styleId="StringTok" w:type="character">
     <w:name w:val="StringTok"/>
     <w:basedOn w:val="VerbatimChar"/>
     <w:rPr>
-      <w:color w:val="4070a0"/>
+      <w:rFonts w:ascii="Consolas" w:hAnsi="Consolas"/>
+      <w:color w:val="4070A0"/>
+      <w:sz w:val="22"/>
     </w:rPr>
   </w:style>
-  <w:style w:type="character" w:customStyle="1" w:styleId="VerbatimStringTok">
+  <w:style w:customStyle="1" w:styleId="VerbatimStringTok" w:type="character">
     <w:name w:val="VerbatimStringTok"/>
     <w:basedOn w:val="VerbatimChar"/>
     <w:rPr>
-      <w:color w:val="4070a0"/>
+      <w:rFonts w:ascii="Consolas" w:hAnsi="Consolas"/>
+      <w:color w:val="4070A0"/>
+      <w:sz w:val="22"/>
     </w:rPr>
   </w:style>
-  <w:style w:type="character" w:customStyle="1" w:styleId="SpecialStringTok">
+  <w:style w:customStyle="1" w:styleId="SpecialStringTok" w:type="character">
     <w:name w:val="SpecialStringTok"/>
     <w:basedOn w:val="VerbatimChar"/>
     <w:rPr>
-      <w:color w:val="bb6688"/>
+      <w:rFonts w:ascii="Consolas" w:hAnsi="Consolas"/>
+      <w:color w:val="BB6688"/>
+      <w:sz w:val="22"/>
     </w:rPr>
   </w:style>
-  <w:style w:type="character" w:customStyle="1" w:styleId="ImportTok">
+  <w:style w:customStyle="1" w:styleId="ImportTok" w:type="character">
     <w:name w:val="ImportTok"/>
     <w:basedOn w:val="VerbatimChar"/>
     <w:rPr>
-      <w:b/>
-      <w:color w:val="008000"/>
+      <w:rFonts w:ascii="Consolas" w:hAnsi="Consolas"/>
+      <w:sz w:val="22"/>
     </w:rPr>
   </w:style>
-  <w:style w:type="character" w:customStyle="1" w:styleId="CommentTok">
+  <w:style w:customStyle="1" w:styleId="CommentTok" w:type="character">
     <w:name w:val="CommentTok"/>
     <w:basedOn w:val="VerbatimChar"/>
     <w:rPr>
+      <w:rFonts w:ascii="Consolas" w:hAnsi="Consolas"/>
       <w:i/>
-      <w:color w:val="60a0b0"/>
+      <w:color w:val="60A0B0"/>
+      <w:sz w:val="22"/>
     </w:rPr>
   </w:style>
-  <w:style w:type="character" w:customStyle="1" w:styleId="DocumentationTok">
+  <w:style w:customStyle="1" w:styleId="DocumentationTok" w:type="character">
     <w:name w:val="DocumentationTok"/>
     <w:basedOn w:val="VerbatimChar"/>
     <w:rPr>
+      <w:rFonts w:ascii="Consolas" w:hAnsi="Consolas"/>
       <w:i/>
-      <w:color w:val="ba2121"/>
+      <w:color w:val="BA2121"/>
+      <w:sz w:val="22"/>
     </w:rPr>
   </w:style>
-  <w:style w:type="character" w:customStyle="1" w:styleId="AnnotationTok">
+  <w:style w:customStyle="1" w:styleId="AnnotationTok" w:type="character">
     <w:name w:val="AnnotationTok"/>
     <w:basedOn w:val="VerbatimChar"/>
     <w:rPr>
+      <w:rFonts w:ascii="Consolas" w:hAnsi="Consolas"/>
       <w:b/>
       <w:i/>
-      <w:color w:val="60a0b0"/>
+      <w:color w:val="60A0B0"/>
+      <w:sz w:val="22"/>
     </w:rPr>
   </w:style>
-  <w:style w:type="character" w:customStyle="1" w:styleId="CommentVarTok">
+  <w:style w:customStyle="1" w:styleId="CommentVarTok" w:type="character">
     <w:name w:val="CommentVarTok"/>
     <w:basedOn w:val="VerbatimChar"/>
     <w:rPr>
+      <w:rFonts w:ascii="Consolas" w:hAnsi="Consolas"/>
       <w:b/>
       <w:i/>
-      <w:color w:val="60a0b0"/>
+      <w:color w:val="60A0B0"/>
+      <w:sz w:val="22"/>
     </w:rPr>
   </w:style>
-  <w:style w:type="character" w:customStyle="1" w:styleId="OtherTok">
+  <w:style w:customStyle="1" w:styleId="OtherTok" w:type="character">
     <w:name w:val="OtherTok"/>
     <w:basedOn w:val="VerbatimChar"/>
     <w:rPr>
+      <w:rFonts w:ascii="Consolas" w:hAnsi="Consolas"/>
       <w:color w:val="007020"/>
+      <w:sz w:val="22"/>
     </w:rPr>
   </w:style>
-  <w:style w:type="character" w:customStyle="1" w:styleId="FunctionTok">
+  <w:style w:customStyle="1" w:styleId="FunctionTok" w:type="character">
     <w:name w:val="FunctionTok"/>
     <w:basedOn w:val="VerbatimChar"/>
     <w:rPr>
-      <w:color w:val="06287e"/>
+      <w:rFonts w:ascii="Consolas" w:hAnsi="Consolas"/>
+      <w:color w:val="06287E"/>
+      <w:sz w:val="22"/>
     </w:rPr>
   </w:style>
-  <w:style w:type="character" w:customStyle="1" w:styleId="VariableTok">
+  <w:style w:customStyle="1" w:styleId="VariableTok" w:type="character">
     <w:name w:val="VariableTok"/>
     <w:basedOn w:val="VerbatimChar"/>
     <w:rPr>
-      <w:color w:val="19177c"/>
+      <w:rFonts w:ascii="Consolas" w:hAnsi="Consolas"/>
+      <w:color w:val="19177C"/>
+      <w:sz w:val="22"/>
     </w:rPr>
   </w:style>
-  <w:style w:type="character" w:customStyle="1" w:styleId="ControlFlowTok">
+  <w:style w:customStyle="1" w:styleId="ControlFlowTok" w:type="character">
     <w:name w:val="ControlFlowTok"/>
     <w:basedOn w:val="VerbatimChar"/>
     <w:rPr>
+      <w:rFonts w:ascii="Consolas" w:hAnsi="Consolas"/>
       <w:b/>
       <w:color w:val="007020"/>
+      <w:sz w:val="22"/>
     </w:rPr>
   </w:style>
-  <w:style w:type="character" w:customStyle="1" w:styleId="OperatorTok">
+  <w:style w:customStyle="1" w:styleId="OperatorTok" w:type="character">
     <w:name w:val="OperatorTok"/>
     <w:basedOn w:val="VerbatimChar"/>
     <w:rPr>
+      <w:rFonts w:ascii="Consolas" w:hAnsi="Consolas"/>
       <w:color w:val="666666"/>
+      <w:sz w:val="22"/>
     </w:rPr>
   </w:style>
-  <w:style w:type="character" w:customStyle="1" w:styleId="BuiltInTok">
+  <w:style w:customStyle="1" w:styleId="BuiltInTok" w:type="character">
     <w:name w:val="BuiltInTok"/>
     <w:basedOn w:val="VerbatimChar"/>
     <w:rPr>
-      <w:color w:val="008000"/>
+      <w:rFonts w:ascii="Consolas" w:hAnsi="Consolas"/>
+      <w:sz w:val="22"/>
     </w:rPr>
   </w:style>
-  <w:style w:type="character" w:customStyle="1" w:styleId="ExtensionTok">
+  <w:style w:customStyle="1" w:styleId="ExtensionTok" w:type="character">
     <w:name w:val="ExtensionTok"/>
     <w:basedOn w:val="VerbatimChar"/>
-    <w:rPr/>
+    <w:rPr>
+      <w:rFonts w:ascii="Consolas" w:hAnsi="Consolas"/>
+      <w:sz w:val="22"/>
+    </w:rPr>
   </w:style>
-  <w:style w:type="character" w:customStyle="1" w:styleId="PreprocessorTok">
+  <w:style w:customStyle="1" w:styleId="PreprocessorTok" w:type="character">
     <w:name w:val="PreprocessorTok"/>
     <w:basedOn w:val="VerbatimChar"/>
     <w:rPr>
-      <w:color w:val="bc7a00"/>
+      <w:rFonts w:ascii="Consolas" w:hAnsi="Consolas"/>
+      <w:color w:val="BC7A00"/>
+      <w:sz w:val="22"/>
     </w:rPr>
   </w:style>
-  <w:style w:type="character" w:customStyle="1" w:styleId="AttributeTok">
+  <w:style w:customStyle="1" w:styleId="AttributeTok" w:type="character">
     <w:name w:val="AttributeTok"/>
     <w:basedOn w:val="VerbatimChar"/>
     <w:rPr>
-      <w:color w:val="7d9029"/>
+      <w:rFonts w:ascii="Consolas" w:hAnsi="Consolas"/>
+      <w:color w:val="7D9029"/>
+      <w:sz w:val="22"/>
     </w:rPr>
   </w:style>
-  <w:style w:type="character" w:customStyle="1" w:styleId="RegionMarkerTok">
+  <w:style w:customStyle="1" w:styleId="RegionMarkerTok" w:type="character">
     <w:name w:val="RegionMarkerTok"/>
     <w:basedOn w:val="VerbatimChar"/>
-    <w:rPr/>
+    <w:rPr>
+      <w:rFonts w:ascii="Consolas" w:hAnsi="Consolas"/>
+      <w:sz w:val="22"/>
+    </w:rPr>
   </w:style>
-  <w:style w:type="character" w:customStyle="1" w:styleId="InformationTok">
+  <w:style w:customStyle="1" w:styleId="InformationTok" w:type="character">
     <w:name w:val="InformationTok"/>
     <w:basedOn w:val="VerbatimChar"/>
     <w:rPr>
+      <w:rFonts w:ascii="Consolas" w:hAnsi="Consolas"/>
       <w:b/>
       <w:i/>
-      <w:color w:val="60a0b0"/>
+      <w:color w:val="60A0B0"/>
+      <w:sz w:val="22"/>
     </w:rPr>
   </w:style>
-  <w:style w:type="character" w:customStyle="1" w:styleId="WarningTok">
+  <w:style w:customStyle="1" w:styleId="WarningTok" w:type="character">
     <w:name w:val="WarningTok"/>
     <w:basedOn w:val="VerbatimChar"/>
     <w:rPr>
+      <w:rFonts w:ascii="Consolas" w:hAnsi="Consolas"/>
       <w:b/>
       <w:i/>
-      <w:color w:val="60a0b0"/>
+      <w:color w:val="60A0B0"/>
+      <w:sz w:val="22"/>
     </w:rPr>
   </w:style>
-  <w:style w:type="character" w:customStyle="1" w:styleId="AlertTok">
+  <w:style w:customStyle="1" w:styleId="AlertTok" w:type="character">
     <w:name w:val="AlertTok"/>
     <w:basedOn w:val="VerbatimChar"/>
     <w:rPr>
+      <w:rFonts w:ascii="Consolas" w:hAnsi="Consolas"/>
       <w:b/>
-      <w:color w:val="ff0000"/>
+      <w:color w:val="FF0000"/>
+      <w:sz w:val="22"/>
     </w:rPr>
   </w:style>
-  <w:style w:type="character" w:customStyle="1" w:styleId="ErrorTok">
+  <w:style w:customStyle="1" w:styleId="ErrorTok" w:type="character">
     <w:name w:val="ErrorTok"/>
     <w:basedOn w:val="VerbatimChar"/>
     <w:rPr>
+      <w:rFonts w:ascii="Consolas" w:hAnsi="Consolas"/>
       <w:b/>
-      <w:color w:val="ff0000"/>
+      <w:color w:val="FF0000"/>
+      <w:sz w:val="22"/>
     </w:rPr>
   </w:style>
-  <w:style w:type="character" w:customStyle="1" w:styleId="NormalTok">
+  <w:style w:customStyle="1" w:styleId="NormalTok" w:type="character">
     <w:name w:val="NormalTok"/>
     <w:basedOn w:val="VerbatimChar"/>
-    <w:rPr/>
+    <w:rPr>
+      <w:rFonts w:ascii="Consolas" w:hAnsi="Consolas"/>
+      <w:sz w:val="22"/>
+    </w:rPr>
+  </w:style>
+  <w:style w:styleId="TOC1" w:type="paragraph">
+    <w:name w:val="toc 1"/>
+    <w:basedOn w:val="Normal"/>
+    <w:next w:val="Normal"/>
+    <w:autoRedefine/>
+    <w:uiPriority w:val="39"/>
+    <w:rsid w:val="005704A3"/>
+    <w:pPr>
+      <w:spacing w:after="100"/>
+    </w:pPr>
+  </w:style>
+  <w:style w:styleId="TOC2" w:type="paragraph">
+    <w:name w:val="toc 2"/>
+    <w:basedOn w:val="Normal"/>
+    <w:next w:val="Normal"/>
+    <w:autoRedefine/>
+    <w:uiPriority w:val="39"/>
+    <w:rsid w:val="005704A3"/>
+    <w:pPr>
+      <w:spacing w:after="100"/>
+      <w:ind w:left="220"/>
+    </w:pPr>
   </w:style>
 </w:styles>
 </file>
@@ -18732,44 +19619,44 @@
         <a:sysClr val="window" lastClr="FFFFFF"/>
       </a:lt1>
       <a:dk2>
-        <a:srgbClr val="0E2841"/>
+        <a:srgbClr val="1F497D"/>
       </a:dk2>
       <a:lt2>
-        <a:srgbClr val="E8E8E8"/>
+        <a:srgbClr val="EEECE1"/>
       </a:lt2>
       <a:accent1>
-        <a:srgbClr val="156082"/>
+        <a:srgbClr val="4F81BD"/>
       </a:accent1>
       <a:accent2>
-        <a:srgbClr val="E97132"/>
+        <a:srgbClr val="C0504D"/>
       </a:accent2>
       <a:accent3>
-        <a:srgbClr val="196B24"/>
+        <a:srgbClr val="9BBB59"/>
       </a:accent3>
       <a:accent4>
-        <a:srgbClr val="0F9ED5"/>
+        <a:srgbClr val="8064A2"/>
       </a:accent4>
       <a:accent5>
-        <a:srgbClr val="A02B93"/>
+        <a:srgbClr val="4BACC6"/>
       </a:accent5>
       <a:accent6>
-        <a:srgbClr val="4EA72E"/>
+        <a:srgbClr val="F79646"/>
       </a:accent6>
       <a:hlink>
-        <a:srgbClr val="467886"/>
+        <a:srgbClr val="0000FF"/>
       </a:hlink>
       <a:folHlink>
-        <a:srgbClr val="96607D"/>
+        <a:srgbClr val="800080"/>
       </a:folHlink>
     </a:clrScheme>
     <a:fontScheme name="Office">
       <a:majorFont>
-        <a:latin typeface="Aptos Display" panose="02110004020202020204"/>
+        <a:latin typeface="Montserrat"/>
         <a:ea typeface=""/>
         <a:cs typeface=""/>
-        <a:font script="Jpan" typeface="游ゴシック Light"/>
+        <a:font script="Jpan" typeface="ＭＳ ゴシック"/>
         <a:font script="Hang" typeface="맑은 고딕"/>
-        <a:font script="Hans" typeface="等线 Light"/>
+        <a:font script="Hans" typeface="宋体"/>
         <a:font script="Hant" typeface="新細明體"/>
         <a:font script="Arab" typeface="Times New Roman"/>
         <a:font script="Hebr" typeface="Times New Roman"/>
@@ -18796,32 +19683,14 @@
         <a:font script="Mong" typeface="Mongolian Baiti"/>
         <a:font script="Viet" typeface="Times New Roman"/>
         <a:font script="Uigh" typeface="Microsoft Uighur"/>
-        <a:font script="Geor" typeface="Sylfaen"/>
-        <a:font script="Armn" typeface="Arial"/>
-        <a:font script="Bugi" typeface="Leelawadee UI"/>
-        <a:font script="Bopo" typeface="Microsoft JhengHei"/>
-        <a:font script="Java" typeface="Javanese Text"/>
-        <a:font script="Lisu" typeface="Segoe UI"/>
-        <a:font script="Mymr" typeface="Myanmar Text"/>
-        <a:font script="Nkoo" typeface="Ebrima"/>
-        <a:font script="Olck" typeface="Nirmala UI"/>
-        <a:font script="Osma" typeface="Ebrima"/>
-        <a:font script="Phag" typeface="Phagspa"/>
-        <a:font script="Syrn" typeface="Estrangelo Edessa"/>
-        <a:font script="Syrj" typeface="Estrangelo Edessa"/>
-        <a:font script="Syre" typeface="Estrangelo Edessa"/>
-        <a:font script="Sora" typeface="Nirmala UI"/>
-        <a:font script="Tale" typeface="Microsoft Tai Le"/>
-        <a:font script="Talu" typeface="Microsoft New Tai Lue"/>
-        <a:font script="Tfng" typeface="Ebrima"/>
       </a:majorFont>
       <a:minorFont>
-        <a:latin typeface="Aptos" panose="02110004020202020204"/>
+        <a:latin typeface="Montserrat"/>
         <a:ea typeface=""/>
         <a:cs typeface=""/>
-        <a:font script="Jpan" typeface="游明朝"/>
+        <a:font script="Jpan" typeface="ＭＳ 明朝"/>
         <a:font script="Hang" typeface="맑은 고딕"/>
-        <a:font script="Hans" typeface="等线"/>
+        <a:font script="Hans" typeface="宋体"/>
         <a:font script="Hant" typeface="新細明體"/>
         <a:font script="Arab" typeface="Arial"/>
         <a:font script="Hebr" typeface="Arial"/>
@@ -18848,24 +19717,6 @@
         <a:font script="Mong" typeface="Mongolian Baiti"/>
         <a:font script="Viet" typeface="Arial"/>
         <a:font script="Uigh" typeface="Microsoft Uighur"/>
-        <a:font script="Geor" typeface="Sylfaen"/>
-        <a:font script="Armn" typeface="Arial"/>
-        <a:font script="Bugi" typeface="Leelawadee UI"/>
-        <a:font script="Bopo" typeface="Microsoft JhengHei"/>
-        <a:font script="Java" typeface="Javanese Text"/>
-        <a:font script="Lisu" typeface="Segoe UI"/>
-        <a:font script="Mymr" typeface="Myanmar Text"/>
-        <a:font script="Nkoo" typeface="Ebrima"/>
-        <a:font script="Olck" typeface="Nirmala UI"/>
-        <a:font script="Osma" typeface="Ebrima"/>
-        <a:font script="Phag" typeface="Phagspa"/>
-        <a:font script="Syrn" typeface="Estrangelo Edessa"/>
-        <a:font script="Syrj" typeface="Estrangelo Edessa"/>
-        <a:font script="Syre" typeface="Estrangelo Edessa"/>
-        <a:font script="Sora" typeface="Nirmala UI"/>
-        <a:font script="Tale" typeface="Microsoft Tai Le"/>
-        <a:font script="Talu" typeface="Microsoft New Tai Lue"/>
-        <a:font script="Tfng" typeface="Ebrima"/>
       </a:minorFont>
     </a:fontScheme>
     <a:fmtScheme name="Office">
@@ -18877,141 +19728,200 @@
           <a:gsLst>
             <a:gs pos="0">
               <a:schemeClr val="phClr">
-                <a:lumMod val="110000"/>
-                <a:satMod val="105000"/>
-                <a:tint val="67000"/>
+                <a:tint val="50000"/>
+                <a:satMod val="300000"/>
               </a:schemeClr>
             </a:gs>
-            <a:gs pos="50000">
+            <a:gs pos="35000">
               <a:schemeClr val="phClr">
-                <a:lumMod val="105000"/>
-                <a:satMod val="103000"/>
-                <a:tint val="73000"/>
+                <a:tint val="37000"/>
+                <a:satMod val="300000"/>
               </a:schemeClr>
             </a:gs>
             <a:gs pos="100000">
               <a:schemeClr val="phClr">
-                <a:lumMod val="105000"/>
-                <a:satMod val="109000"/>
-                <a:tint val="81000"/>
+                <a:tint val="15000"/>
+                <a:satMod val="350000"/>
               </a:schemeClr>
             </a:gs>
           </a:gsLst>
-          <a:lin ang="5400000" scaled="0"/>
+          <a:lin ang="16200000" scaled="1"/>
         </a:gradFill>
         <a:gradFill rotWithShape="1">
           <a:gsLst>
             <a:gs pos="0">
               <a:schemeClr val="phClr">
-                <a:satMod val="103000"/>
-                <a:lumMod val="102000"/>
-                <a:tint val="94000"/>
-              </a:schemeClr>
-            </a:gs>
-            <a:gs pos="50000">
-              <a:schemeClr val="phClr">
-                <a:satMod val="110000"/>
-                <a:lumMod val="100000"/>
+                <a:tint val="100000"/>
                 <a:shade val="100000"/>
+                <a:satMod val="130000"/>
               </a:schemeClr>
             </a:gs>
             <a:gs pos="100000">
               <a:schemeClr val="phClr">
-                <a:lumMod val="99000"/>
-                <a:satMod val="120000"/>
-                <a:shade val="78000"/>
+                <a:tint val="50000"/>
+                <a:shade val="100000"/>
+                <a:satMod val="350000"/>
               </a:schemeClr>
             </a:gs>
           </a:gsLst>
-          <a:lin ang="5400000" scaled="0"/>
+          <a:lin ang="16200000" scaled="0"/>
         </a:gradFill>
       </a:fillStyleLst>
       <a:lnStyleLst>
-        <a:ln w="6350" cap="flat" cmpd="sng" algn="ctr">
+        <a:ln w="9525" cap="flat" cmpd="sng" algn="ctr">
+          <a:solidFill>
+            <a:schemeClr val="phClr">
+              <a:shade val="95000"/>
+              <a:satMod val="105000"/>
+            </a:schemeClr>
+          </a:solidFill>
+          <a:prstDash val="solid"/>
+        </a:ln>
+        <a:ln w="25400" cap="flat" cmpd="sng" algn="ctr">
           <a:solidFill>
             <a:schemeClr val="phClr"/>
           </a:solidFill>
           <a:prstDash val="solid"/>
-          <a:miter lim="800000"/>
         </a:ln>
-        <a:ln w="12700" cap="flat" cmpd="sng" algn="ctr">
+        <a:ln w="38100" cap="flat" cmpd="sng" algn="ctr">
           <a:solidFill>
             <a:schemeClr val="phClr"/>
           </a:solidFill>
           <a:prstDash val="solid"/>
-          <a:miter lim="800000"/>
-        </a:ln>
-        <a:ln w="19050" cap="flat" cmpd="sng" algn="ctr">
-          <a:solidFill>
-            <a:schemeClr val="phClr"/>
-          </a:solidFill>
-          <a:prstDash val="solid"/>
-          <a:miter lim="800000"/>
         </a:ln>
       </a:lnStyleLst>
       <a:effectStyleLst>
         <a:effectStyle>
-          <a:effectLst/>
-        </a:effectStyle>
-        <a:effectStyle>
-          <a:effectLst/>
+          <a:effectLst>
+            <a:outerShdw blurRad="40000" dist="20000" dir="5400000" rotWithShape="0">
+              <a:srgbClr val="000000">
+                <a:alpha val="38000"/>
+              </a:srgbClr>
+            </a:outerShdw>
+          </a:effectLst>
         </a:effectStyle>
         <a:effectStyle>
           <a:effectLst>
-            <a:outerShdw blurRad="57150" dist="19050" dir="5400000" algn="ctr" rotWithShape="0">
+            <a:outerShdw blurRad="40000" dist="23000" dir="5400000" rotWithShape="0">
               <a:srgbClr val="000000">
-                <a:alpha val="63000"/>
+                <a:alpha val="35000"/>
               </a:srgbClr>
             </a:outerShdw>
           </a:effectLst>
+        </a:effectStyle>
+        <a:effectStyle>
+          <a:effectLst>
+            <a:outerShdw blurRad="40000" dist="23000" dir="5400000" rotWithShape="0">
+              <a:srgbClr val="000000">
+                <a:alpha val="35000"/>
+              </a:srgbClr>
+            </a:outerShdw>
+          </a:effectLst>
+          <a:scene3d>
+            <a:camera prst="orthographicFront">
+              <a:rot lat="0" lon="0" rev="0"/>
+            </a:camera>
+            <a:lightRig rig="threePt" dir="t">
+              <a:rot lat="0" lon="0" rev="1200000"/>
+            </a:lightRig>
+          </a:scene3d>
+          <a:sp3d>
+            <a:bevelT w="63500" h="25400"/>
+          </a:sp3d>
         </a:effectStyle>
       </a:effectStyleLst>
       <a:bgFillStyleLst>
         <a:solidFill>
           <a:schemeClr val="phClr"/>
         </a:solidFill>
-        <a:solidFill>
-          <a:schemeClr val="phClr">
-            <a:tint val="95000"/>
-            <a:satMod val="170000"/>
-          </a:schemeClr>
-        </a:solidFill>
         <a:gradFill rotWithShape="1">
           <a:gsLst>
             <a:gs pos="0">
               <a:schemeClr val="phClr">
-                <a:tint val="93000"/>
-                <a:satMod val="150000"/>
-                <a:shade val="98000"/>
-                <a:lumMod val="102000"/>
+                <a:tint val="40000"/>
+                <a:satMod val="350000"/>
               </a:schemeClr>
             </a:gs>
-            <a:gs pos="50000">
+            <a:gs pos="40000">
               <a:schemeClr val="phClr">
-                <a:tint val="98000"/>
-                <a:satMod val="130000"/>
-                <a:shade val="90000"/>
-                <a:lumMod val="103000"/>
+                <a:tint val="45000"/>
+                <a:shade val="99000"/>
+                <a:satMod val="350000"/>
               </a:schemeClr>
             </a:gs>
             <a:gs pos="100000">
               <a:schemeClr val="phClr">
-                <a:shade val="63000"/>
-                <a:satMod val="120000"/>
+                <a:shade val="20000"/>
+                <a:satMod val="255000"/>
               </a:schemeClr>
             </a:gs>
           </a:gsLst>
-          <a:lin ang="5400000" scaled="0"/>
+          <a:path path="circle">
+            <a:fillToRect l="50000" t="-80000" r="50000" b="180000"/>
+          </a:path>
+        </a:gradFill>
+        <a:gradFill rotWithShape="1">
+          <a:gsLst>
+            <a:gs pos="0">
+              <a:schemeClr val="phClr">
+                <a:tint val="80000"/>
+                <a:satMod val="300000"/>
+              </a:schemeClr>
+            </a:gs>
+            <a:gs pos="100000">
+              <a:schemeClr val="phClr">
+                <a:shade val="30000"/>
+                <a:satMod val="200000"/>
+              </a:schemeClr>
+            </a:gs>
+          </a:gsLst>
+          <a:path path="circle">
+            <a:fillToRect l="50000" t="50000" r="50000" b="50000"/>
+          </a:path>
         </a:gradFill>
       </a:bgFillStyleLst>
     </a:fmtScheme>
   </a:themeElements>
-  <a:objectDefaults/>
+  <a:objectDefaults>
+    <a:spDef>
+      <a:spPr/>
+      <a:bodyPr/>
+      <a:lstStyle/>
+      <a:style>
+        <a:lnRef idx="1">
+          <a:schemeClr val="accent1"/>
+        </a:lnRef>
+        <a:fillRef idx="3">
+          <a:schemeClr val="accent1"/>
+        </a:fillRef>
+        <a:effectRef idx="2">
+          <a:schemeClr val="accent1"/>
+        </a:effectRef>
+        <a:fontRef idx="minor">
+          <a:schemeClr val="lt1"/>
+        </a:fontRef>
+      </a:style>
+    </a:spDef>
+    <a:lnDef>
+      <a:spPr/>
+      <a:bodyPr/>
+      <a:lstStyle/>
+      <a:style>
+        <a:lnRef idx="2">
+          <a:schemeClr val="accent1"/>
+        </a:lnRef>
+        <a:fillRef idx="0">
+          <a:schemeClr val="accent1"/>
+        </a:fillRef>
+        <a:effectRef idx="1">
+          <a:schemeClr val="accent1"/>
+        </a:effectRef>
+        <a:fontRef idx="minor">
+          <a:schemeClr val="tx1"/>
+        </a:fontRef>
+      </a:style>
+    </a:lnDef>
+  </a:objectDefaults>
   <a:extraClrSchemeLst/>
-  <a:extLst>
-    <a:ext uri="{05A4C25C-085E-4340-85A3-A5531E510DB2}">
-      <thm15:themeFamily xmlns:thm15="http://schemas.microsoft.com/office/thememl/2012/main" name="Office Theme" id="{2E142A2C-CD16-42D6-873A-C26D2A0506FA}" vid="{1BDDFF52-6CD6-40A5-AB3C-68EB2F1E4D0A}"/>
-    </a:ext>
-  </a:extLst>
 </a:theme>
 </file>
</xml_diff>